<commit_message>
Inclui números dos acórdãos do TCU na minuta de denúncia
Co-Authored-By: Claude Opus 5.5 <noreply@anthropic.com>
Claude-Session: https://claude.ai/code/session_014FdFMaMFv1EZmCvKyRdzXt
</commit_message>
<xml_diff>
--- a/denuncia-crime-responsabilidade-minuta.docx
+++ b/denuncia-crime-responsabilidade-minuta.docx
@@ -224,6 +224,46 @@
               <w:t xml:space="preserve">a garantia da União ao empréstimo de R$ 12 bilhões aos Correios (TCU, Acórdão 1.359/2026) ficou de fora. O próprio relator registrou que a decisão não tem caráter punitivo e não há ato pessoal do Presidente identificado.</w:t>
             </w:r>
           </w:p>
+          <w:p>
+            <w:pPr>
+              <w:pStyle w:val="ListParagraph"/>
+              <w:numPr>
+                <w:ilvl w:val="0"/>
+                <w:numId w:val="2"/>
+              </w:numPr>
+              <w:spacing w:after="80"/>
+            </w:pPr>
+            <w:r>
+              <w:rPr>
+                <w:b/>
+                <w:bCs/>
+              </w:rPr>
+              <w:t xml:space="preserve">Verificar antes de protocolar: </w:t>
+            </w:r>
+            <w:r>
+              <w:t xml:space="preserve">há registro de uma deliberação de 2026 no mesmo processo do Pé-de-Meia (Acórdão nº 2.261/2026-TCU-Plenário, Ata nº 19/2026, rel. Min. Augusto Nardes) cujo conteúdo não foi possível confirmar. Se for o julgamento de mérito, leia-o e ajuste os itens 7, 8 e 15. Se o TCU tiver considerado a situação regularizada, isso pesa contra o Fato 1.</w:t>
+            </w:r>
+          </w:p>
+          <w:p>
+            <w:pPr>
+              <w:pStyle w:val="ListParagraph"/>
+              <w:numPr>
+                <w:ilvl w:val="0"/>
+                <w:numId w:val="2"/>
+              </w:numPr>
+              <w:spacing w:after="80"/>
+            </w:pPr>
+            <w:r>
+              <w:rPr>
+                <w:b/>
+                <w:bCs/>
+              </w:rPr>
+              <w:t xml:space="preserve">Contas de 2023: </w:t>
+            </w:r>
+            <w:r>
+              <w:t xml:space="preserve">o processo é o TC 010.005/2024-2. O número do acórdão não foi confirmado: há indício de que seja o Acórdão nº 1.106/2024-TCU-Plenário. Confira antes de citar.</w:t>
+            </w:r>
+          </w:p>
         </w:tc>
       </w:tr>
     </w:tbl>
@@ -472,7 +512,7 @@
         <w:jc w:val="both"/>
       </w:pPr>
       <w:r>
-        <w:t xml:space="preserve">7. Em 22 de janeiro de 2025, o Plenário do Tribunal de Contas da União referendou, por unanimidade, medida cautelar do Ministro Augusto Nardes (Acórdão nº 61/2025-TCU-Plenário, TC 024.312/2024-0, Doc. 2). A medida suspendeu o uso de cerca de R$ 6 bilhões transferidos ao Fipem. O fundamento foi que os pagamentos aos estudantes estavam sendo feitos com recursos não previstos no Orçamento Geral da União. Segundo o relator, a lei permite que a União transfira recursos ao fundo, mas não permite que o pagamento dos incentivos aos estudantes se dê à margem do orçamento.</w:t>
+        <w:t xml:space="preserve">7. Em 20 de janeiro de 2025, o Ministro Augusto Nardes concedeu medida cautelar no processo TC 024.312/2024-0. Em 22 de janeiro de 2025, o Plenário do Tribunal de Contas da União a referendou por unanimidade (Acórdão nº 61/2025-TCU-Plenário, Doc. 2). A medida suspendeu o uso, no Programa, de cerca de R$ 6 bilhões oriundos do FGO e do Fgeduc que capitalizaram o Fipem sem trânsito pelo Orçamento Geral da União. Segundo o relator, a lei permite que a União transfira recursos ao fundo, mas não permite que o pagamento dos incentivos aos estudantes se dê à margem do orçamento. Ficaram excepcionalmente preservados, em 2024 e 2025, os R$ 6,1 bilhões provenientes do Fundo Social.</w:t>
       </w:r>
     </w:p>
     <w:p>
@@ -482,7 +522,7 @@
         <w:jc w:val="both"/>
       </w:pPr>
       <w:r>
-        <w:t xml:space="preserve">8. Em 12 de fevereiro de 2025, o TCU revogou a cautelar e fixou prazo de 120 dias para que o Poder Executivo adequasse o programa ao regime orçamentário constitucional, por crédito suplementar com cancelamento de despesas equivalentes ou por outro expediente legal (Doc. 3). O Executivo enviou então ao Congresso o PLN nº 5/2025, que propõe crédito suplementar de R$ 686 milhões ao Ministério da Educação para o programa (Doc. 8). Segundo a imprensa, o programa movimenta cerca de R$ 12 bilhões, dos quais cerca de R$ 1 bilhão estava na Lei Orçamentária de 2025.</w:t>
+        <w:t xml:space="preserve">8. Em 12 de fevereiro de 2025, o Plenário deu provimento parcial ao agravo da Advocacia-Geral da União e revogou a cautelar (Acórdão nº 297/2025-TCU-Plenário, Doc. 3). Fundamentou-se no perigo da demora reverso e nos impactos sociais da interrupção do programa, e reservou para momento posterior a análise de mérito. O Tribunal autorizou, de forma provisória e excepcional, a continuidade dos pagamentos com recursos do Fipem e fixou prazo de 120 dias para que o Poder Executivo adequasse o financiamento às normas orçamentárias e de responsabilidade fiscal. Segundo o relatório desse acórdão, o custo anual estimado do programa é de R$ 12,5 bilhões, enquanto o Projeto de Lei Orçamentária de 2025 previa apenas R$ 1 bilhão. O Executivo enviou ao Congresso o PLN nº 5/2025, que propõe crédito suplementar de R$ 686 milhões ao Ministério da Educação para o programa (Doc. 8).</w:t>
       </w:r>
     </w:p>
     <w:p>
@@ -500,7 +540,7 @@
         <w:jc w:val="both"/>
       </w:pPr>
       <w:r>
-        <w:t xml:space="preserve">9. No parecer prévio sobre as Contas do Presidente da República do exercício de 2024, aprovado em 11 de junho de 2025 (relator: Ministro Jhonatan de Jesus, Doc. 6 e 7), o TCU apontou como </w:t>
+        <w:t xml:space="preserve">9. No parecer prévio sobre as Contas do Presidente da República do exercício de 2024, aprovado em 11 de junho de 2025 (Acórdão nº 1.326/2025-TCU-Plenário, TC 008.437/2025-4, relator: Ministro Jhonatan de Jesus, Doc. 6 e 7), o TCU apontou como </w:t>
       </w:r>
       <w:r>
         <w:rPr>
@@ -638,7 +678,7 @@
         <w:jc w:val="both"/>
       </w:pPr>
       <w:r>
-        <w:t xml:space="preserve">O TCU recomendou, por unanimidade, a aprovação com ressalvas das Contas do Presidente da República dos exercícios de 2023, 2024 e 2025 (este último pelo Acórdão nº 1.442/2026-TCU-Plenário, TC 005.405/2026-2), sem recomendar a rejeição de nenhuma delas (Doc. 9).</w:t>
+        <w:t xml:space="preserve">O TCU recomendou, por unanimidade, a aprovação com ressalvas das Contas do Presidente da República dos exercícios de 2023 (TC 010.005/2024-2), 2024 (Acórdão nº 1.326/2025-TCU-Plenário) e 2025 (Acórdão nº 1.442/2026-TCU-Plenário, TC 005.405/2026-2), sem recomendar a rejeição de nenhuma delas (Doc. 6 e 9).</w:t>
       </w:r>
     </w:p>
     <w:p>
@@ -652,7 +692,7 @@
         <w:jc w:val="both"/>
       </w:pPr>
       <w:r>
-        <w:t xml:space="preserve">No Fato 1, as transferências ao Fipem tiveram amparo em leis aprovadas pelo Congresso Nacional. A decisão do TCU foi cautelar, sem julgamento de mérito, e foi revogada em 12/02/2025. O Executivo apresentou proposta de regularização (PLN nº 5/2025), e a Advocacia-Geral da União sustenta a legalidade das transferências.</w:t>
+        <w:t xml:space="preserve">No Fato 1, as transferências ao Fipem tiveram amparo em leis aprovadas pelo Congresso Nacional. A decisão do TCU foi cautelar, sem julgamento de mérito, e foi revogada pelo Acórdão nº 297/2025-TCU-Plenário. O Executivo apresentou proposta de regularização (PLN nº 5/2025), e a Advocacia-Geral da União sustenta a legalidade das transferências e o cumprimento da determinação de iniciar o processo legislativo.</w:t>
       </w:r>
     </w:p>
     <w:p>
@@ -712,7 +752,7 @@
         <w:jc w:val="both"/>
       </w:pPr>
       <w:r>
-        <w:t xml:space="preserve">a requisição ao Tribunal de Contas da União de cópia integral do processo TC 024.312/2024-0 (Pé-de-Meia), inclusive da decisão de 12/02/2025 e do acompanhamento do cumprimento do prazo de 120 dias, e do processo de apreciação das Contas do Presidente da República do exercício de 2024, em especial o capítulo sobre renúncias de receita;</w:t>
+        <w:t xml:space="preserve">a requisição ao Tribunal de Contas da União de cópia integral do processo TC 024.312/2024-0 (Pé-de-Meia), inclusive dos Acórdãos nº 61/2025 e nº 297/2025-TCU-Plenário, de eventual decisão de mérito e do acompanhamento do cumprimento do prazo de 120 dias, e do processo TC 008.437/2025-4 (Contas do Presidente da República, exercício de 2024), em especial o capítulo sobre renúncias de receita;</w:t>
       </w:r>
     </w:p>
     <w:p>
@@ -882,7 +922,7 @@
         <w:jc w:val="both"/>
       </w:pPr>
       <w:r>
-        <w:t xml:space="preserve">Doc. 2: Acórdão nº 61/2025-TCU-Plenário (TC 024.312/2024-0), referendo de medida cautelar, Pé-de-Meia.</w:t>
+        <w:t xml:space="preserve">Doc. 2: Acórdão nº 61/2025-TCU-Plenário (TC 024.312/2024-0), de 22/01/2025, referendo de medida cautelar, Pé-de-Meia.</w:t>
       </w:r>
     </w:p>
     <w:p>
@@ -896,109 +936,100 @@
         <w:jc w:val="both"/>
       </w:pPr>
       <w:r>
-        <w:t xml:space="preserve">Doc. 3: decisão do TCU de 12/02/2025 que revogou a cautelar e fixou prazo de 120 dias (</w:t>
+        <w:t xml:space="preserve">Doc. 3: Acórdão nº 297/2025-TCU-Plenário (TC 024.312/2024-0), de 12/02/2025, que revogou a cautelar e fixou prazo de 120 dias.</w:t>
+      </w:r>
+    </w:p>
+    <w:p>
+      <w:pPr>
+        <w:pStyle w:val="ListParagraph"/>
+        <w:numPr>
+          <w:ilvl w:val="0"/>
+          <w:numId w:val="4"/>
+        </w:numPr>
+        <w:spacing w:after="100" w:line="340"/>
+        <w:jc w:val="both"/>
+      </w:pPr>
+      <w:r>
+        <w:t xml:space="preserve">Doc. 4: Lei nº 14.818, de 16 de janeiro de 2024 (DOU).</w:t>
+      </w:r>
+    </w:p>
+    <w:p>
+      <w:pPr>
+        <w:pStyle w:val="ListParagraph"/>
+        <w:numPr>
+          <w:ilvl w:val="0"/>
+          <w:numId w:val="4"/>
+        </w:numPr>
+        <w:spacing w:after="100" w:line="340"/>
+        <w:jc w:val="both"/>
+      </w:pPr>
+      <w:r>
+        <w:t xml:space="preserve">Doc. 5: Leis nº 14.995/2024 e nº 15.076/2024 (DOU).</w:t>
+      </w:r>
+    </w:p>
+    <w:p>
+      <w:pPr>
+        <w:pStyle w:val="ListParagraph"/>
+        <w:numPr>
+          <w:ilvl w:val="0"/>
+          <w:numId w:val="4"/>
+        </w:numPr>
+        <w:spacing w:after="100" w:line="340"/>
+        <w:jc w:val="both"/>
+      </w:pPr>
+      <w:r>
+        <w:t xml:space="preserve">Doc. 6: Acórdão nº 1.326/2025-TCU-Plenário (TC 008.437/2025-4), relatório e parecer prévio sobre as Contas do Presidente da República, exercício de 2024.</w:t>
+      </w:r>
+    </w:p>
+    <w:p>
+      <w:pPr>
+        <w:pStyle w:val="ListParagraph"/>
+        <w:numPr>
+          <w:ilvl w:val="0"/>
+          <w:numId w:val="4"/>
+        </w:numPr>
+        <w:spacing w:after="100" w:line="340"/>
+        <w:jc w:val="both"/>
+      </w:pPr>
+      <w:r>
+        <w:t xml:space="preserve">Doc. 7: notícia oficial do TCU, "TCU aprova com ressalvas as contas do presidente da República de 2024".</w:t>
+      </w:r>
+    </w:p>
+    <w:p>
+      <w:pPr>
+        <w:pStyle w:val="ListParagraph"/>
+        <w:numPr>
+          <w:ilvl w:val="0"/>
+          <w:numId w:val="4"/>
+        </w:numPr>
+        <w:spacing w:after="100" w:line="340"/>
+        <w:jc w:val="both"/>
+      </w:pPr>
+      <w:r>
+        <w:t xml:space="preserve">Doc. 8: PLN nº 5/2025 (Congresso Nacional).</w:t>
+      </w:r>
+    </w:p>
+    <w:p>
+      <w:pPr>
+        <w:pStyle w:val="ListParagraph"/>
+        <w:numPr>
+          <w:ilvl w:val="0"/>
+          <w:numId w:val="4"/>
+        </w:numPr>
+        <w:spacing w:after="100" w:line="340"/>
+        <w:jc w:val="both"/>
+      </w:pPr>
+      <w:r>
+        <w:t xml:space="preserve">Doc. 9: pareceres prévios sobre as contas de 2023 (TC 010.005/2024-2, </w:t>
       </w:r>
       <w:r>
         <w:rPr>
           <w:shd w:fill="FFF2A8" w:color="auto" w:val="clear"/>
         </w:rPr>
-        <w:t xml:space="preserve">nº do acórdão a obter</w:t>
-      </w:r>
-      <w:r>
-        <w:t xml:space="preserve">).</w:t>
-      </w:r>
-    </w:p>
-    <w:p>
-      <w:pPr>
-        <w:pStyle w:val="ListParagraph"/>
-        <w:numPr>
-          <w:ilvl w:val="0"/>
-          <w:numId w:val="4"/>
-        </w:numPr>
-        <w:spacing w:after="100" w:line="340"/>
-        <w:jc w:val="both"/>
-      </w:pPr>
-      <w:r>
-        <w:t xml:space="preserve">Doc. 4: Lei nº 14.818, de 16 de janeiro de 2024 (DOU).</w:t>
-      </w:r>
-    </w:p>
-    <w:p>
-      <w:pPr>
-        <w:pStyle w:val="ListParagraph"/>
-        <w:numPr>
-          <w:ilvl w:val="0"/>
-          <w:numId w:val="4"/>
-        </w:numPr>
-        <w:spacing w:after="100" w:line="340"/>
-        <w:jc w:val="both"/>
-      </w:pPr>
-      <w:r>
-        <w:t xml:space="preserve">Doc. 5: Leis nº 14.995/2024 e nº 15.076/2024 (DOU).</w:t>
-      </w:r>
-    </w:p>
-    <w:p>
-      <w:pPr>
-        <w:pStyle w:val="ListParagraph"/>
-        <w:numPr>
-          <w:ilvl w:val="0"/>
-          <w:numId w:val="4"/>
-        </w:numPr>
-        <w:spacing w:after="100" w:line="340"/>
-        <w:jc w:val="both"/>
-      </w:pPr>
-      <w:r>
-        <w:t xml:space="preserve">Doc. 6: relatório e parecer prévio sobre as Contas do Presidente da República, exercício de 2024 (</w:t>
-      </w:r>
-      <w:r>
-        <w:rPr>
-          <w:shd w:fill="FFF2A8" w:color="auto" w:val="clear"/>
-        </w:rPr>
-        <w:t xml:space="preserve">nº do acórdão a obter</w:t>
-      </w:r>
-      <w:r>
-        <w:t xml:space="preserve">).</w:t>
-      </w:r>
-    </w:p>
-    <w:p>
-      <w:pPr>
-        <w:pStyle w:val="ListParagraph"/>
-        <w:numPr>
-          <w:ilvl w:val="0"/>
-          <w:numId w:val="4"/>
-        </w:numPr>
-        <w:spacing w:after="100" w:line="340"/>
-        <w:jc w:val="both"/>
-      </w:pPr>
-      <w:r>
-        <w:t xml:space="preserve">Doc. 7: notícia oficial do TCU, "TCU aprova com ressalvas as contas do presidente da República de 2024".</w:t>
-      </w:r>
-    </w:p>
-    <w:p>
-      <w:pPr>
-        <w:pStyle w:val="ListParagraph"/>
-        <w:numPr>
-          <w:ilvl w:val="0"/>
-          <w:numId w:val="4"/>
-        </w:numPr>
-        <w:spacing w:after="100" w:line="340"/>
-        <w:jc w:val="both"/>
-      </w:pPr>
-      <w:r>
-        <w:t xml:space="preserve">Doc. 8: PLN nº 5/2025 (Congresso Nacional).</w:t>
-      </w:r>
-    </w:p>
-    <w:p>
-      <w:pPr>
-        <w:pStyle w:val="ListParagraph"/>
-        <w:numPr>
-          <w:ilvl w:val="0"/>
-          <w:numId w:val="4"/>
-        </w:numPr>
-        <w:spacing w:after="100" w:line="340"/>
-        <w:jc w:val="both"/>
-      </w:pPr>
-      <w:r>
-        <w:t xml:space="preserve">Doc. 9: pareceres prévios sobre as contas de 2023 e de 2025 (Acórdão nº 1.442/2026-TCU-Plenário).</w:t>
+        <w:t xml:space="preserve">acórdão a confirmar</w:t>
+      </w:r>
+      <w:r>
+        <w:t xml:space="preserve">) e de 2025 (Acórdão nº 1.442/2026-TCU-Plenário, TC 005.405/2026-2).</w:t>
       </w:r>
     </w:p>
     <w:p>
@@ -1703,7 +1734,7 @@
                 <w:sz w:val="18"/>
                 <w:szCs w:val="18"/>
               </w:rPr>
-              <w:t xml:space="preserve">Acórdão 61/2025-Plenário</w:t>
+              <w:t xml:space="preserve">Acórdão 61/2025-Plenário (22/01/2025)</w:t>
             </w:r>
           </w:p>
           <w:p>
@@ -1750,7 +1781,7 @@
                 <w:sz w:val="18"/>
                 <w:szCs w:val="18"/>
               </w:rPr>
-              <w:t xml:space="preserve">Documento do TCU localizado</w:t>
+              <w:t xml:space="preserve">Texto do TCU localizado; número confirmado</w:t>
             </w:r>
           </w:p>
         </w:tc>
@@ -1782,7 +1813,7 @@
                 <w:sz w:val="18"/>
                 <w:szCs w:val="18"/>
               </w:rPr>
-              <w:t xml:space="preserve">Decisão cautelar, sem mérito</w:t>
+              <w:t xml:space="preserve">Decisão cautelar, sem mérito; Fundo Social preservado</w:t>
             </w:r>
           </w:p>
         </w:tc>
@@ -1820,7 +1851,7 @@
                 <w:sz w:val="18"/>
                 <w:szCs w:val="18"/>
               </w:rPr>
-              <w:t xml:space="preserve">TCU revogou a cautelar em 12/02/2025 e deu 120 dias para adequação</w:t>
+              <w:t xml:space="preserve">TCU revogou a cautelar e deu 120 dias para adequação</w:t>
             </w:r>
           </w:p>
         </w:tc>
@@ -1853,7 +1884,7 @@
                 <w:sz w:val="18"/>
                 <w:szCs w:val="18"/>
               </w:rPr>
-              <w:t xml:space="preserve">Notícia oficial do TCU</w:t>
+              <w:t xml:space="preserve">Acórdão 297/2025-Plenário (12/02/2025)</w:t>
             </w:r>
           </w:p>
         </w:tc>
@@ -1886,7 +1917,7 @@
                 <w:sz w:val="18"/>
                 <w:szCs w:val="18"/>
               </w:rPr>
-              <w:t xml:space="preserve">Notícia oficial e imprensa</w:t>
+              <w:t xml:space="preserve">Notícia oficial do TCU e ofício do TCU à Câmara (Aviso 902/2025)</w:t>
             </w:r>
           </w:p>
         </w:tc>
@@ -1919,7 +1950,7 @@
                 <w:sz w:val="18"/>
                 <w:szCs w:val="18"/>
               </w:rPr>
-              <w:t xml:space="preserve">Indica regularização em curso</w:t>
+              <w:t xml:space="preserve">Agravo da AGU parcialmente provido; mérito reservado</w:t>
             </w:r>
           </w:p>
         </w:tc>
@@ -1956,7 +1987,7 @@
                 <w:sz w:val="18"/>
                 <w:szCs w:val="18"/>
               </w:rPr>
-              <w:t xml:space="preserve">Executivo propôs crédito de R$ 686 mi (PLN 5/2025)</w:t>
+              <w:t xml:space="preserve">Possível decisão posterior no mesmo processo</w:t>
             </w:r>
           </w:p>
         </w:tc>
@@ -1988,7 +2019,7 @@
                 <w:sz w:val="18"/>
                 <w:szCs w:val="18"/>
               </w:rPr>
-              <w:t xml:space="preserve">Agência Câmara</w:t>
+              <w:t xml:space="preserve">Acórdão 2.261/2026-Plenário (Ata 19/2026)</w:t>
             </w:r>
           </w:p>
         </w:tc>
@@ -2020,7 +2051,7 @@
                 <w:sz w:val="18"/>
                 <w:szCs w:val="18"/>
               </w:rPr>
-              <w:t xml:space="preserve">Fonte oficial (Câmara)</w:t>
+              <w:t xml:space="preserve">Não verificado: conferir conteúdo</w:t>
             </w:r>
           </w:p>
         </w:tc>
@@ -2052,7 +2083,7 @@
                 <w:sz w:val="18"/>
                 <w:szCs w:val="18"/>
               </w:rPr>
-              <w:t xml:space="preserve">Iniciativa de regularização</w:t>
+              <w:t xml:space="preserve">Pode alterar a avaliação do Fato 1</w:t>
             </w:r>
           </w:p>
         </w:tc>
@@ -2090,7 +2121,7 @@
                 <w:sz w:val="18"/>
                 <w:szCs w:val="18"/>
               </w:rPr>
-              <w:t xml:space="preserve">2024: 23 desonerações por 19 atos; parte sem requisitos da LRF, LDO e CF</w:t>
+              <w:t xml:space="preserve">Executivo propôs crédito de R$ 686 mi (PLN 5/2025)</w:t>
             </w:r>
           </w:p>
         </w:tc>
@@ -2123,7 +2154,7 @@
                 <w:sz w:val="18"/>
                 <w:szCs w:val="18"/>
               </w:rPr>
-              <w:t xml:space="preserve">Parecer prévio, Contas 2024</w:t>
+              <w:t xml:space="preserve">Agência Câmara</w:t>
             </w:r>
           </w:p>
         </w:tc>
@@ -2156,7 +2187,7 @@
                 <w:sz w:val="18"/>
                 <w:szCs w:val="18"/>
               </w:rPr>
-              <w:t xml:space="preserve">Notícia oficial e imprensa; conferir no relatório</w:t>
+              <w:t xml:space="preserve">Fonte oficial (Câmara)</w:t>
             </w:r>
           </w:p>
         </w:tc>
@@ -2189,7 +2220,7 @@
                 <w:sz w:val="18"/>
                 <w:szCs w:val="18"/>
               </w:rPr>
-              <w:t xml:space="preserve">Todas com medidas compensatórias; contas aprovadas</w:t>
+              <w:t xml:space="preserve">Iniciativa de regularização</w:t>
             </w:r>
           </w:p>
         </w:tc>
@@ -2226,6 +2257,155 @@
                 <w:sz w:val="18"/>
                 <w:szCs w:val="18"/>
               </w:rPr>
+              <w:t xml:space="preserve">2024: 23 desonerações por 19 atos; parte sem requisitos da LRF, LDO e CF</w:t>
+            </w:r>
+          </w:p>
+        </w:tc>
+        <w:tc>
+          <w:tcPr>
+            <w:tcW w:type="dxa" w:w="2000"/>
+            <w:tcBorders>
+              <w:top w:val="single" w:color="BFBFBF" w:sz="4"/>
+              <w:left w:val="single" w:color="BFBFBF" w:sz="4"/>
+              <w:bottom w:val="single" w:color="BFBFBF" w:sz="4"/>
+              <w:right w:val="single" w:color="BFBFBF" w:sz="4"/>
+            </w:tcBorders>
+            <w:tcMar>
+              <w:top w:type="dxa" w:w="60"/>
+              <w:left w:type="dxa" w:w="90"/>
+              <w:bottom w:type="dxa" w:w="60"/>
+              <w:right w:type="dxa" w:w="90"/>
+            </w:tcMar>
+          </w:tcPr>
+          <w:p>
+            <w:pPr>
+              <w:spacing w:after="40"/>
+            </w:pPr>
+            <w:r>
+              <w:rPr>
+                <w:rFonts w:ascii="Calibri" w:cs="Calibri" w:eastAsia="Calibri" w:hAnsi="Calibri"/>
+                <w:b w:val="false"/>
+                <w:bCs w:val="false"/>
+                <w:sz w:val="18"/>
+                <w:szCs w:val="18"/>
+              </w:rPr>
+              <w:t xml:space="preserve">Acórdão 1.326/2025-Plenário</w:t>
+            </w:r>
+          </w:p>
+          <w:p>
+            <w:pPr>
+              <w:spacing w:after="40"/>
+            </w:pPr>
+            <w:r>
+              <w:rPr>
+                <w:rFonts w:ascii="Calibri" w:cs="Calibri" w:eastAsia="Calibri" w:hAnsi="Calibri"/>
+                <w:b w:val="false"/>
+                <w:bCs w:val="false"/>
+                <w:sz w:val="18"/>
+                <w:szCs w:val="18"/>
+              </w:rPr>
+              <w:t xml:space="preserve">TC 008.437/2025-4</w:t>
+            </w:r>
+          </w:p>
+        </w:tc>
+        <w:tc>
+          <w:tcPr>
+            <w:tcW w:type="dxa" w:w="2026"/>
+            <w:tcBorders>
+              <w:top w:val="single" w:color="BFBFBF" w:sz="4"/>
+              <w:left w:val="single" w:color="BFBFBF" w:sz="4"/>
+              <w:bottom w:val="single" w:color="BFBFBF" w:sz="4"/>
+              <w:right w:val="single" w:color="BFBFBF" w:sz="4"/>
+            </w:tcBorders>
+            <w:tcMar>
+              <w:top w:type="dxa" w:w="60"/>
+              <w:left w:type="dxa" w:w="90"/>
+              <w:bottom w:type="dxa" w:w="60"/>
+              <w:right w:type="dxa" w:w="90"/>
+            </w:tcMar>
+          </w:tcPr>
+          <w:p>
+            <w:pPr>
+              <w:spacing w:after="40"/>
+            </w:pPr>
+            <w:r>
+              <w:rPr>
+                <w:rFonts w:ascii="Calibri" w:cs="Calibri" w:eastAsia="Calibri" w:hAnsi="Calibri"/>
+                <w:b w:val="false"/>
+                <w:bCs w:val="false"/>
+                <w:sz w:val="18"/>
+                <w:szCs w:val="18"/>
+              </w:rPr>
+              <w:t xml:space="preserve">Número confirmado (TCU); conferir capítulo de renúncias no relatório</w:t>
+            </w:r>
+          </w:p>
+        </w:tc>
+        <w:tc>
+          <w:tcPr>
+            <w:tcW w:type="dxa" w:w="2300"/>
+            <w:tcBorders>
+              <w:top w:val="single" w:color="BFBFBF" w:sz="4"/>
+              <w:left w:val="single" w:color="BFBFBF" w:sz="4"/>
+              <w:bottom w:val="single" w:color="BFBFBF" w:sz="4"/>
+              <w:right w:val="single" w:color="BFBFBF" w:sz="4"/>
+            </w:tcBorders>
+            <w:tcMar>
+              <w:top w:type="dxa" w:w="60"/>
+              <w:left w:type="dxa" w:w="90"/>
+              <w:bottom w:type="dxa" w:w="60"/>
+              <w:right w:type="dxa" w:w="90"/>
+            </w:tcMar>
+          </w:tcPr>
+          <w:p>
+            <w:pPr>
+              <w:spacing w:after="40"/>
+            </w:pPr>
+            <w:r>
+              <w:rPr>
+                <w:rFonts w:ascii="Calibri" w:cs="Calibri" w:eastAsia="Calibri" w:hAnsi="Calibri"/>
+                <w:b w:val="false"/>
+                <w:bCs w:val="false"/>
+                <w:sz w:val="18"/>
+                <w:szCs w:val="18"/>
+              </w:rPr>
+              <w:t xml:space="preserve">Todas com medidas compensatórias; contas aprovadas</w:t>
+            </w:r>
+          </w:p>
+        </w:tc>
+      </w:tr>
+      <w:tr>
+        <w:trPr>
+          <w:cantSplit/>
+        </w:trPr>
+        <w:tc>
+          <w:tcPr>
+            <w:tcW w:type="dxa" w:w="2700"/>
+            <w:tcBorders>
+              <w:top w:val="single" w:color="BFBFBF" w:sz="4"/>
+              <w:left w:val="single" w:color="BFBFBF" w:sz="4"/>
+              <w:bottom w:val="single" w:color="BFBFBF" w:sz="4"/>
+              <w:right w:val="single" w:color="BFBFBF" w:sz="4"/>
+            </w:tcBorders>
+            <w:shd w:fill="F2F5FA" w:color="auto" w:val="clear"/>
+            <w:tcMar>
+              <w:top w:type="dxa" w:w="60"/>
+              <w:left w:type="dxa" w:w="90"/>
+              <w:bottom w:type="dxa" w:w="60"/>
+              <w:right w:type="dxa" w:w="90"/>
+            </w:tcMar>
+          </w:tcPr>
+          <w:p>
+            <w:pPr>
+              <w:spacing w:after="40"/>
+            </w:pPr>
+            <w:r>
+              <w:rPr>
+                <w:rFonts w:ascii="Calibri" w:cs="Calibri" w:eastAsia="Calibri" w:hAnsi="Calibri"/>
+                <w:b w:val="false"/>
+                <w:bCs w:val="false"/>
+                <w:sz w:val="18"/>
+                <w:szCs w:val="18"/>
+              </w:rPr>
               <w:t xml:space="preserve">Contas de 2023, 2024 e 2025 aprovadas com ressalvas, por unanimidade</w:t>
             </w:r>
           </w:p>
@@ -2239,26 +2419,57 @@
               <w:bottom w:val="single" w:color="BFBFBF" w:sz="4"/>
               <w:right w:val="single" w:color="BFBFBF" w:sz="4"/>
             </w:tcBorders>
-            <w:tcMar>
-              <w:top w:type="dxa" w:w="60"/>
-              <w:left w:type="dxa" w:w="90"/>
-              <w:bottom w:type="dxa" w:w="60"/>
-              <w:right w:type="dxa" w:w="90"/>
-            </w:tcMar>
-          </w:tcPr>
-          <w:p>
-            <w:pPr>
-              <w:spacing w:after="40"/>
-            </w:pPr>
-            <w:r>
-              <w:rPr>
-                <w:rFonts w:ascii="Calibri" w:cs="Calibri" w:eastAsia="Calibri" w:hAnsi="Calibri"/>
-                <w:b w:val="false"/>
-                <w:bCs w:val="false"/>
-                <w:sz w:val="18"/>
-                <w:szCs w:val="18"/>
-              </w:rPr>
-              <w:t xml:space="preserve">TCU; Acórdão 1.442/2026 (2025)</w:t>
+            <w:shd w:fill="F2F5FA" w:color="auto" w:val="clear"/>
+            <w:tcMar>
+              <w:top w:type="dxa" w:w="60"/>
+              <w:left w:type="dxa" w:w="90"/>
+              <w:bottom w:type="dxa" w:w="60"/>
+              <w:right w:type="dxa" w:w="90"/>
+            </w:tcMar>
+          </w:tcPr>
+          <w:p>
+            <w:pPr>
+              <w:spacing w:after="40"/>
+            </w:pPr>
+            <w:r>
+              <w:rPr>
+                <w:rFonts w:ascii="Calibri" w:cs="Calibri" w:eastAsia="Calibri" w:hAnsi="Calibri"/>
+                <w:b w:val="false"/>
+                <w:bCs w:val="false"/>
+                <w:sz w:val="18"/>
+                <w:szCs w:val="18"/>
+              </w:rPr>
+              <w:t xml:space="preserve">2023: TC 010.005/2024-2 (acórdão a confirmar)</w:t>
+            </w:r>
+          </w:p>
+          <w:p>
+            <w:pPr>
+              <w:spacing w:after="40"/>
+            </w:pPr>
+            <w:r>
+              <w:rPr>
+                <w:rFonts w:ascii="Calibri" w:cs="Calibri" w:eastAsia="Calibri" w:hAnsi="Calibri"/>
+                <w:b w:val="false"/>
+                <w:bCs w:val="false"/>
+                <w:sz w:val="18"/>
+                <w:szCs w:val="18"/>
+              </w:rPr>
+              <w:t xml:space="preserve">2024: Acórdão 1.326/2025</w:t>
+            </w:r>
+          </w:p>
+          <w:p>
+            <w:pPr>
+              <w:spacing w:after="40"/>
+            </w:pPr>
+            <w:r>
+              <w:rPr>
+                <w:rFonts w:ascii="Calibri" w:cs="Calibri" w:eastAsia="Calibri" w:hAnsi="Calibri"/>
+                <w:b w:val="false"/>
+                <w:bCs w:val="false"/>
+                <w:sz w:val="18"/>
+                <w:szCs w:val="18"/>
+              </w:rPr>
+              <w:t xml:space="preserve">2025: Acórdão 1.442/2026</w:t>
             </w:r>
           </w:p>
         </w:tc>
@@ -2271,6 +2482,7 @@
               <w:bottom w:val="single" w:color="BFBFBF" w:sz="4"/>
               <w:right w:val="single" w:color="BFBFBF" w:sz="4"/>
             </w:tcBorders>
+            <w:shd w:fill="F2F5FA" w:color="auto" w:val="clear"/>
             <w:tcMar>
               <w:top w:type="dxa" w:w="60"/>
               <w:left w:type="dxa" w:w="90"/>
@@ -2303,6 +2515,7 @@
               <w:bottom w:val="single" w:color="BFBFBF" w:sz="4"/>
               <w:right w:val="single" w:color="BFBFBF" w:sz="4"/>
             </w:tcBorders>
+            <w:shd w:fill="F2F5FA" w:color="auto" w:val="clear"/>
             <w:tcMar>
               <w:top w:type="dxa" w:w="60"/>
               <w:left w:type="dxa" w:w="90"/>
@@ -2357,7 +2570,7 @@
         </w:rPr>
         <w:t xml:space="preserve">TCU – Pé-de-Meia (notícia oficial): </w:t>
       </w:r>
-      <w:hyperlink w:history="1" r:id="rIdzgiybft_t_hq16xx0pi4i">
+      <w:hyperlink w:history="1" r:id="rIdkgsxfs8dubrvlz0jcewrf">
         <w:r>
           <w:rPr>
             <w:rStyle w:val="Hyperlink"/>
@@ -2384,7 +2597,7 @@
         </w:rPr>
         <w:t xml:space="preserve">TCU – Acórdão 61/2025 (cópia publicada pelo Poder360): </w:t>
       </w:r>
-      <w:hyperlink w:history="1" r:id="rIdlejrei6ddo1ok5pehf9au">
+      <w:hyperlink w:history="1" r:id="rIddhpqaytyngueyrngvqe_e">
         <w:r>
           <w:rPr>
             <w:rStyle w:val="Hyperlink"/>
@@ -2411,7 +2624,7 @@
         </w:rPr>
         <w:t xml:space="preserve">AGU – recurso contra a cautelar (cópia publicada pelo Poder360): </w:t>
       </w:r>
-      <w:hyperlink w:history="1" r:id="rIdoeqfn3tsrfba45n0burym">
+      <w:hyperlink w:history="1" r:id="rIdenft-fthpem_bzixhmj7i">
         <w:r>
           <w:rPr>
             <w:rStyle w:val="Hyperlink"/>
@@ -2438,7 +2651,7 @@
         </w:rPr>
         <w:t xml:space="preserve">Lei 14.818/2024 – Câmara dos Deputados: </w:t>
       </w:r>
-      <w:hyperlink w:history="1" r:id="rIda4by_f8qwuvjp4ropumwy">
+      <w:hyperlink w:history="1" r:id="rIdfbhosjrzolpmbxj8xvqp_">
         <w:r>
           <w:rPr>
             <w:rStyle w:val="Hyperlink"/>
@@ -2465,7 +2678,7 @@
         </w:rPr>
         <w:t xml:space="preserve">TCU dá 120 dias – InfoMoney: </w:t>
       </w:r>
-      <w:hyperlink w:history="1" r:id="rIdngohjawvebf6udb5hmcpf">
+      <w:hyperlink w:history="1" r:id="rIddo73sh9vbnrsbkxcdnhoj">
         <w:r>
           <w:rPr>
             <w:rStyle w:val="Hyperlink"/>
@@ -2492,7 +2705,7 @@
         </w:rPr>
         <w:t xml:space="preserve">PLN 5/2025 – Agência Câmara: </w:t>
       </w:r>
-      <w:hyperlink w:history="1" r:id="rIdaenwhvdv6rv6tgmlbwzgu">
+      <w:hyperlink w:history="1" r:id="rIdollaenlidlah-_3dfxqgy">
         <w:r>
           <w:rPr>
             <w:rStyle w:val="Hyperlink"/>
@@ -2519,7 +2732,7 @@
         </w:rPr>
         <w:t xml:space="preserve">Leis 14.995 e 15.076 – CartaCapital: </w:t>
       </w:r>
-      <w:hyperlink w:history="1" r:id="rId9dumr5f7ct080elvog97g">
+      <w:hyperlink w:history="1" r:id="rIdsv2nx5efpay26m00-7l3j">
         <w:r>
           <w:rPr>
             <w:rStyle w:val="Hyperlink"/>
@@ -2544,9 +2757,117 @@
           <w:sz w:val="20"/>
           <w:szCs w:val="20"/>
         </w:rPr>
+        <w:t xml:space="preserve">TCU – notícia oficial do Acórdão 297/2025 (prazo de 120 dias): </w:t>
+      </w:r>
+      <w:hyperlink w:history="1" r:id="rIdbxbjpocx_wu1usg9vknup">
+        <w:r>
+          <w:rPr>
+            <w:rStyle w:val="Hyperlink"/>
+            <w:sz w:val="18"/>
+            <w:szCs w:val="18"/>
+          </w:rPr>
+          <w:t xml:space="preserve">https://portal.tcu.gov.br/imprensa/noticias/tcu-da-prazo-de-120-dias-para-governo-federal-adequar-programa-pe-de-meia-ao-orcamento</w:t>
+        </w:r>
+      </w:hyperlink>
+    </w:p>
+    <w:p>
+      <w:pPr>
+        <w:pStyle w:val="ListParagraph"/>
+        <w:numPr>
+          <w:ilvl w:val="0"/>
+          <w:numId w:val="5"/>
+        </w:numPr>
+        <w:spacing w:after="60"/>
+      </w:pPr>
+      <w:r>
+        <w:rPr>
+          <w:sz w:val="20"/>
+          <w:szCs w:val="20"/>
+        </w:rPr>
+        <w:t xml:space="preserve">TCU – Aviso 902/2025 à Câmara (cita o Acórdão 297/2025): </w:t>
+      </w:r>
+      <w:hyperlink w:history="1" r:id="rIdjgq_2lf-d96m9dz1gmlea">
+        <w:r>
+          <w:rPr>
+            <w:rStyle w:val="Hyperlink"/>
+            <w:sz w:val="18"/>
+            <w:szCs w:val="18"/>
+          </w:rPr>
+          <w:t xml:space="preserve">https://www2.camara.leg.br/atividade-legislativa/comissoes/comissoes-permanentes/cffc/expedientes-recebidos/Aviso000.902_2025GABPRES.pdf</w:t>
+        </w:r>
+      </w:hyperlink>
+    </w:p>
+    <w:p>
+      <w:pPr>
+        <w:pStyle w:val="ListParagraph"/>
+        <w:numPr>
+          <w:ilvl w:val="0"/>
+          <w:numId w:val="5"/>
+        </w:numPr>
+        <w:spacing w:after="60"/>
+      </w:pPr>
+      <w:r>
+        <w:rPr>
+          <w:sz w:val="20"/>
+          <w:szCs w:val="20"/>
+        </w:rPr>
+        <w:t xml:space="preserve">TCU – Acórdão 1.326/2025 (Contas 2024): </w:t>
+      </w:r>
+      <w:hyperlink w:history="1" r:id="rId8-3maszpsca19htdosssc">
+        <w:r>
+          <w:rPr>
+            <w:rStyle w:val="Hyperlink"/>
+            <w:sz w:val="18"/>
+            <w:szCs w:val="18"/>
+          </w:rPr>
+          <w:t xml:space="preserve">https://sites.tcu.gov.br/recursos/contas-do-presidente/3%20Ac%C3%B3rd%C3%A3o%201.326_2025-P%20CG2024.pdf</w:t>
+        </w:r>
+      </w:hyperlink>
+    </w:p>
+    <w:p>
+      <w:pPr>
+        <w:pStyle w:val="ListParagraph"/>
+        <w:numPr>
+          <w:ilvl w:val="0"/>
+          <w:numId w:val="5"/>
+        </w:numPr>
+        <w:spacing w:after="60"/>
+      </w:pPr>
+      <w:r>
+        <w:rPr>
+          <w:sz w:val="20"/>
+          <w:szCs w:val="20"/>
+        </w:rPr>
+        <w:t xml:space="preserve">TCU – Voto do relator, Contas 2023 (TC 010.005/2024-2): </w:t>
+      </w:r>
+      <w:hyperlink w:history="1" r:id="rIdvub4rscusozlibjobz1ey">
+        <w:r>
+          <w:rPr>
+            <w:rStyle w:val="Hyperlink"/>
+            <w:sz w:val="18"/>
+            <w:szCs w:val="18"/>
+          </w:rPr>
+          <w:t xml:space="preserve">https://sites.tcu.gov.br/recursos/contas-do-governo-2023/4%20Voto%20Ministro%20VR%20(relator)%20CG2023.pdf</w:t>
+        </w:r>
+      </w:hyperlink>
+    </w:p>
+    <w:p>
+      <w:pPr>
+        <w:pStyle w:val="ListParagraph"/>
+        <w:numPr>
+          <w:ilvl w:val="0"/>
+          <w:numId w:val="5"/>
+        </w:numPr>
+        <w:spacing w:after="60"/>
+      </w:pPr>
+      <w:r>
+        <w:rPr>
+          <w:sz w:val="20"/>
+          <w:szCs w:val="20"/>
+        </w:rPr>
         <w:t xml:space="preserve">TCU – Contas do Presidente 2024: </w:t>
       </w:r>
-      <w:hyperlink w:history="1" r:id="rIdnz2nwn-p-zqmnurvgw5bp">
+      <w:hyperlink w:history="1" r:id="rId5kavbfaslgwfxypp3-es8">
         <w:r>
           <w:rPr>
             <w:rStyle w:val="Hyperlink"/>
@@ -2573,7 +2894,7 @@
         </w:rPr>
         <w:t xml:space="preserve">Contas 2024, renúncias – Exame: </w:t>
       </w:r>
-      <w:hyperlink w:history="1" r:id="rIdpm1-j5vwx0npwggucujpk">
+      <w:hyperlink w:history="1" r:id="rIdymt_fpmk-zetoidsmok6g">
         <w:r>
           <w:rPr>
             <w:rStyle w:val="Hyperlink"/>
@@ -2600,7 +2921,7 @@
         </w:rPr>
         <w:t xml:space="preserve">Contas 2024, irregularidade – CNN Brasil: </w:t>
       </w:r>
-      <w:hyperlink w:history="1" r:id="rIdl0f5wj7bnw-tsa-axzyek">
+      <w:hyperlink w:history="1" r:id="rIdtuyfdawsnssuw9re6lbpa">
         <w:r>
           <w:rPr>
             <w:rStyle w:val="Hyperlink"/>
@@ -2627,7 +2948,7 @@
         </w:rPr>
         <w:t xml:space="preserve">TCU – Contas do Presidente 2023: </w:t>
       </w:r>
-      <w:hyperlink w:history="1" r:id="rIdervb67skxmvoiq6sihvug">
+      <w:hyperlink w:history="1" r:id="rId7x9ob-umng9u_kvxp33ew">
         <w:r>
           <w:rPr>
             <w:rStyle w:val="Hyperlink"/>
@@ -2654,7 +2975,7 @@
         </w:rPr>
         <w:t xml:space="preserve">TCU – Acórdão 1.442/2026 (Contas 2025): </w:t>
       </w:r>
-      <w:hyperlink w:history="1" r:id="rIdmhqxhyeehglokf_fnbx9g">
+      <w:hyperlink w:history="1" r:id="rIdp5rrnpczq4bxnaurf3gw5">
         <w:r>
           <w:rPr>
             <w:rStyle w:val="Hyperlink"/>

</xml_diff>

<commit_message>
Adiciona dossiê completo em PDF e inclui o Acórdão 2.261/2026-TCU
Co-Authored-By: Claude Opus 5.5 <noreply@anthropic.com>
Claude-Session: https://claude.ai/code/session_014FdFMaMFv1EZmCvKyRdzXt
</commit_message>
<xml_diff>
--- a/denuncia-crime-responsabilidade-minuta.docx
+++ b/denuncia-crime-responsabilidade-minuta.docx
@@ -238,10 +238,10 @@
                 <w:b/>
                 <w:bCs/>
               </w:rPr>
-              <w:t xml:space="preserve">Verificar antes de protocolar: </w:t>
-            </w:r>
-            <w:r>
-              <w:t xml:space="preserve">há registro de uma deliberação de 2026 no mesmo processo do Pé-de-Meia (Acórdão nº 2.261/2026-TCU-Plenário, Ata nº 19/2026, rel. Min. Augusto Nardes) cujo conteúdo não foi possível confirmar. Se for o julgamento de mérito, leia-o e ajuste os itens 7, 8 e 15. Se o TCU tiver considerado a situação regularizada, isso pesa contra o Fato 1.</w:t>
+              <w:t xml:space="preserve">Acórdão 2.261/2026 (item 8-A): </w:t>
+            </w:r>
+            <w:r>
+              <w:t xml:space="preserve">a identificação foi confirmada em registros do TCU: sessão extraordinária de 25/08/2026, Ata nº 32/2026, código AC-2261-32/26-P. O inteiro teor não pôde ser lido. A descrição do conteúdo vem de trechos da pesquisa do TCU. Leia o dispositivo completo antes de protocolar e ajuste os itens 8-A e 15 se ele disser algo diferente.</w:t>
             </w:r>
           </w:p>
           <w:p>
@@ -527,19 +527,35 @@
     </w:p>
     <w:p>
       <w:pPr>
-        <w:pStyle w:val="Heading2"/>
-      </w:pPr>
-      <w:r>
-        <w:t xml:space="preserve">Fato 2: sanção de leis que concederam benefícios tributários sem os requisitos legais</w:t>
-      </w:r>
-    </w:p>
-    <w:p>
-      <w:pPr>
         <w:spacing w:after="160" w:line="360"/>
         <w:ind w:firstLine="709"/>
         <w:jc w:val="both"/>
       </w:pPr>
       <w:r>
+        <w:t xml:space="preserve">8-A. Em 25 de agosto de 2026, em sessão extraordinária, o Plenário do TCU proferiu por unanimidade, no mesmo processo, o Acórdão nº 2.261/2026-TCU-Plenário (Doc. 3-A). O processo é uma representação do Ministério Público junto ao TCU, com relatoria do Ministro Augusto Nardes e revisão do Ministro Odair Cunha. Segundo os registros de pesquisa do TCU, o sumário da decisão aponta indícios de descumprimento de princípios e normas constitucionais e legais de finanças públicas no arranjo orçamentário e financeiro do Programa. O Tribunal, ainda assim, autorizou excepcionalmente a execução temporária do programa. </w:t>
+      </w:r>
+      <w:r>
+        <w:rPr>
+          <w:shd w:fill="FFF2A8" w:color="auto" w:val="clear"/>
+        </w:rPr>
+        <w:t xml:space="preserve">[Conferir o inteiro teor, em especial o dispositivo, antes do protocolo.]</w:t>
+      </w:r>
+    </w:p>
+    <w:p>
+      <w:pPr>
+        <w:pStyle w:val="Heading2"/>
+      </w:pPr>
+      <w:r>
+        <w:t xml:space="preserve">Fato 2: sanção de leis que concederam benefícios tributários sem os requisitos legais</w:t>
+      </w:r>
+    </w:p>
+    <w:p>
+      <w:pPr>
+        <w:spacing w:after="160" w:line="360"/>
+        <w:ind w:firstLine="709"/>
+        <w:jc w:val="both"/>
+      </w:pPr>
+      <w:r>
         <w:t xml:space="preserve">9. No parecer prévio sobre as Contas do Presidente da República do exercício de 2024, aprovado em 11 de junho de 2025 (Acórdão nº 1.326/2025-TCU-Plenário, TC 008.437/2025-4, relator: Ministro Jhonatan de Jesus, Doc. 6 e 7), o TCU apontou como </w:t>
       </w:r>
       <w:r>
@@ -692,7 +708,7 @@
         <w:jc w:val="both"/>
       </w:pPr>
       <w:r>
-        <w:t xml:space="preserve">No Fato 1, as transferências ao Fipem tiveram amparo em leis aprovadas pelo Congresso Nacional. A decisão do TCU foi cautelar, sem julgamento de mérito, e foi revogada pelo Acórdão nº 297/2025-TCU-Plenário. O Executivo apresentou proposta de regularização (PLN nº 5/2025), e a Advocacia-Geral da União sustenta a legalidade das transferências e o cumprimento da determinação de iniciar o processo legislativo.</w:t>
+        <w:t xml:space="preserve">No Fato 1, as transferências ao Fipem tiveram amparo em leis aprovadas pelo Congresso Nacional. A decisão do TCU foi cautelar, sem julgamento de mérito, e foi revogada pelo Acórdão nº 297/2025-TCU-Plenário. O Executivo apresentou proposta de regularização (PLN nº 5/2025), e a Advocacia-Geral da União sustenta a legalidade das transferências e o cumprimento da determinação de iniciar o processo legislativo. Para 2026, conforme noticiado, o programa foi incluído na proposta orçamentária com previsão de cerca de R$ 12 bilhões, valor reduzido para cerca de R$ 11,4 bilhões na tramitação no Congresso. Mesmo no Acórdão nº 2.261/2026, o TCU manteve a autorização para a execução do programa.</w:t>
       </w:r>
     </w:p>
     <w:p>
@@ -752,7 +768,7 @@
         <w:jc w:val="both"/>
       </w:pPr>
       <w:r>
-        <w:t xml:space="preserve">a requisição ao Tribunal de Contas da União de cópia integral do processo TC 024.312/2024-0 (Pé-de-Meia), inclusive dos Acórdãos nº 61/2025 e nº 297/2025-TCU-Plenário, de eventual decisão de mérito e do acompanhamento do cumprimento do prazo de 120 dias, e do processo TC 008.437/2025-4 (Contas do Presidente da República, exercício de 2024), em especial o capítulo sobre renúncias de receita;</w:t>
+        <w:t xml:space="preserve">a requisição ao Tribunal de Contas da União de cópia integral do processo TC 024.312/2024-0 (Pé-de-Meia), inclusive dos Acórdãos nº 61/2025, nº 297/2025 e nº 2.261/2026-TCU-Plenário e do acompanhamento do cumprimento do prazo de 120 dias, e do processo TC 008.437/2025-4 (Contas do Presidente da República, exercício de 2024), em especial o capítulo sobre renúncias de receita;</w:t>
       </w:r>
     </w:p>
     <w:p>
@@ -937,6 +953,20 @@
       </w:pPr>
       <w:r>
         <w:t xml:space="preserve">Doc. 3: Acórdão nº 297/2025-TCU-Plenário (TC 024.312/2024-0), de 12/02/2025, que revogou a cautelar e fixou prazo de 120 dias.</w:t>
+      </w:r>
+    </w:p>
+    <w:p>
+      <w:pPr>
+        <w:pStyle w:val="ListParagraph"/>
+        <w:numPr>
+          <w:ilvl w:val="0"/>
+          <w:numId w:val="4"/>
+        </w:numPr>
+        <w:spacing w:after="100" w:line="340"/>
+        <w:jc w:val="both"/>
+      </w:pPr>
+      <w:r>
+        <w:t xml:space="preserve">Doc. 3-A: Acórdão nº 2.261/2026-TCU-Plenário (TC 024.312/2024-0), de 25/08/2026, Ata nº 32/2026, código AC-2261-32/26-P.</w:t>
       </w:r>
     </w:p>
     <w:p>
@@ -1987,7 +2017,7 @@
                 <w:sz w:val="18"/>
                 <w:szCs w:val="18"/>
               </w:rPr>
-              <w:t xml:space="preserve">Possível decisão posterior no mesmo processo</w:t>
+              <w:t xml:space="preserve">TCU (25/08/2026): indícios de descumprimento de normas de finanças públicas; execução temporária autorizada</w:t>
             </w:r>
           </w:p>
         </w:tc>
@@ -2019,7 +2049,22 @@
                 <w:sz w:val="18"/>
                 <w:szCs w:val="18"/>
               </w:rPr>
-              <w:t xml:space="preserve">Acórdão 2.261/2026-Plenário (Ata 19/2026)</w:t>
+              <w:t xml:space="preserve">Acórdão 2.261/2026-Plenário</w:t>
+            </w:r>
+          </w:p>
+          <w:p>
+            <w:pPr>
+              <w:spacing w:after="40"/>
+            </w:pPr>
+            <w:r>
+              <w:rPr>
+                <w:rFonts w:ascii="Calibri" w:cs="Calibri" w:eastAsia="Calibri" w:hAnsi="Calibri"/>
+                <w:b w:val="false"/>
+                <w:bCs w:val="false"/>
+                <w:sz w:val="18"/>
+                <w:szCs w:val="18"/>
+              </w:rPr>
+              <w:t xml:space="preserve">Ata 32/2026 · AC-2261-32/26-P</w:t>
             </w:r>
           </w:p>
         </w:tc>
@@ -2051,7 +2096,7 @@
                 <w:sz w:val="18"/>
                 <w:szCs w:val="18"/>
               </w:rPr>
-              <w:t xml:space="preserve">Não verificado: conferir conteúdo</w:t>
+              <w:t xml:space="preserve">Identificação confirmada; conteúdo por trechos da pesquisa do TCU; ler o inteiro teor</w:t>
             </w:r>
           </w:p>
         </w:tc>
@@ -2083,7 +2128,7 @@
                 <w:sz w:val="18"/>
                 <w:szCs w:val="18"/>
               </w:rPr>
-              <w:t xml:space="preserve">Pode alterar a avaliação do Fato 1</w:t>
+              <w:t xml:space="preserve">Programa autorizado; incluído no Orçamento de 2026</w:t>
             </w:r>
           </w:p>
         </w:tc>
@@ -2570,7 +2615,7 @@
         </w:rPr>
         <w:t xml:space="preserve">TCU – Pé-de-Meia (notícia oficial): </w:t>
       </w:r>
-      <w:hyperlink w:history="1" r:id="rIdkgsxfs8dubrvlz0jcewrf">
+      <w:hyperlink w:history="1" r:id="rIdx3jthgw-azzeojq91xo74">
         <w:r>
           <w:rPr>
             <w:rStyle w:val="Hyperlink"/>
@@ -2597,7 +2642,7 @@
         </w:rPr>
         <w:t xml:space="preserve">TCU – Acórdão 61/2025 (cópia publicada pelo Poder360): </w:t>
       </w:r>
-      <w:hyperlink w:history="1" r:id="rIddhpqaytyngueyrngvqe_e">
+      <w:hyperlink w:history="1" r:id="rIdrmk6by9gtrat_pa6jwpsw">
         <w:r>
           <w:rPr>
             <w:rStyle w:val="Hyperlink"/>
@@ -2624,7 +2669,7 @@
         </w:rPr>
         <w:t xml:space="preserve">AGU – recurso contra a cautelar (cópia publicada pelo Poder360): </w:t>
       </w:r>
-      <w:hyperlink w:history="1" r:id="rIdenft-fthpem_bzixhmj7i">
+      <w:hyperlink w:history="1" r:id="rIdsjjzaxg76n4cvdclkd_wj">
         <w:r>
           <w:rPr>
             <w:rStyle w:val="Hyperlink"/>
@@ -2651,7 +2696,7 @@
         </w:rPr>
         <w:t xml:space="preserve">Lei 14.818/2024 – Câmara dos Deputados: </w:t>
       </w:r>
-      <w:hyperlink w:history="1" r:id="rIdfbhosjrzolpmbxj8xvqp_">
+      <w:hyperlink w:history="1" r:id="rIdzkr8gtibgo2t21e36-ek3">
         <w:r>
           <w:rPr>
             <w:rStyle w:val="Hyperlink"/>
@@ -2678,7 +2723,7 @@
         </w:rPr>
         <w:t xml:space="preserve">TCU dá 120 dias – InfoMoney: </w:t>
       </w:r>
-      <w:hyperlink w:history="1" r:id="rIddo73sh9vbnrsbkxcdnhoj">
+      <w:hyperlink w:history="1" r:id="rIdc6cazu_1dfzbmtbehihei">
         <w:r>
           <w:rPr>
             <w:rStyle w:val="Hyperlink"/>
@@ -2705,7 +2750,7 @@
         </w:rPr>
         <w:t xml:space="preserve">PLN 5/2025 – Agência Câmara: </w:t>
       </w:r>
-      <w:hyperlink w:history="1" r:id="rIdollaenlidlah-_3dfxqgy">
+      <w:hyperlink w:history="1" r:id="rIdfh0fquwsh8ykgk40g_e05">
         <w:r>
           <w:rPr>
             <w:rStyle w:val="Hyperlink"/>
@@ -2732,7 +2777,7 @@
         </w:rPr>
         <w:t xml:space="preserve">Leis 14.995 e 15.076 – CartaCapital: </w:t>
       </w:r>
-      <w:hyperlink w:history="1" r:id="rIdsv2nx5efpay26m00-7l3j">
+      <w:hyperlink w:history="1" r:id="rIdy3cqlhn_nbbibjn0hzlxi">
         <w:r>
           <w:rPr>
             <w:rStyle w:val="Hyperlink"/>
@@ -2759,7 +2804,7 @@
         </w:rPr>
         <w:t xml:space="preserve">TCU – notícia oficial do Acórdão 297/2025 (prazo de 120 dias): </w:t>
       </w:r>
-      <w:hyperlink w:history="1" r:id="rIdbxbjpocx_wu1usg9vknup">
+      <w:hyperlink w:history="1" r:id="rId9nuft4sux334s9mgukox7">
         <w:r>
           <w:rPr>
             <w:rStyle w:val="Hyperlink"/>
@@ -2786,7 +2831,7 @@
         </w:rPr>
         <w:t xml:space="preserve">TCU – Aviso 902/2025 à Câmara (cita o Acórdão 297/2025): </w:t>
       </w:r>
-      <w:hyperlink w:history="1" r:id="rIdjgq_2lf-d96m9dz1gmlea">
+      <w:hyperlink w:history="1" r:id="rId5vxsdpqv4zlgczc-1m7pe">
         <w:r>
           <w:rPr>
             <w:rStyle w:val="Hyperlink"/>
@@ -2811,9 +2856,90 @@
           <w:sz w:val="20"/>
           <w:szCs w:val="20"/>
         </w:rPr>
+        <w:t xml:space="preserve">TCU – pauta do Plenário com o TC 024.312/2024-0 (agosto/2026): </w:t>
+      </w:r>
+      <w:hyperlink w:history="1" r:id="rIdqbwrsab69nkb5jtsvxy6i">
+        <w:r>
+          <w:rPr>
+            <w:rStyle w:val="Hyperlink"/>
+            <w:sz w:val="18"/>
+            <w:szCs w:val="18"/>
+          </w:rPr>
+          <w:t xml:space="preserve">https://portal.tcu.gov.br/uploads/pautas/pauta-23169-2596026424803438700.pdf</w:t>
+        </w:r>
+      </w:hyperlink>
+    </w:p>
+    <w:p>
+      <w:pPr>
+        <w:pStyle w:val="ListParagraph"/>
+        <w:numPr>
+          <w:ilvl w:val="0"/>
+          <w:numId w:val="5"/>
+        </w:numPr>
+        <w:spacing w:after="60"/>
+      </w:pPr>
+      <w:r>
+        <w:rPr>
+          <w:sz w:val="20"/>
+          <w:szCs w:val="20"/>
+        </w:rPr>
+        <w:t xml:space="preserve">Orçamento de 2026 e Pé-de-Meia – DGABC: </w:t>
+      </w:r>
+      <w:hyperlink w:history="1" r:id="rIdxd6ll9pufdnsuzizxcboa">
+        <w:r>
+          <w:rPr>
+            <w:rStyle w:val="Hyperlink"/>
+            <w:sz w:val="18"/>
+            <w:szCs w:val="18"/>
+          </w:rPr>
+          <w:t xml:space="preserve">https://www.dgabc.com.br/Noticia/4254407/veja-o-que-se-sabe-ate-agora-sobre-o-orcamento-de-2026-enviado-pelo-governo-lula-ao-congresso</w:t>
+        </w:r>
+      </w:hyperlink>
+    </w:p>
+    <w:p>
+      <w:pPr>
+        <w:pStyle w:val="ListParagraph"/>
+        <w:numPr>
+          <w:ilvl w:val="0"/>
+          <w:numId w:val="5"/>
+        </w:numPr>
+        <w:spacing w:after="60"/>
+      </w:pPr>
+      <w:r>
+        <w:rPr>
+          <w:sz w:val="20"/>
+          <w:szCs w:val="20"/>
+        </w:rPr>
+        <w:t xml:space="preserve">Orçamento de 2026 após o Congresso – Correio Braziliense (25/12/2025): </w:t>
+      </w:r>
+      <w:hyperlink w:history="1" r:id="rIdpzdr38eloqpkn7ldnho4s">
+        <w:r>
+          <w:rPr>
+            <w:rStyle w:val="Hyperlink"/>
+            <w:sz w:val="18"/>
+            <w:szCs w:val="18"/>
+          </w:rPr>
+          <w:t xml:space="preserve">https://edicao.correiobraziliense.com.br/correiobraziliense/2025/12/25/1254c0/pdf/A02-POL-2512-DIG.pdf</w:t>
+        </w:r>
+      </w:hyperlink>
+    </w:p>
+    <w:p>
+      <w:pPr>
+        <w:pStyle w:val="ListParagraph"/>
+        <w:numPr>
+          <w:ilvl w:val="0"/>
+          <w:numId w:val="5"/>
+        </w:numPr>
+        <w:spacing w:after="60"/>
+      </w:pPr>
+      <w:r>
+        <w:rPr>
+          <w:sz w:val="20"/>
+          <w:szCs w:val="20"/>
+        </w:rPr>
         <w:t xml:space="preserve">TCU – Acórdão 1.326/2025 (Contas 2024): </w:t>
       </w:r>
-      <w:hyperlink w:history="1" r:id="rId8-3maszpsca19htdosssc">
+      <w:hyperlink w:history="1" r:id="rIdjaxeyazh39nhm5inakhma">
         <w:r>
           <w:rPr>
             <w:rStyle w:val="Hyperlink"/>
@@ -2840,7 +2966,7 @@
         </w:rPr>
         <w:t xml:space="preserve">TCU – Voto do relator, Contas 2023 (TC 010.005/2024-2): </w:t>
       </w:r>
-      <w:hyperlink w:history="1" r:id="rIdvub4rscusozlibjobz1ey">
+      <w:hyperlink w:history="1" r:id="rIdtoopku760rvij0mg1olf0">
         <w:r>
           <w:rPr>
             <w:rStyle w:val="Hyperlink"/>
@@ -2867,7 +2993,7 @@
         </w:rPr>
         <w:t xml:space="preserve">TCU – Contas do Presidente 2024: </w:t>
       </w:r>
-      <w:hyperlink w:history="1" r:id="rId5kavbfaslgwfxypp3-es8">
+      <w:hyperlink w:history="1" r:id="rIdsexgc0tzsd_8k3onl81d1">
         <w:r>
           <w:rPr>
             <w:rStyle w:val="Hyperlink"/>
@@ -2894,7 +3020,7 @@
         </w:rPr>
         <w:t xml:space="preserve">Contas 2024, renúncias – Exame: </w:t>
       </w:r>
-      <w:hyperlink w:history="1" r:id="rIdymt_fpmk-zetoidsmok6g">
+      <w:hyperlink w:history="1" r:id="rIdoohaqdnb_yw8g8kioepsq">
         <w:r>
           <w:rPr>
             <w:rStyle w:val="Hyperlink"/>
@@ -2921,7 +3047,7 @@
         </w:rPr>
         <w:t xml:space="preserve">Contas 2024, irregularidade – CNN Brasil: </w:t>
       </w:r>
-      <w:hyperlink w:history="1" r:id="rIdtuyfdawsnssuw9re6lbpa">
+      <w:hyperlink w:history="1" r:id="rIdowvowmvkyl0es1ltnwrur">
         <w:r>
           <w:rPr>
             <w:rStyle w:val="Hyperlink"/>
@@ -2948,7 +3074,7 @@
         </w:rPr>
         <w:t xml:space="preserve">TCU – Contas do Presidente 2023: </w:t>
       </w:r>
-      <w:hyperlink w:history="1" r:id="rId7x9ob-umng9u_kvxp33ew">
+      <w:hyperlink w:history="1" r:id="rIdp9iud3qujjd3wb63yoi_0">
         <w:r>
           <w:rPr>
             <w:rStyle w:val="Hyperlink"/>
@@ -2975,7 +3101,7 @@
         </w:rPr>
         <w:t xml:space="preserve">TCU – Acórdão 1.442/2026 (Contas 2025): </w:t>
       </w:r>
-      <w:hyperlink w:history="1" r:id="rIdp5rrnpczq4bxnaurf3gw5">
+      <w:hyperlink w:history="1" r:id="rIdimuxstpvedjxwp17ce6gv">
         <w:r>
           <w:rPr>
             <w:rStyle w:val="Hyperlink"/>

</xml_diff>

<commit_message>
Confirma leis do Fipem, corrige dados das renúncias e adiciona quadro de verificação ao dossiê
Co-Authored-By: Claude Opus 5.5 <noreply@anthropic.com>
Claude-Session: https://claude.ai/code/session_014FdFMaMFv1EZmCvKyRdzXt
</commit_message>
<xml_diff>
--- a/denuncia-crime-responsabilidade-minuta.docx
+++ b/denuncia-crime-responsabilidade-minuta.docx
@@ -496,13 +496,7 @@
         <w:jc w:val="both"/>
       </w:pPr>
       <w:r>
-        <w:t xml:space="preserve">6. Conforme noticiado, as Leis nº 14.995/2024 e nº 15.076/2024 autorizaram a transferência ao Fipem de recursos não utilizados do Fundo de Garantia de Operações de Crédito Educativo (Fgeduc) e do Fundo de Garantia de Operações (FGO) (Doc. 5). </w:t>
-      </w:r>
-      <w:r>
-        <w:rPr>
-          <w:shd w:fill="FFF2A8" w:color="auto" w:val="clear"/>
-        </w:rPr>
-        <w:t xml:space="preserve">[Conferir no DOU o teor exato dessas leis.]</w:t>
+        <w:t xml:space="preserve">6. A Lei nº 14.995, de 10 de outubro de 2024, autorizou o Fundo de Garantia de Operações de Crédito Educativo (Fgeduc) a integralizar cotas no Fipem até o limite de R$ 6 bilhões. A Lei nº 15.076, de 26 de dezembro de 2024, autorizou o Fundo de Garantia de Operações (FGO) a integralizar cotas no Fipem até R$ 4 bilhões (Doc. 5). Em ambos os casos, a lei ressalvou os recursos já vinculados a garantias contratadas.</w:t>
       </w:r>
     </w:p>
     <w:p>
@@ -566,7 +560,7 @@
         <w:t xml:space="preserve">irregularidade</w:t>
       </w:r>
       <w:r>
-        <w:t xml:space="preserve"> a concessão ou ampliação de benefícios tributários, por meio de renúncia de receita, sem observância das exigências legais. Segundo o Tribunal, das 23 desonerações instituídas por 19 atos normativos em 2024, parte não atendeu aos requisitos da Lei de Responsabilidade Fiscal (art. 14), da Lei de Diretrizes Orçamentárias e da Constituição. </w:t>
+        <w:t xml:space="preserve"> a concessão ou ampliação de benefícios tributários, por meio de renúncia de receita, sem observância das exigências legais. Segundo o Tribunal, o Poder Executivo deixou de atender dispositivos da Lei de Diretrizes Orçamentárias, entre eles a apresentação de memórias de cálculo detalhadas das estimativas de renúncia. Conforme noticiado, foram instituídas 23 desonerações por 19 atos normativos em 2024, e parte delas não atendeu aos requisitos da Lei de Responsabilidade Fiscal (art. 14), da LDO e da Constituição. </w:t>
       </w:r>
       <w:r>
         <w:rPr>
@@ -994,7 +988,7 @@
         <w:jc w:val="both"/>
       </w:pPr>
       <w:r>
-        <w:t xml:space="preserve">Doc. 5: Leis nº 14.995/2024 e nº 15.076/2024 (DOU).</w:t>
+        <w:t xml:space="preserve">Doc. 5: Lei nº 14.995, de 10/10/2024, e Lei nº 15.076, de 26/12/2024 (DOU).</w:t>
       </w:r>
     </w:p>
     <w:p>
@@ -1596,7 +1590,7 @@
                 <w:sz w:val="18"/>
                 <w:szCs w:val="18"/>
               </w:rPr>
-              <w:t xml:space="preserve">Leis 14.995/2024 e 15.076/2024 autorizaram transferências do Fgeduc e FGO ao Fipem</w:t>
+              <w:t xml:space="preserve">Lei 14.995/2024 (Fgeduc, até R$ 6 bi) e Lei 15.076/2024 (FGO, até R$ 4 bi) autorizaram aportes ao Fipem</w:t>
             </w:r>
           </w:p>
         </w:tc>
@@ -1629,7 +1623,7 @@
                 <w:sz w:val="18"/>
                 <w:szCs w:val="18"/>
               </w:rPr>
-              <w:t xml:space="preserve">DOU</w:t>
+              <w:t xml:space="preserve">Planalto: l14995.htm e l15076.htm</w:t>
             </w:r>
           </w:p>
         </w:tc>
@@ -1662,7 +1656,7 @@
                 <w:sz w:val="18"/>
                 <w:szCs w:val="18"/>
               </w:rPr>
-              <w:t xml:space="preserve">Imprensa; conferir no DOU</w:t>
+              <w:t xml:space="preserve">Texto legal localizado; confirmado no documento do TCU</w:t>
             </w:r>
           </w:p>
         </w:tc>
@@ -2381,7 +2375,7 @@
                 <w:sz w:val="18"/>
                 <w:szCs w:val="18"/>
               </w:rPr>
-              <w:t xml:space="preserve">Número confirmado (TCU); conferir capítulo de renúncias no relatório</w:t>
+              <w:t xml:space="preserve">Acórdão confirmado (TCU); números 23 e 19 apenas na imprensa; conferir no relatório</w:t>
             </w:r>
           </w:p>
         </w:tc>
@@ -2615,7 +2609,7 @@
         </w:rPr>
         <w:t xml:space="preserve">TCU – Pé-de-Meia (notícia oficial): </w:t>
       </w:r>
-      <w:hyperlink w:history="1" r:id="rIdx3jthgw-azzeojq91xo74">
+      <w:hyperlink w:history="1" r:id="rIdkiqcxgdc4yi-hm0x9-onj">
         <w:r>
           <w:rPr>
             <w:rStyle w:val="Hyperlink"/>
@@ -2642,7 +2636,7 @@
         </w:rPr>
         <w:t xml:space="preserve">TCU – Acórdão 61/2025 (cópia publicada pelo Poder360): </w:t>
       </w:r>
-      <w:hyperlink w:history="1" r:id="rIdrmk6by9gtrat_pa6jwpsw">
+      <w:hyperlink w:history="1" r:id="rIdt2nekf69_2atkay4kgeu9">
         <w:r>
           <w:rPr>
             <w:rStyle w:val="Hyperlink"/>
@@ -2669,7 +2663,7 @@
         </w:rPr>
         <w:t xml:space="preserve">AGU – recurso contra a cautelar (cópia publicada pelo Poder360): </w:t>
       </w:r>
-      <w:hyperlink w:history="1" r:id="rIdsjjzaxg76n4cvdclkd_wj">
+      <w:hyperlink w:history="1" r:id="rId7vc20wy8n51sa21cvsqjo">
         <w:r>
           <w:rPr>
             <w:rStyle w:val="Hyperlink"/>
@@ -2696,7 +2690,7 @@
         </w:rPr>
         <w:t xml:space="preserve">Lei 14.818/2024 – Câmara dos Deputados: </w:t>
       </w:r>
-      <w:hyperlink w:history="1" r:id="rIdzkr8gtibgo2t21e36-ek3">
+      <w:hyperlink w:history="1" r:id="rId0tbqf4t-yn2klie1nzugl">
         <w:r>
           <w:rPr>
             <w:rStyle w:val="Hyperlink"/>
@@ -2723,7 +2717,7 @@
         </w:rPr>
         <w:t xml:space="preserve">TCU dá 120 dias – InfoMoney: </w:t>
       </w:r>
-      <w:hyperlink w:history="1" r:id="rIdc6cazu_1dfzbmtbehihei">
+      <w:hyperlink w:history="1" r:id="rId1eobuxw8gczy53o9nnp77">
         <w:r>
           <w:rPr>
             <w:rStyle w:val="Hyperlink"/>
@@ -2750,7 +2744,7 @@
         </w:rPr>
         <w:t xml:space="preserve">PLN 5/2025 – Agência Câmara: </w:t>
       </w:r>
-      <w:hyperlink w:history="1" r:id="rIdfh0fquwsh8ykgk40g_e05">
+      <w:hyperlink w:history="1" r:id="rIdcmtpmguzcoq7vyalyn67l">
         <w:r>
           <w:rPr>
             <w:rStyle w:val="Hyperlink"/>
@@ -2775,16 +2769,16 @@
           <w:sz w:val="20"/>
           <w:szCs w:val="20"/>
         </w:rPr>
-        <w:t xml:space="preserve">Leis 14.995 e 15.076 – CartaCapital: </w:t>
-      </w:r>
-      <w:hyperlink w:history="1" r:id="rIdy3cqlhn_nbbibjn0hzlxi">
+        <w:t xml:space="preserve">Lei 14.995/2024 – Planalto: </w:t>
+      </w:r>
+      <w:hyperlink w:history="1" r:id="rIdvwoablhm6emxl1zgeia7p">
         <w:r>
           <w:rPr>
             <w:rStyle w:val="Hyperlink"/>
             <w:sz w:val="18"/>
             <w:szCs w:val="18"/>
           </w:rPr>
-          <w:t xml:space="preserve">https://www.cartacapital.com.br/?p=488367</w:t>
+          <w:t xml:space="preserve">https://www.planalto.gov.br/ccivil_03/_ato2023-2026/2024/lei/l14995.htm</w:t>
         </w:r>
       </w:hyperlink>
     </w:p>
@@ -2802,9 +2796,36 @@
           <w:sz w:val="20"/>
           <w:szCs w:val="20"/>
         </w:rPr>
+        <w:t xml:space="preserve">Lei 15.076/2024 – Planalto: </w:t>
+      </w:r>
+      <w:hyperlink w:history="1" r:id="rIdcfmqc7wnewknxfm7ffb60">
+        <w:r>
+          <w:rPr>
+            <w:rStyle w:val="Hyperlink"/>
+            <w:sz w:val="18"/>
+            <w:szCs w:val="18"/>
+          </w:rPr>
+          <w:t xml:space="preserve">https://www.planalto.gov.br/ccivil_03/_ato2023-2026/2024/lei/l15076.htm</w:t>
+        </w:r>
+      </w:hyperlink>
+    </w:p>
+    <w:p>
+      <w:pPr>
+        <w:pStyle w:val="ListParagraph"/>
+        <w:numPr>
+          <w:ilvl w:val="0"/>
+          <w:numId w:val="5"/>
+        </w:numPr>
+        <w:spacing w:after="60"/>
+      </w:pPr>
+      <w:r>
+        <w:rPr>
+          <w:sz w:val="20"/>
+          <w:szCs w:val="20"/>
+        </w:rPr>
         <w:t xml:space="preserve">TCU – notícia oficial do Acórdão 297/2025 (prazo de 120 dias): </w:t>
       </w:r>
-      <w:hyperlink w:history="1" r:id="rId9nuft4sux334s9mgukox7">
+      <w:hyperlink w:history="1" r:id="rIdro1bn-fspsmj2yspvwdnj">
         <w:r>
           <w:rPr>
             <w:rStyle w:val="Hyperlink"/>
@@ -2831,7 +2852,7 @@
         </w:rPr>
         <w:t xml:space="preserve">TCU – Aviso 902/2025 à Câmara (cita o Acórdão 297/2025): </w:t>
       </w:r>
-      <w:hyperlink w:history="1" r:id="rId5vxsdpqv4zlgczc-1m7pe">
+      <w:hyperlink w:history="1" r:id="rIdgkiuwlx-x3yinlm_lnfd3">
         <w:r>
           <w:rPr>
             <w:rStyle w:val="Hyperlink"/>
@@ -2858,7 +2879,7 @@
         </w:rPr>
         <w:t xml:space="preserve">TCU – pauta do Plenário com o TC 024.312/2024-0 (agosto/2026): </w:t>
       </w:r>
-      <w:hyperlink w:history="1" r:id="rIdqbwrsab69nkb5jtsvxy6i">
+      <w:hyperlink w:history="1" r:id="rId6vt0vfyubnktfcpsbn4fx">
         <w:r>
           <w:rPr>
             <w:rStyle w:val="Hyperlink"/>
@@ -2885,7 +2906,7 @@
         </w:rPr>
         <w:t xml:space="preserve">Orçamento de 2026 e Pé-de-Meia – DGABC: </w:t>
       </w:r>
-      <w:hyperlink w:history="1" r:id="rIdxd6ll9pufdnsuzizxcboa">
+      <w:hyperlink w:history="1" r:id="rIdf99pjcpvo9sgph87hzobi">
         <w:r>
           <w:rPr>
             <w:rStyle w:val="Hyperlink"/>
@@ -2912,7 +2933,7 @@
         </w:rPr>
         <w:t xml:space="preserve">Orçamento de 2026 após o Congresso – Correio Braziliense (25/12/2025): </w:t>
       </w:r>
-      <w:hyperlink w:history="1" r:id="rIdpzdr38eloqpkn7ldnho4s">
+      <w:hyperlink w:history="1" r:id="rIdkutox_vgdrjy9i9w0fevf">
         <w:r>
           <w:rPr>
             <w:rStyle w:val="Hyperlink"/>
@@ -2939,7 +2960,7 @@
         </w:rPr>
         <w:t xml:space="preserve">TCU – Acórdão 1.326/2025 (Contas 2024): </w:t>
       </w:r>
-      <w:hyperlink w:history="1" r:id="rIdjaxeyazh39nhm5inakhma">
+      <w:hyperlink w:history="1" r:id="rIdmb3nwd8d3nzdknwgcjlv3">
         <w:r>
           <w:rPr>
             <w:rStyle w:val="Hyperlink"/>
@@ -2966,7 +2987,7 @@
         </w:rPr>
         <w:t xml:space="preserve">TCU – Voto do relator, Contas 2023 (TC 010.005/2024-2): </w:t>
       </w:r>
-      <w:hyperlink w:history="1" r:id="rIdtoopku760rvij0mg1olf0">
+      <w:hyperlink w:history="1" r:id="rIdul6xbmaxuchyshmhjfdiu">
         <w:r>
           <w:rPr>
             <w:rStyle w:val="Hyperlink"/>
@@ -2993,7 +3014,7 @@
         </w:rPr>
         <w:t xml:space="preserve">TCU – Contas do Presidente 2024: </w:t>
       </w:r>
-      <w:hyperlink w:history="1" r:id="rIdsexgc0tzsd_8k3onl81d1">
+      <w:hyperlink w:history="1" r:id="rIdwwqnrscmryqzv6kwv4hl3">
         <w:r>
           <w:rPr>
             <w:rStyle w:val="Hyperlink"/>
@@ -3020,7 +3041,7 @@
         </w:rPr>
         <w:t xml:space="preserve">Contas 2024, renúncias – Exame: </w:t>
       </w:r>
-      <w:hyperlink w:history="1" r:id="rIdoohaqdnb_yw8g8kioepsq">
+      <w:hyperlink w:history="1" r:id="rIdljhctlp7cn7wgzggixjl9">
         <w:r>
           <w:rPr>
             <w:rStyle w:val="Hyperlink"/>
@@ -3047,7 +3068,7 @@
         </w:rPr>
         <w:t xml:space="preserve">Contas 2024, irregularidade – CNN Brasil: </w:t>
       </w:r>
-      <w:hyperlink w:history="1" r:id="rIdowvowmvkyl0es1ltnwrur">
+      <w:hyperlink w:history="1" r:id="rIdnfsakau9kf8gdkdhouqt-">
         <w:r>
           <w:rPr>
             <w:rStyle w:val="Hyperlink"/>
@@ -3074,7 +3095,7 @@
         </w:rPr>
         <w:t xml:space="preserve">TCU – Contas do Presidente 2023: </w:t>
       </w:r>
-      <w:hyperlink w:history="1" r:id="rIdp9iud3qujjd3wb63yoi_0">
+      <w:hyperlink w:history="1" r:id="rIdaltc5m5yh4_i8hv02-orz">
         <w:r>
           <w:rPr>
             <w:rStyle w:val="Hyperlink"/>
@@ -3101,7 +3122,7 @@
         </w:rPr>
         <w:t xml:space="preserve">TCU – Acórdão 1.442/2026 (Contas 2025): </w:t>
       </w:r>
-      <w:hyperlink w:history="1" r:id="rIdimuxstpvedjxwp17ce6gv">
+      <w:hyperlink w:history="1" r:id="rIdqy0ujivxlf05sgh-x6sfa">
         <w:r>
           <w:rPr>
             <w:rStyle w:val="Hyperlink"/>

</xml_diff>

<commit_message>
Preenche identificação como anônimo, confirma retirada do PLN 5/2025, LOA 2026 e sessão de 25/08/2026 do TCU
Co-Authored-By: Claude Opus 5.5 <noreply@anthropic.com>
Claude-Session: https://claude.ai/code/session_014FdFMaMFv1EZmCvKyRdzXt
</commit_message>
<xml_diff>
--- a/denuncia-crime-responsabilidade-minuta.docx
+++ b/denuncia-crime-responsabilidade-minuta.docx
@@ -77,11 +77,12 @@
               <w:rPr>
                 <w:b/>
                 <w:bCs/>
-              </w:rPr>
-              <w:t xml:space="preserve">Campos em amarelo </w:t>
-            </w:r>
-            <w:r>
-              <w:t xml:space="preserve">devem ser preenchidos com seus dados ou conferidos no documento oficial antes da assinatura.</w:t>
+                <w:color w:val="C00000"/>
+              </w:rPr>
+              <w:t xml:space="preserve">ANONIMATO: </w:t>
+            </w:r>
+            <w:r>
+              <w:t xml:space="preserve">a identificação foi preenchida como ANÔNIMO, conforme sua escolha. A Lei 1.079/1950 exige denunciante cidadão identificado, com firma reconhecida (arts. 14 e 16). Uma denúncia anônima não será recebida e tende a ser arquivada por vício formal. Para que tenha efeito, é preciso se identificar. As alternativas compatíveis com o anonimato são a representação (Parte II) e os pedidos de acesso à informação com identidade preservada (Parte III).</w:t>
             </w:r>
           </w:p>
           <w:p>
@@ -98,10 +99,10 @@
                 <w:b/>
                 <w:bCs/>
               </w:rPr>
-              <w:t xml:space="preserve">Firma reconhecida </w:t>
-            </w:r>
-            <w:r>
-              <w:t xml:space="preserve">em cartório é obrigatória (Lei 1.079/1950, art. 16). Anexe RG, título de eleitor e certidão de quitação eleitoral, que comprova a cidadania (art. 14).</w:t>
+              <w:t xml:space="preserve">Campos em amarelo </w:t>
+            </w:r>
+            <w:r>
+              <w:t xml:space="preserve">devem ser preenchidos com seus dados ou conferidos no documento oficial antes da assinatura.</w:t>
             </w:r>
           </w:p>
           <w:p>
@@ -118,10 +119,10 @@
                 <w:b/>
                 <w:bCs/>
               </w:rPr>
-              <w:t xml:space="preserve">Anexe os documentos do item VIII. </w:t>
-            </w:r>
-            <w:r>
-              <w:t xml:space="preserve">Baixe cada um da fonte oficial (TCU, DOU, Câmara). Onde a minuta diz "conforme noticiado", confira o dado no documento oficial e ajuste o texto se houver diferença.</w:t>
+              <w:t xml:space="preserve">Firma reconhecida </w:t>
+            </w:r>
+            <w:r>
+              <w:t xml:space="preserve">em cartório é obrigatória (Lei 1.079/1950, art. 16). Anexe RG, título de eleitor e certidão de quitação eleitoral, que comprova a cidadania (art. 14).</w:t>
             </w:r>
           </w:p>
           <w:p>
@@ -138,10 +139,10 @@
                 <w:b/>
                 <w:bCs/>
               </w:rPr>
-              <w:t xml:space="preserve">Prazo. </w:t>
-            </w:r>
-            <w:r>
-              <w:t xml:space="preserve">A denúncia só pode ser recebida enquanto o denunciado estiver no cargo (art. 15). O mandato em curso termina em 5 de janeiro de 2027 (CF, art. 82, na redação da EC 111/2021). Se houver recondução, há controvérsia sobre responsabilização por atos de mandato anterior.</w:t>
+              <w:t xml:space="preserve">Anexe os documentos do item VIII. </w:t>
+            </w:r>
+            <w:r>
+              <w:t xml:space="preserve">Baixe cada um da fonte oficial (TCU, DOU, Câmara). Onde a minuta diz "conforme noticiado", confira o dado no documento oficial e ajuste o texto se houver diferença.</w:t>
             </w:r>
           </w:p>
           <w:p>
@@ -158,10 +159,10 @@
                 <w:b/>
                 <w:bCs/>
               </w:rPr>
-              <w:t xml:space="preserve">Protocolo: </w:t>
-            </w:r>
-            <w:r>
-              <w:t xml:space="preserve">Secretaria-Geral da Mesa da Câmara dos Deputados, em Brasília. Confirme com a Câmara se há forma de protocolo à distância.</w:t>
+              <w:t xml:space="preserve">Prazo. </w:t>
+            </w:r>
+            <w:r>
+              <w:t xml:space="preserve">A denúncia só pode ser recebida enquanto o denunciado estiver no cargo (art. 15). O mandato em curso termina em 5 de janeiro de 2027 (CF, art. 82, na redação da EC 111/2021). Se houver recondução, há controvérsia sobre responsabilização por atos de mandato anterior.</w:t>
             </w:r>
           </w:p>
           <w:p>
@@ -178,10 +179,10 @@
                 <w:b/>
                 <w:bCs/>
               </w:rPr>
-              <w:t xml:space="preserve">Avaliação franca: </w:t>
-            </w:r>
-            <w:r>
-              <w:t xml:space="preserve">o TCU recomendou a aprovação, com ressalvas, das contas de 2023, 2024 e 2025, e pedidos anteriores sobre o Pé-de-Meia não prosperaram. A chance de recebimento é baixa. A denúncia continua sendo um exercício legítimo de cidadania, desde que se mantenha fiel aos documentos.</w:t>
+              <w:t xml:space="preserve">Protocolo: </w:t>
+            </w:r>
+            <w:r>
+              <w:t xml:space="preserve">Secretaria-Geral da Mesa da Câmara dos Deputados, em Brasília. Confirme com a Câmara se há forma de protocolo à distância.</w:t>
             </w:r>
           </w:p>
           <w:p>
@@ -198,10 +199,10 @@
                 <w:b/>
                 <w:bCs/>
               </w:rPr>
-              <w:t xml:space="preserve">Boa-fé: </w:t>
-            </w:r>
-            <w:r>
-              <w:t xml:space="preserve">não acrescente fatos sem prova nem amplie o que os documentos dizem. Imputar crime a alguém sabendo que é inocente é crime de denunciação caluniosa (CP, art. 339). Por isso a minuta traz, no item IV, os elementos favoráveis ao denunciado.</w:t>
+              <w:t xml:space="preserve">Avaliação franca: </w:t>
+            </w:r>
+            <w:r>
+              <w:t xml:space="preserve">o TCU recomendou a aprovação, com ressalvas, das contas de 2023, 2024 e 2025, e pedidos anteriores sobre o Pé-de-Meia não prosperaram. A chance de recebimento é baixa. A denúncia continua sendo um exercício legítimo de cidadania, desde que se mantenha fiel aos documentos.</w:t>
             </w:r>
           </w:p>
           <w:p>
@@ -218,10 +219,10 @@
                 <w:b/>
                 <w:bCs/>
               </w:rPr>
-              <w:t xml:space="preserve">Fato excluído: </w:t>
-            </w:r>
-            <w:r>
-              <w:t xml:space="preserve">a garantia da União ao empréstimo de R$ 12 bilhões aos Correios (TCU, Acórdão 1.359/2026) ficou de fora. O próprio relator registrou que a decisão não tem caráter punitivo e não há ato pessoal do Presidente identificado.</w:t>
+              <w:t xml:space="preserve">Boa-fé: </w:t>
+            </w:r>
+            <w:r>
+              <w:t xml:space="preserve">não acrescente fatos sem prova nem amplie o que os documentos dizem. Imputar crime a alguém sabendo que é inocente é crime de denunciação caluniosa (CP, art. 339). Por isso a minuta traz, no item IV, os elementos favoráveis ao denunciado.</w:t>
             </w:r>
           </w:p>
           <w:p>
@@ -238,10 +239,10 @@
                 <w:b/>
                 <w:bCs/>
               </w:rPr>
-              <w:t xml:space="preserve">Acórdão 2.261/2026 (item 8-A): </w:t>
-            </w:r>
-            <w:r>
-              <w:t xml:space="preserve">a identificação foi confirmada em registros do TCU: sessão extraordinária de 25/08/2026, Ata nº 32/2026, código AC-2261-32/26-P. O inteiro teor não pôde ser lido. A descrição do conteúdo vem de trechos da pesquisa do TCU. Leia o dispositivo completo antes de protocolar e ajuste os itens 8-A e 15 se ele disser algo diferente.</w:t>
+              <w:t xml:space="preserve">Fato excluído: </w:t>
+            </w:r>
+            <w:r>
+              <w:t xml:space="preserve">a garantia da União ao empréstimo de R$ 12 bilhões aos Correios (TCU, Acórdão 1.359/2026) ficou de fora. O próprio relator registrou que a decisão não tem caráter punitivo e não há ato pessoal do Presidente identificado.</w:t>
             </w:r>
           </w:p>
           <w:p>
@@ -258,10 +259,30 @@
                 <w:b/>
                 <w:bCs/>
               </w:rPr>
+              <w:t xml:space="preserve">Acórdão 2.261/2026 (item 8-A): </w:t>
+            </w:r>
+            <w:r>
+              <w:t xml:space="preserve">a identificação foi confirmada em registros do TCU: sessão extraordinária de 25/08/2026, Ata nº 32/2026, código AC-2261-32/26-P. O inteiro teor não pôde ser lido. A descrição do conteúdo vem de trechos da pesquisa do TCU e de reportagens do Poder360 e do Distrito News de 25/08/2026. Leia o dispositivo completo antes de protocolar e ajuste os itens 8-A e 15 se ele disser algo diferente.</w:t>
+            </w:r>
+          </w:p>
+          <w:p>
+            <w:pPr>
+              <w:pStyle w:val="ListParagraph"/>
+              <w:numPr>
+                <w:ilvl w:val="0"/>
+                <w:numId w:val="2"/>
+              </w:numPr>
+              <w:spacing w:after="80"/>
+            </w:pPr>
+            <w:r>
+              <w:rPr>
+                <w:b/>
+                <w:bCs/>
+              </w:rPr>
               <w:t xml:space="preserve">Contas de 2023: </w:t>
             </w:r>
             <w:r>
-              <w:t xml:space="preserve">o processo é o TC 010.005/2024-2. O número do acórdão não foi confirmado: há indício de que seja o Acórdão nº 1.106/2024-TCU-Plenário. Confira antes de citar.</w:t>
+              <w:t xml:space="preserve">o processo é o TC 010.005/2024-2, e o parecer foi enviado ao Congresso pelo Aviso nº 468-GP/TCU/2024. O número do acórdão não foi localizado. Há indício, não confirmado, de que seja o Acórdão nº 1.106/2024-TCU-Plenário.</w:t>
             </w:r>
           </w:p>
         </w:tc>
@@ -292,93 +313,13 @@
       </w:pPr>
       <w:r>
         <w:rPr>
-          <w:shd w:fill="FFF2A8" w:color="auto" w:val="clear"/>
-        </w:rPr>
-        <w:t xml:space="preserve">[NOME COMPLETO]</w:t>
-      </w:r>
-      <w:r>
-        <w:t xml:space="preserve">, brasileiro(a), </w:t>
-      </w:r>
-      <w:r>
-        <w:rPr>
-          <w:shd w:fill="FFF2A8" w:color="auto" w:val="clear"/>
-        </w:rPr>
-        <w:t xml:space="preserve">[estado civil]</w:t>
-      </w:r>
-      <w:r>
-        <w:t xml:space="preserve">, </w:t>
-      </w:r>
-      <w:r>
-        <w:rPr>
-          <w:shd w:fill="FFF2A8" w:color="auto" w:val="clear"/>
-        </w:rPr>
-        <w:t xml:space="preserve">[profissão]</w:t>
-      </w:r>
-      <w:r>
-        <w:t xml:space="preserve">, portador(a) da cédula de identidade RG nº </w:t>
-      </w:r>
-      <w:r>
-        <w:rPr>
-          <w:shd w:fill="FFF2A8" w:color="auto" w:val="clear"/>
-        </w:rPr>
-        <w:t xml:space="preserve">[____]</w:t>
-      </w:r>
-      <w:r>
-        <w:t xml:space="preserve">, inscrito(a) no CPF sob o nº </w:t>
-      </w:r>
-      <w:r>
-        <w:rPr>
-          <w:shd w:fill="FFF2A8" w:color="auto" w:val="clear"/>
-        </w:rPr>
-        <w:t xml:space="preserve">[____]</w:t>
-      </w:r>
-      <w:r>
-        <w:t xml:space="preserve">, eleitor(a) inscrito(a) sob o título nº </w:t>
-      </w:r>
-      <w:r>
-        <w:rPr>
-          <w:shd w:fill="FFF2A8" w:color="auto" w:val="clear"/>
-        </w:rPr>
-        <w:t xml:space="preserve">[____]</w:t>
-      </w:r>
-      <w:r>
-        <w:t xml:space="preserve">, Zona </w:t>
-      </w:r>
-      <w:r>
-        <w:rPr>
-          <w:shd w:fill="FFF2A8" w:color="auto" w:val="clear"/>
-        </w:rPr>
-        <w:t xml:space="preserve">[__]</w:t>
-      </w:r>
-      <w:r>
-        <w:t xml:space="preserve">, Seção </w:t>
-      </w:r>
-      <w:r>
-        <w:rPr>
-          <w:shd w:fill="FFF2A8" w:color="auto" w:val="clear"/>
-        </w:rPr>
-        <w:t xml:space="preserve">[__]</w:t>
-      </w:r>
-      <w:r>
-        <w:t xml:space="preserve">, residente e domiciliado(a) em </w:t>
-      </w:r>
-      <w:r>
-        <w:rPr>
-          <w:shd w:fill="FFF2A8" w:color="auto" w:val="clear"/>
-        </w:rPr>
-        <w:t xml:space="preserve">[endereço completo, CEP]</w:t>
-      </w:r>
-      <w:r>
-        <w:t xml:space="preserve">, endereço eletrônico </w:t>
-      </w:r>
-      <w:r>
-        <w:rPr>
-          <w:shd w:fill="FFF2A8" w:color="auto" w:val="clear"/>
-        </w:rPr>
-        <w:t xml:space="preserve">[e-mail]</w:t>
-      </w:r>
-      <w:r>
-        <w:t xml:space="preserve">, no pleno gozo de seus direitos políticos, vem respeitosamente, com fundamento nos arts. 85, VI e VII, e 86 da Constituição Federal e nos arts. 14 a 16 da Lei nº 1.079, de 10 de abril de 1950, apresentar</w:t>
+          <w:b/>
+          <w:bCs/>
+        </w:rPr>
+        <w:t xml:space="preserve">ANÔNIMO</w:t>
+      </w:r>
+      <w:r>
+        <w:t xml:space="preserve"> (denunciante que optou por não se identificar), vem respeitosamente, com fundamento nos arts. 85, VI e VII, e 86 da Constituição Federal e nos arts. 14 a 16 da Lei nº 1.079, de 10 de abril de 1950, apresentar</w:t>
       </w:r>
     </w:p>
     <w:p>
@@ -430,7 +371,13 @@
         <w:jc w:val="both"/>
       </w:pPr>
       <w:r>
-        <w:t xml:space="preserve">1. Qualquer cidadão pode denunciar o Presidente da República perante a Câmara dos Deputados por crime de responsabilidade (Lei nº 1.079/1950, art. 14). A condição de cidadão do denunciante está comprovada pelos documentos anexos (Doc. 1).</w:t>
+        <w:t xml:space="preserve">1. Qualquer cidadão pode denunciar o Presidente da República perante a Câmara dos Deputados por crime de responsabilidade (Lei nº 1.079/1950, art. 14). </w:t>
+      </w:r>
+      <w:r>
+        <w:rPr>
+          <w:shd w:fill="FFF2A8" w:color="auto" w:val="clear"/>
+        </w:rPr>
+        <w:t xml:space="preserve">[Denúncia apresentada como anônima: sem identificação do cidadão denunciante e sem firma reconhecida, os requisitos dos arts. 14 e 16 não são atendidos.]</w:t>
       </w:r>
     </w:p>
     <w:p>
@@ -516,7 +463,7 @@
         <w:jc w:val="both"/>
       </w:pPr>
       <w:r>
-        <w:t xml:space="preserve">8. Em 12 de fevereiro de 2025, o Plenário deu provimento parcial ao agravo da Advocacia-Geral da União e revogou a cautelar (Acórdão nº 297/2025-TCU-Plenário, Doc. 3). Fundamentou-se no perigo da demora reverso e nos impactos sociais da interrupção do programa, e reservou para momento posterior a análise de mérito. O Tribunal autorizou, de forma provisória e excepcional, a continuidade dos pagamentos com recursos do Fipem e fixou prazo de 120 dias para que o Poder Executivo adequasse o financiamento às normas orçamentárias e de responsabilidade fiscal. Segundo o relatório desse acórdão, o custo anual estimado do programa é de R$ 12,5 bilhões, enquanto o Projeto de Lei Orçamentária de 2025 previa apenas R$ 1 bilhão. O Executivo enviou ao Congresso o PLN nº 5/2025, que propõe crédito suplementar de R$ 686 milhões ao Ministério da Educação para o programa (Doc. 8).</w:t>
+        <w:t xml:space="preserve">8. Em 12 de fevereiro de 2025, o Plenário deu provimento parcial ao agravo da Advocacia-Geral da União e revogou a cautelar (Acórdão nº 297/2025-TCU-Plenário, Doc. 3). Fundamentou-se no perigo da demora reverso e nos impactos sociais da interrupção do programa, e reservou para momento posterior a análise de mérito. O Tribunal autorizou, de forma provisória e excepcional, a continuidade dos pagamentos com recursos do Fipem e fixou prazo de 120 dias para que o Poder Executivo adequasse o financiamento às normas orçamentárias e de responsabilidade fiscal. Segundo o relatório desse acórdão, o custo anual estimado do programa é de R$ 12,5 bilhões, enquanto o Projeto de Lei Orçamentária de 2025 previa apenas R$ 1 bilhão. O Executivo enviou ao Congresso o PLN nº 5/2025 (Mensagem nº 778, de 24/06/2025), com crédito suplementar de R$ 685,9 milhões ao Ministério da Educação para o programa, e depois solicitou a sua retirada de tramitação (Mensagem nº 1.712/2025) (Doc. 8).</w:t>
       </w:r>
     </w:p>
     <w:p>
@@ -526,7 +473,7 @@
         <w:jc w:val="both"/>
       </w:pPr>
       <w:r>
-        <w:t xml:space="preserve">8-A. Em 25 de agosto de 2026, em sessão extraordinária, o Plenário do TCU proferiu por unanimidade, no mesmo processo, o Acórdão nº 2.261/2026-TCU-Plenário (Doc. 3-A). O processo é uma representação do Ministério Público junto ao TCU, com relatoria do Ministro Augusto Nardes e revisão do Ministro Odair Cunha. Segundo os registros de pesquisa do TCU, o sumário da decisão aponta indícios de descumprimento de princípios e normas constitucionais e legais de finanças públicas no arranjo orçamentário e financeiro do Programa. O Tribunal, ainda assim, autorizou excepcionalmente a execução temporária do programa. </w:t>
+        <w:t xml:space="preserve">8-A. Em 25 de agosto de 2026, em sessão extraordinária, o Plenário do TCU proferiu por unanimidade, no mesmo processo, o Acórdão nº 2.261/2026-TCU-Plenário (Doc. 3-A). O processo é uma representação do Ministério Público junto ao TCU, com relatoria do Ministro Augusto Nardes e revisão do Ministro Odair Cunha. Segundo os registros de pesquisa do TCU, o sumário da decisão aponta indícios de descumprimento de princípios e normas constitucionais e legais de finanças públicas no arranjo orçamentário e financeiro do Programa. O Tribunal, ainda assim, autorizou excepcionalmente a execução temporária do programa. Segundo a imprensa, na mesma sessão o relator acolheu proposta do revisor para juntar o processo ao TC 025.632/2024-8, auditoria operacional sobre gastos fora do Orçamento (relator Min. Bruno Dantas), e não houve decisão definitiva de mérito. Nessa auditoria, o Acórdão nº 1.372/2026-TCU-Plenário (27/05/2026) já havia determinado medidas de transparência aos gestores de fundos e a apresentação de relatório em 180 dias. </w:t>
       </w:r>
       <w:r>
         <w:rPr>
@@ -560,7 +507,7 @@
         <w:t xml:space="preserve">irregularidade</w:t>
       </w:r>
       <w:r>
-        <w:t xml:space="preserve"> a concessão ou ampliação de benefícios tributários, por meio de renúncia de receita, sem observância das exigências legais. Segundo o Tribunal, o Poder Executivo deixou de atender dispositivos da Lei de Diretrizes Orçamentárias, entre eles a apresentação de memórias de cálculo detalhadas das estimativas de renúncia. Conforme noticiado, foram instituídas 23 desonerações por 19 atos normativos em 2024, e parte delas não atendeu aos requisitos da Lei de Responsabilidade Fiscal (art. 14), da LDO e da Constituição. </w:t>
+        <w:t xml:space="preserve"> a concessão ou ampliação de benefícios tributários, por meio de renúncia de receita, sem observância das exigências legais. Segundo o Tribunal, o Poder Executivo deixou de atender dispositivos da Lei de Diretrizes Orçamentárias, entre eles a apresentação de memórias de cálculo detalhadas das estimativas de renúncia. Conforme noticiado, foram instituídas 23 desonerações por 19 atos normativos em 2024, e parte delas não atendeu aos requisitos da Lei de Responsabilidade Fiscal (art. 14), da LDO e da Constituição. Segundo a imprensa, o TCU identificou nove leis nessa situação, entre elas as relativas ao Perse e ao setor de semicondutores. </w:t>
       </w:r>
       <w:r>
         <w:rPr>
@@ -688,7 +635,7 @@
         <w:jc w:val="both"/>
       </w:pPr>
       <w:r>
-        <w:t xml:space="preserve">O TCU recomendou, por unanimidade, a aprovação com ressalvas das Contas do Presidente da República dos exercícios de 2023 (TC 010.005/2024-2), 2024 (Acórdão nº 1.326/2025-TCU-Plenário) e 2025 (Acórdão nº 1.442/2026-TCU-Plenário, TC 005.405/2026-2), sem recomendar a rejeição de nenhuma delas (Doc. 6 e 9).</w:t>
+        <w:t xml:space="preserve">O TCU recomendou, por unanimidade, a aprovação com ressalvas das Contas do Presidente da República dos exercícios de 2023 (TC 010.005/2024-2; Aviso nº 468-GP/TCU/2024), 2024 (Acórdão nº 1.326/2025-TCU-Plenário) e 2025 (Acórdão nº 1.442/2026-TCU-Plenário, TC 005.405/2026-2), sem recomendar a rejeição de nenhuma delas (Doc. 6 e 9).</w:t>
       </w:r>
     </w:p>
     <w:p>
@@ -702,7 +649,7 @@
         <w:jc w:val="both"/>
       </w:pPr>
       <w:r>
-        <w:t xml:space="preserve">No Fato 1, as transferências ao Fipem tiveram amparo em leis aprovadas pelo Congresso Nacional. A decisão do TCU foi cautelar, sem julgamento de mérito, e foi revogada pelo Acórdão nº 297/2025-TCU-Plenário. O Executivo apresentou proposta de regularização (PLN nº 5/2025), e a Advocacia-Geral da União sustenta a legalidade das transferências e o cumprimento da determinação de iniciar o processo legislativo. Para 2026, conforme noticiado, o programa foi incluído na proposta orçamentária com previsão de cerca de R$ 12 bilhões, valor reduzido para cerca de R$ 11,4 bilhões na tramitação no Congresso. Mesmo no Acórdão nº 2.261/2026, o TCU manteve a autorização para a execução do programa.</w:t>
+        <w:t xml:space="preserve">No Fato 1, as transferências ao Fipem tiveram amparo em leis aprovadas pelo Congresso Nacional. A decisão do TCU foi cautelar, sem julgamento de mérito, e foi revogada pelo Acórdão nº 297/2025-TCU-Plenário. O Executivo chegou a apresentar proposta de regularização (PLN nº 5/2025), depois retirada, e a Advocacia-Geral da União sustenta a legalidade das transferências e o cumprimento da determinação de iniciar o processo legislativo. Para 2026, a Lei Orçamentária sancionada reservou R$ 11,47 bilhões ao programa, segundo a Agência Câmara. No Acórdão nº 2.261/2026, o TCU manteve a autorização para a execução do programa e, segundo a imprensa, não proferiu decisão definitiva de mérito.</w:t>
       </w:r>
     </w:p>
     <w:p>
@@ -918,7 +865,7 @@
         <w:jc w:val="both"/>
       </w:pPr>
       <w:r>
-        <w:t xml:space="preserve">Doc. 1: documento de identidade, título de eleitor e certidão de quitação eleitoral do denunciante.</w:t>
+        <w:t xml:space="preserve">Doc. 1: documentos de identificação do denunciante (não apresentados: denúncia anônima).</w:t>
       </w:r>
     </w:p>
     <w:p>
@@ -974,6 +921,20 @@
         <w:jc w:val="both"/>
       </w:pPr>
       <w:r>
+        <w:t xml:space="preserve">Doc. 3-B: Acórdão nº 1.372/2026-TCU-Plenário (TC 025.632/2024-8), de 27/05/2026, auditoria sobre gastos fora do Orçamento.</w:t>
+      </w:r>
+    </w:p>
+    <w:p>
+      <w:pPr>
+        <w:pStyle w:val="ListParagraph"/>
+        <w:numPr>
+          <w:ilvl w:val="0"/>
+          <w:numId w:val="4"/>
+        </w:numPr>
+        <w:spacing w:after="100" w:line="340"/>
+        <w:jc w:val="both"/>
+      </w:pPr>
+      <w:r>
         <w:t xml:space="preserve">Doc. 4: Lei nº 14.818, de 16 de janeiro de 2024 (DOU).</w:t>
       </w:r>
     </w:p>
@@ -1030,7 +991,7 @@
         <w:jc w:val="both"/>
       </w:pPr>
       <w:r>
-        <w:t xml:space="preserve">Doc. 8: PLN nº 5/2025 (Congresso Nacional).</w:t>
+        <w:t xml:space="preserve">Doc. 8: PLN nº 5/2025 e Mensagens nº 778/2025 (envio) e nº 1.712/2025 (pedido de retirada).</w:t>
       </w:r>
     </w:p>
     <w:p>
@@ -1044,13 +1005,27 @@
         <w:jc w:val="both"/>
       </w:pPr>
       <w:r>
-        <w:t xml:space="preserve">Doc. 9: pareceres prévios sobre as contas de 2023 (TC 010.005/2024-2, </w:t>
+        <w:t xml:space="preserve">Doc. 8-A: notícia da Agência Câmara sobre a Lei Orçamentária de 2026 sancionada (Pé-de-Meia: R$ 11,47 bilhões).</w:t>
+      </w:r>
+    </w:p>
+    <w:p>
+      <w:pPr>
+        <w:pStyle w:val="ListParagraph"/>
+        <w:numPr>
+          <w:ilvl w:val="0"/>
+          <w:numId w:val="4"/>
+        </w:numPr>
+        <w:spacing w:after="100" w:line="340"/>
+        <w:jc w:val="both"/>
+      </w:pPr>
+      <w:r>
+        <w:t xml:space="preserve">Doc. 9: pareceres prévios sobre as contas de 2023 (TC 010.005/2024-2; Aviso nº 468-GP/TCU/2024; </w:t>
       </w:r>
       <w:r>
         <w:rPr>
           <w:shd w:fill="FFF2A8" w:color="auto" w:val="clear"/>
         </w:rPr>
-        <w:t xml:space="preserve">acórdão a confirmar</w:t>
+        <w:t xml:space="preserve">nº do acórdão não localizado</w:t>
       </w:r>
       <w:r>
         <w:t xml:space="preserve">) e de 2025 (Acórdão nº 1.442/2026-TCU-Plenário, TC 005.405/2026-2).</w:t>
@@ -1210,9 +1185,10 @@
       </w:pPr>
       <w:r>
         <w:rPr>
-          <w:shd w:fill="FFF2A8" w:color="auto" w:val="clear"/>
-        </w:rPr>
-        <w:t xml:space="preserve">[NOME COMPLETO DO DENUNCIANTE]</w:t>
+          <w:b/>
+          <w:bCs/>
+        </w:rPr>
+        <w:t xml:space="preserve">ANÔNIMO</w:t>
       </w:r>
     </w:p>
     <w:p>
@@ -1225,7 +1201,7 @@
           <w:i/>
           <w:iCs/>
         </w:rPr>
-        <w:t xml:space="preserve">(assinatura com firma reconhecida)</w:t>
+        <w:t xml:space="preserve">(denunciante não identificado)</w:t>
       </w:r>
     </w:p>
     <w:p>
@@ -2090,7 +2066,7 @@
                 <w:sz w:val="18"/>
                 <w:szCs w:val="18"/>
               </w:rPr>
-              <w:t xml:space="preserve">Identificação confirmada; conteúdo por trechos da pesquisa do TCU; ler o inteiro teor</w:t>
+              <w:t xml:space="preserve">Identificação confirmada; conteúdo por trechos do TCU e imprensa (25/08/2026); sem decisão definitiva de mérito</w:t>
             </w:r>
           </w:p>
         </w:tc>
@@ -2122,7 +2098,7 @@
                 <w:sz w:val="18"/>
                 <w:szCs w:val="18"/>
               </w:rPr>
-              <w:t xml:space="preserve">Programa autorizado; incluído no Orçamento de 2026</w:t>
+              <w:t xml:space="preserve">Programa autorizado; processo juntado à auditoria TC 025.632/2024-8; LOA 2026 com R$ 11,47 bi</w:t>
             </w:r>
           </w:p>
         </w:tc>
@@ -2478,7 +2454,7 @@
                 <w:sz w:val="18"/>
                 <w:szCs w:val="18"/>
               </w:rPr>
-              <w:t xml:space="preserve">2023: TC 010.005/2024-2 (acórdão a confirmar)</w:t>
+              <w:t xml:space="preserve">2023: TC 010.005/2024-2 (Aviso 468-GP/TCU/2024)</w:t>
             </w:r>
           </w:p>
           <w:p>
@@ -2609,7 +2585,7 @@
         </w:rPr>
         <w:t xml:space="preserve">TCU – Pé-de-Meia (notícia oficial): </w:t>
       </w:r>
-      <w:hyperlink w:history="1" r:id="rIdkiqcxgdc4yi-hm0x9-onj">
+      <w:hyperlink w:history="1" r:id="rIdvz_ft_p8abyxtpo2nvafu">
         <w:r>
           <w:rPr>
             <w:rStyle w:val="Hyperlink"/>
@@ -2636,7 +2612,7 @@
         </w:rPr>
         <w:t xml:space="preserve">TCU – Acórdão 61/2025 (cópia publicada pelo Poder360): </w:t>
       </w:r>
-      <w:hyperlink w:history="1" r:id="rIdt2nekf69_2atkay4kgeu9">
+      <w:hyperlink w:history="1" r:id="rIdgsi5dukq5znb2sfzud9_q">
         <w:r>
           <w:rPr>
             <w:rStyle w:val="Hyperlink"/>
@@ -2663,7 +2639,7 @@
         </w:rPr>
         <w:t xml:space="preserve">AGU – recurso contra a cautelar (cópia publicada pelo Poder360): </w:t>
       </w:r>
-      <w:hyperlink w:history="1" r:id="rId7vc20wy8n51sa21cvsqjo">
+      <w:hyperlink w:history="1" r:id="rId614y-cosypakpaxzudqu_">
         <w:r>
           <w:rPr>
             <w:rStyle w:val="Hyperlink"/>
@@ -2690,7 +2666,7 @@
         </w:rPr>
         <w:t xml:space="preserve">Lei 14.818/2024 – Câmara dos Deputados: </w:t>
       </w:r>
-      <w:hyperlink w:history="1" r:id="rId0tbqf4t-yn2klie1nzugl">
+      <w:hyperlink w:history="1" r:id="rIdhkuprfwdkp2ksj5ppm5fl">
         <w:r>
           <w:rPr>
             <w:rStyle w:val="Hyperlink"/>
@@ -2717,7 +2693,7 @@
         </w:rPr>
         <w:t xml:space="preserve">TCU dá 120 dias – InfoMoney: </w:t>
       </w:r>
-      <w:hyperlink w:history="1" r:id="rId1eobuxw8gczy53o9nnp77">
+      <w:hyperlink w:history="1" r:id="rIdy1_kgyynw_b7ckfcqtkss">
         <w:r>
           <w:rPr>
             <w:rStyle w:val="Hyperlink"/>
@@ -2744,7 +2720,7 @@
         </w:rPr>
         <w:t xml:space="preserve">PLN 5/2025 – Agência Câmara: </w:t>
       </w:r>
-      <w:hyperlink w:history="1" r:id="rIdcmtpmguzcoq7vyalyn67l">
+      <w:hyperlink w:history="1" r:id="rIdvbrajvz9gfyfiehsabzo1">
         <w:r>
           <w:rPr>
             <w:rStyle w:val="Hyperlink"/>
@@ -2771,7 +2747,7 @@
         </w:rPr>
         <w:t xml:space="preserve">Lei 14.995/2024 – Planalto: </w:t>
       </w:r>
-      <w:hyperlink w:history="1" r:id="rIdvwoablhm6emxl1zgeia7p">
+      <w:hyperlink w:history="1" r:id="rIdd3wcguhveggvoairmzfa4">
         <w:r>
           <w:rPr>
             <w:rStyle w:val="Hyperlink"/>
@@ -2798,7 +2774,7 @@
         </w:rPr>
         <w:t xml:space="preserve">Lei 15.076/2024 – Planalto: </w:t>
       </w:r>
-      <w:hyperlink w:history="1" r:id="rIdcfmqc7wnewknxfm7ffb60">
+      <w:hyperlink w:history="1" r:id="rIdebqc8vsp8c7avxwvspvwq">
         <w:r>
           <w:rPr>
             <w:rStyle w:val="Hyperlink"/>
@@ -2825,7 +2801,7 @@
         </w:rPr>
         <w:t xml:space="preserve">TCU – notícia oficial do Acórdão 297/2025 (prazo de 120 dias): </w:t>
       </w:r>
-      <w:hyperlink w:history="1" r:id="rIdro1bn-fspsmj2yspvwdnj">
+      <w:hyperlink w:history="1" r:id="rIdoepwatzfdtr3dwc1tu42l">
         <w:r>
           <w:rPr>
             <w:rStyle w:val="Hyperlink"/>
@@ -2852,7 +2828,7 @@
         </w:rPr>
         <w:t xml:space="preserve">TCU – Aviso 902/2025 à Câmara (cita o Acórdão 297/2025): </w:t>
       </w:r>
-      <w:hyperlink w:history="1" r:id="rIdgkiuwlx-x3yinlm_lnfd3">
+      <w:hyperlink w:history="1" r:id="rIdqrezkmiplqoxohed6nves">
         <w:r>
           <w:rPr>
             <w:rStyle w:val="Hyperlink"/>
@@ -2879,7 +2855,7 @@
         </w:rPr>
         <w:t xml:space="preserve">TCU – pauta do Plenário com o TC 024.312/2024-0 (agosto/2026): </w:t>
       </w:r>
-      <w:hyperlink w:history="1" r:id="rId6vt0vfyubnktfcpsbn4fx">
+      <w:hyperlink w:history="1" r:id="rIdczwpbaqnf1x3jd3fknzmv">
         <w:r>
           <w:rPr>
             <w:rStyle w:val="Hyperlink"/>
@@ -2904,9 +2880,252 @@
           <w:sz w:val="20"/>
           <w:szCs w:val="20"/>
         </w:rPr>
+        <w:t xml:space="preserve">Poder360 – Ministros do TCU questionam “desorçamentação” (25/08/2026): </w:t>
+      </w:r>
+      <w:hyperlink w:history="1" r:id="rIdlqcjjzh3q-yg01zwcs7yz">
+        <w:r>
+          <w:rPr>
+            <w:rStyle w:val="Hyperlink"/>
+            <w:sz w:val="18"/>
+            <w:szCs w:val="18"/>
+          </w:rPr>
+          <w:t xml:space="preserve">https://www.poder360.com.br/poder-governo/ministros-do-tcu-questionam-desorcamentacao-em-pe-de-meia-e-desenrola/</w:t>
+        </w:r>
+      </w:hyperlink>
+    </w:p>
+    <w:p>
+      <w:pPr>
+        <w:pStyle w:val="ListParagraph"/>
+        <w:numPr>
+          <w:ilvl w:val="0"/>
+          <w:numId w:val="5"/>
+        </w:numPr>
+        <w:spacing w:after="60"/>
+      </w:pPr>
+      <w:r>
+        <w:rPr>
+          <w:sz w:val="20"/>
+          <w:szCs w:val="20"/>
+        </w:rPr>
+        <w:t xml:space="preserve">Distrito News – TCU critica gasto fora do Orçamento (25/08/2026): </w:t>
+      </w:r>
+      <w:hyperlink w:history="1" r:id="rIdev9unjgfdv5gfvrtopkes">
+        <w:r>
+          <w:rPr>
+            <w:rStyle w:val="Hyperlink"/>
+            <w:sz w:val="18"/>
+            <w:szCs w:val="18"/>
+          </w:rPr>
+          <w:t xml:space="preserve">https://distritonews.com/economia/tcu-desorcamentacao-pe-de-meia-desenrola-fipem-fgo-25-agosto-2026</w:t>
+        </w:r>
+      </w:hyperlink>
+    </w:p>
+    <w:p>
+      <w:pPr>
+        <w:pStyle w:val="ListParagraph"/>
+        <w:numPr>
+          <w:ilvl w:val="0"/>
+          <w:numId w:val="5"/>
+        </w:numPr>
+        <w:spacing w:after="60"/>
+      </w:pPr>
+      <w:r>
+        <w:rPr>
+          <w:sz w:val="20"/>
+          <w:szCs w:val="20"/>
+        </w:rPr>
+        <w:t xml:space="preserve">TCU – auditoria de gastos fora do Orçamento (TC 025.632/2024-8): </w:t>
+      </w:r>
+      <w:hyperlink w:history="1" r:id="rIdyva032zlmpygagwncstgd">
+        <w:r>
+          <w:rPr>
+            <w:rStyle w:val="Hyperlink"/>
+            <w:sz w:val="18"/>
+            <w:szCs w:val="18"/>
+          </w:rPr>
+          <w:t xml:space="preserve">https://portal.tcu.gov.br/imprensa/noticias/tribunal-examina-mecanismos-de-gastos-de-fundos-fora-do-orcamento-geral-da-uniao</w:t>
+        </w:r>
+      </w:hyperlink>
+    </w:p>
+    <w:p>
+      <w:pPr>
+        <w:pStyle w:val="ListParagraph"/>
+        <w:numPr>
+          <w:ilvl w:val="0"/>
+          <w:numId w:val="5"/>
+        </w:numPr>
+        <w:spacing w:after="60"/>
+      </w:pPr>
+      <w:r>
+        <w:rPr>
+          <w:sz w:val="20"/>
+          <w:szCs w:val="20"/>
+        </w:rPr>
+        <w:t xml:space="preserve">Planalto – Mensagem nº 778/2025 (envio do PLN 5/2025): </w:t>
+      </w:r>
+      <w:hyperlink w:history="1" r:id="rIdthfmbbcwkiud_9fu-opgo">
+        <w:r>
+          <w:rPr>
+            <w:rStyle w:val="Hyperlink"/>
+            <w:sz w:val="18"/>
+            <w:szCs w:val="18"/>
+          </w:rPr>
+          <w:t xml:space="preserve">https://www.planalto.gov.br/ccivil_03/projetos/ato_2023_2026/2025/pln/msg/msg-0778-25.doc</w:t>
+        </w:r>
+      </w:hyperlink>
+    </w:p>
+    <w:p>
+      <w:pPr>
+        <w:pStyle w:val="ListParagraph"/>
+        <w:numPr>
+          <w:ilvl w:val="0"/>
+          <w:numId w:val="5"/>
+        </w:numPr>
+        <w:spacing w:after="60"/>
+      </w:pPr>
+      <w:r>
+        <w:rPr>
+          <w:sz w:val="20"/>
+          <w:szCs w:val="20"/>
+        </w:rPr>
+        <w:t xml:space="preserve">Planalto – Mensagem nº 1.712/2025 (retirada do PLN 5/2025): </w:t>
+      </w:r>
+      <w:hyperlink w:history="1" r:id="rIddest6yhpwzg6xexgxhpzh">
+        <w:r>
+          <w:rPr>
+            <w:rStyle w:val="Hyperlink"/>
+            <w:sz w:val="18"/>
+            <w:szCs w:val="18"/>
+          </w:rPr>
+          <w:t xml:space="preserve">https://www.planalto.gov.br/ccivil_03/projetos/ato_2023_2026/2025/pln/msg/msg-1712-25.doc</w:t>
+        </w:r>
+      </w:hyperlink>
+    </w:p>
+    <w:p>
+      <w:pPr>
+        <w:pStyle w:val="ListParagraph"/>
+        <w:numPr>
+          <w:ilvl w:val="0"/>
+          <w:numId w:val="5"/>
+        </w:numPr>
+        <w:spacing w:after="60"/>
+      </w:pPr>
+      <w:r>
+        <w:rPr>
+          <w:sz w:val="20"/>
+          <w:szCs w:val="20"/>
+        </w:rPr>
+        <w:t xml:space="preserve">Agência Câmara – Orçamento 2026 sancionado (Pé-de-Meia: R$ 11,47 bi): </w:t>
+      </w:r>
+      <w:hyperlink w:history="1" r:id="rIdwiyegxxtzmsduvyuufv7m">
+        <w:r>
+          <w:rPr>
+            <w:rStyle w:val="Hyperlink"/>
+            <w:sz w:val="18"/>
+            <w:szCs w:val="18"/>
+          </w:rPr>
+          <w:t xml:space="preserve">https://www.camara.leg.br/noticias/1238564-orcamento-2026-e-sancionado-com-veto-a-r-400-milhoes-em-emendas/</w:t>
+        </w:r>
+      </w:hyperlink>
+    </w:p>
+    <w:p>
+      <w:pPr>
+        <w:pStyle w:val="ListParagraph"/>
+        <w:numPr>
+          <w:ilvl w:val="0"/>
+          <w:numId w:val="5"/>
+        </w:numPr>
+        <w:spacing w:after="60"/>
+      </w:pPr>
+      <w:r>
+        <w:rPr>
+          <w:sz w:val="20"/>
+          <w:szCs w:val="20"/>
+        </w:rPr>
+        <w:t xml:space="preserve">Congresso Nacional – Contas da Presidência (Aviso 468-GP/TCU/2024): </w:t>
+      </w:r>
+      <w:hyperlink w:history="1" r:id="rIdq2gqzpfwapzr9satq1sld">
+        <w:r>
+          <w:rPr>
+            <w:rStyle w:val="Hyperlink"/>
+            <w:sz w:val="18"/>
+            <w:szCs w:val="18"/>
+          </w:rPr>
+          <w:t xml:space="preserve">https://www.congressonacional.leg.br/materias/materias-orcamentarias/contas-da-presidencia</w:t>
+        </w:r>
+      </w:hyperlink>
+    </w:p>
+    <w:p>
+      <w:pPr>
+        <w:pStyle w:val="ListParagraph"/>
+        <w:numPr>
+          <w:ilvl w:val="0"/>
+          <w:numId w:val="5"/>
+        </w:numPr>
+        <w:spacing w:after="60"/>
+      </w:pPr>
+      <w:r>
+        <w:rPr>
+          <w:sz w:val="20"/>
+          <w:szCs w:val="20"/>
+        </w:rPr>
+        <w:t xml:space="preserve">Exame – nove leis com benefícios sem requisitos (contas 2024): </w:t>
+      </w:r>
+      <w:hyperlink w:history="1" r:id="rIdtuj_ohv6mfajouhyt3s0b">
+        <w:r>
+          <w:rPr>
+            <w:rStyle w:val="Hyperlink"/>
+            <w:sz w:val="18"/>
+            <w:szCs w:val="18"/>
+          </w:rPr>
+          <w:t xml:space="preserve">https://exame.com/economia/tcu-aprova-com-ressalvas-contas-de-2024-do-governo-lula-e-alerta-para-renuncias-fiscais/</w:t>
+        </w:r>
+      </w:hyperlink>
+    </w:p>
+    <w:p>
+      <w:pPr>
+        <w:pStyle w:val="ListParagraph"/>
+        <w:numPr>
+          <w:ilvl w:val="0"/>
+          <w:numId w:val="5"/>
+        </w:numPr>
+        <w:spacing w:after="60"/>
+      </w:pPr>
+      <w:r>
+        <w:rPr>
+          <w:sz w:val="20"/>
+          <w:szCs w:val="20"/>
+        </w:rPr>
+        <w:t xml:space="preserve">Contábeis – 23 desonerações por 19 atos (contas 2024): </w:t>
+      </w:r>
+      <w:hyperlink w:history="1" r:id="rIdztozhxzjlpgevfuhyrojg">
+        <w:r>
+          <w:rPr>
+            <w:rStyle w:val="Hyperlink"/>
+            <w:sz w:val="18"/>
+            <w:szCs w:val="18"/>
+          </w:rPr>
+          <w:t xml:space="preserve">https://www.contabeis.com.br/noticias/71308/tcu-aprova-contas-de-2024-com-ressalvas-e-alerta-fiscal/</w:t>
+        </w:r>
+      </w:hyperlink>
+    </w:p>
+    <w:p>
+      <w:pPr>
+        <w:pStyle w:val="ListParagraph"/>
+        <w:numPr>
+          <w:ilvl w:val="0"/>
+          <w:numId w:val="5"/>
+        </w:numPr>
+        <w:spacing w:after="60"/>
+      </w:pPr>
+      <w:r>
+        <w:rPr>
+          <w:sz w:val="20"/>
+          <w:szCs w:val="20"/>
+        </w:rPr>
         <w:t xml:space="preserve">Orçamento de 2026 e Pé-de-Meia – DGABC: </w:t>
       </w:r>
-      <w:hyperlink w:history="1" r:id="rIdf99pjcpvo9sgph87hzobi">
+      <w:hyperlink w:history="1" r:id="rIdezonckt5g8owuenofgvba">
         <w:r>
           <w:rPr>
             <w:rStyle w:val="Hyperlink"/>
@@ -2933,7 +3152,7 @@
         </w:rPr>
         <w:t xml:space="preserve">Orçamento de 2026 após o Congresso – Correio Braziliense (25/12/2025): </w:t>
       </w:r>
-      <w:hyperlink w:history="1" r:id="rIdkutox_vgdrjy9i9w0fevf">
+      <w:hyperlink w:history="1" r:id="rIdowtnj_ohppcqdolfoznta">
         <w:r>
           <w:rPr>
             <w:rStyle w:val="Hyperlink"/>
@@ -2960,7 +3179,7 @@
         </w:rPr>
         <w:t xml:space="preserve">TCU – Acórdão 1.326/2025 (Contas 2024): </w:t>
       </w:r>
-      <w:hyperlink w:history="1" r:id="rIdmb3nwd8d3nzdknwgcjlv3">
+      <w:hyperlink w:history="1" r:id="rIdzm2swjl6smow_aeflzjms">
         <w:r>
           <w:rPr>
             <w:rStyle w:val="Hyperlink"/>
@@ -2987,7 +3206,7 @@
         </w:rPr>
         <w:t xml:space="preserve">TCU – Voto do relator, Contas 2023 (TC 010.005/2024-2): </w:t>
       </w:r>
-      <w:hyperlink w:history="1" r:id="rIdul6xbmaxuchyshmhjfdiu">
+      <w:hyperlink w:history="1" r:id="rIdqssiykp1cbakpcqt-iqgl">
         <w:r>
           <w:rPr>
             <w:rStyle w:val="Hyperlink"/>
@@ -3014,7 +3233,7 @@
         </w:rPr>
         <w:t xml:space="preserve">TCU – Contas do Presidente 2024: </w:t>
       </w:r>
-      <w:hyperlink w:history="1" r:id="rIdwwqnrscmryqzv6kwv4hl3">
+      <w:hyperlink w:history="1" r:id="rIdau1n3pxymks5budddzgg8">
         <w:r>
           <w:rPr>
             <w:rStyle w:val="Hyperlink"/>
@@ -3041,7 +3260,7 @@
         </w:rPr>
         <w:t xml:space="preserve">Contas 2024, renúncias – Exame: </w:t>
       </w:r>
-      <w:hyperlink w:history="1" r:id="rIdljhctlp7cn7wgzggixjl9">
+      <w:hyperlink w:history="1" r:id="rId8kh1lpbub-beg7y8icvb-">
         <w:r>
           <w:rPr>
             <w:rStyle w:val="Hyperlink"/>
@@ -3068,7 +3287,7 @@
         </w:rPr>
         <w:t xml:space="preserve">Contas 2024, irregularidade – CNN Brasil: </w:t>
       </w:r>
-      <w:hyperlink w:history="1" r:id="rIdnfsakau9kf8gdkdhouqt-">
+      <w:hyperlink w:history="1" r:id="rIdh8480fxpkkiq-bxu-bmrp">
         <w:r>
           <w:rPr>
             <w:rStyle w:val="Hyperlink"/>
@@ -3095,7 +3314,7 @@
         </w:rPr>
         <w:t xml:space="preserve">TCU – Contas do Presidente 2023: </w:t>
       </w:r>
-      <w:hyperlink w:history="1" r:id="rIdaltc5m5yh4_i8hv02-orz">
+      <w:hyperlink w:history="1" r:id="rIdyduidnzwkqfu457sda0-s">
         <w:r>
           <w:rPr>
             <w:rStyle w:val="Hyperlink"/>
@@ -3122,7 +3341,7 @@
         </w:rPr>
         <w:t xml:space="preserve">TCU – Acórdão 1.442/2026 (Contas 2025): </w:t>
       </w:r>
-      <w:hyperlink w:history="1" r:id="rIdqy0ujivxlf05sgh-x6sfa">
+      <w:hyperlink w:history="1" r:id="rIdnxblvyukhmrzdcbnoi8sv">
         <w:r>
           <w:rPr>
             <w:rStyle w:val="Hyperlink"/>

</xml_diff>

<commit_message>
Verifica leis de 2024 (Perse e semicondutores), mensagem de veto 1.060/2024, total de pedidos e regras de anonimato; adiciona pedido LAI à Câmara
Co-Authored-By: Claude Opus 5.5 <noreply@anthropic.com>
Claude-Session: https://claude.ai/code/session_014FdFMaMFv1EZmCvKyRdzXt
</commit_message>
<xml_diff>
--- a/denuncia-crime-responsabilidade-minuta.docx
+++ b/denuncia-crime-responsabilidade-minuta.docx
@@ -507,7 +507,7 @@
         <w:t xml:space="preserve">irregularidade</w:t>
       </w:r>
       <w:r>
-        <w:t xml:space="preserve"> a concessão ou ampliação de benefícios tributários, por meio de renúncia de receita, sem observância das exigências legais. Segundo o Tribunal, o Poder Executivo deixou de atender dispositivos da Lei de Diretrizes Orçamentárias, entre eles a apresentação de memórias de cálculo detalhadas das estimativas de renúncia. Conforme noticiado, foram instituídas 23 desonerações por 19 atos normativos em 2024, e parte delas não atendeu aos requisitos da Lei de Responsabilidade Fiscal (art. 14), da LDO e da Constituição. Segundo a imprensa, o TCU identificou nove leis nessa situação, entre elas as relativas ao Perse e ao setor de semicondutores. </w:t>
+        <w:t xml:space="preserve"> a concessão ou ampliação de benefícios tributários, por meio de renúncia de receita, sem observância das exigências legais. Segundo o Tribunal, o Poder Executivo deixou de atender dispositivos da Lei de Diretrizes Orçamentárias, entre eles a apresentação de memórias de cálculo detalhadas das estimativas de renúncia. Conforme noticiado, foram instituídas 23 desonerações por 19 atos normativos em 2024, e parte delas não atendeu aos requisitos da Lei de Responsabilidade Fiscal (art. 14), da LDO e da Constituição. Segundo a imprensa, o TCU identificou nove leis nessa situação, entre elas as relativas ao Perse e ao setor de semicondutores. Segundo o TCU, parte dessas leis teve origem no Poder Legislativo. Duas foram identificadas pela imprensa: a Lei nº 14.859/2024 (Perse), oriunda do PL 1.026/2024 e sancionada sem vetos em 22/05/2024, que fixou teto de R$ 15 bilhões para o custo fiscal do benefício após acordo com o Ministério da Fazenda; e a Lei nº 14.968/2024 (semicondutores), oriunda do PL 13/2020, que prorrogou incentivos até 2029 e foi sancionada com veto à prorrogação automática até 2073 (Mensagem nº 1.060/2024). </w:t>
       </w:r>
       <w:r>
         <w:rPr>
@@ -663,7 +663,7 @@
         <w:jc w:val="both"/>
       </w:pPr>
       <w:r>
-        <w:t xml:space="preserve">No Fato 2, o próprio TCU registrou que todas as renúncias de receita que entraram em vigor em 2024 foram acompanhadas de medidas compensatórias. Parte das leis pode ter origem em iniciativa parlamentar.</w:t>
+        <w:t xml:space="preserve">No Fato 2, o próprio TCU registrou que todas as renúncias de receita que entraram em vigor em 2024 foram acompanhadas de medidas compensatórias, e que parte das leis teve origem no Poder Legislativo. Nas duas leis identificadas, não há indício de recomendação técnica de veto ignorada. Na Lei nº 14.968/2024, o Ministério da Fazenda, o Ministério do Planejamento e a AGU recomendaram o veto de um dispositivo por contrariar a LDO, e o Presidente o vetou (Mensagem nº 1.060/2024). A Lei nº 14.859/2024 (Perse) resultou de acordo com a Fazenda e fixou teto de R$ 15 bilhões.</w:t>
       </w:r>
     </w:p>
     <w:p>
@@ -2585,7 +2585,7 @@
         </w:rPr>
         <w:t xml:space="preserve">TCU – Pé-de-Meia (notícia oficial): </w:t>
       </w:r>
-      <w:hyperlink w:history="1" r:id="rIdvz_ft_p8abyxtpo2nvafu">
+      <w:hyperlink w:history="1" r:id="rId78xaq6nii18wf5nafyx_y">
         <w:r>
           <w:rPr>
             <w:rStyle w:val="Hyperlink"/>
@@ -2612,7 +2612,7 @@
         </w:rPr>
         <w:t xml:space="preserve">TCU – Acórdão 61/2025 (cópia publicada pelo Poder360): </w:t>
       </w:r>
-      <w:hyperlink w:history="1" r:id="rIdgsi5dukq5znb2sfzud9_q">
+      <w:hyperlink w:history="1" r:id="rIdkgtq3fojk3v6mkk2wb-0_">
         <w:r>
           <w:rPr>
             <w:rStyle w:val="Hyperlink"/>
@@ -2639,7 +2639,7 @@
         </w:rPr>
         <w:t xml:space="preserve">AGU – recurso contra a cautelar (cópia publicada pelo Poder360): </w:t>
       </w:r>
-      <w:hyperlink w:history="1" r:id="rId614y-cosypakpaxzudqu_">
+      <w:hyperlink w:history="1" r:id="rIdnbk1lk5zhfcmcmboplcd2">
         <w:r>
           <w:rPr>
             <w:rStyle w:val="Hyperlink"/>
@@ -2666,7 +2666,7 @@
         </w:rPr>
         <w:t xml:space="preserve">Lei 14.818/2024 – Câmara dos Deputados: </w:t>
       </w:r>
-      <w:hyperlink w:history="1" r:id="rIdhkuprfwdkp2ksj5ppm5fl">
+      <w:hyperlink w:history="1" r:id="rIdgyxb7nvz0okn4wqkebcm3">
         <w:r>
           <w:rPr>
             <w:rStyle w:val="Hyperlink"/>
@@ -2693,7 +2693,7 @@
         </w:rPr>
         <w:t xml:space="preserve">TCU dá 120 dias – InfoMoney: </w:t>
       </w:r>
-      <w:hyperlink w:history="1" r:id="rIdy1_kgyynw_b7ckfcqtkss">
+      <w:hyperlink w:history="1" r:id="rIdz92rxm1evhippc2yvz1q2">
         <w:r>
           <w:rPr>
             <w:rStyle w:val="Hyperlink"/>
@@ -2720,7 +2720,7 @@
         </w:rPr>
         <w:t xml:space="preserve">PLN 5/2025 – Agência Câmara: </w:t>
       </w:r>
-      <w:hyperlink w:history="1" r:id="rIdvbrajvz9gfyfiehsabzo1">
+      <w:hyperlink w:history="1" r:id="rIdg1se55nm7fu4w5xhmbjmo">
         <w:r>
           <w:rPr>
             <w:rStyle w:val="Hyperlink"/>
@@ -2747,7 +2747,7 @@
         </w:rPr>
         <w:t xml:space="preserve">Lei 14.995/2024 – Planalto: </w:t>
       </w:r>
-      <w:hyperlink w:history="1" r:id="rIdd3wcguhveggvoairmzfa4">
+      <w:hyperlink w:history="1" r:id="rIdkdcv2a7_f0_t6twc3hlw4">
         <w:r>
           <w:rPr>
             <w:rStyle w:val="Hyperlink"/>
@@ -2774,7 +2774,7 @@
         </w:rPr>
         <w:t xml:space="preserve">Lei 15.076/2024 – Planalto: </w:t>
       </w:r>
-      <w:hyperlink w:history="1" r:id="rIdebqc8vsp8c7avxwvspvwq">
+      <w:hyperlink w:history="1" r:id="rIdmimqd8yckkhavhklb-fjg">
         <w:r>
           <w:rPr>
             <w:rStyle w:val="Hyperlink"/>
@@ -2801,7 +2801,7 @@
         </w:rPr>
         <w:t xml:space="preserve">TCU – notícia oficial do Acórdão 297/2025 (prazo de 120 dias): </w:t>
       </w:r>
-      <w:hyperlink w:history="1" r:id="rIdoepwatzfdtr3dwc1tu42l">
+      <w:hyperlink w:history="1" r:id="rIdi9fw-cp4wdgn2kma0mbkg">
         <w:r>
           <w:rPr>
             <w:rStyle w:val="Hyperlink"/>
@@ -2828,7 +2828,7 @@
         </w:rPr>
         <w:t xml:space="preserve">TCU – Aviso 902/2025 à Câmara (cita o Acórdão 297/2025): </w:t>
       </w:r>
-      <w:hyperlink w:history="1" r:id="rIdqrezkmiplqoxohed6nves">
+      <w:hyperlink w:history="1" r:id="rIdw9t9uzumkdzqa9dpvnwwn">
         <w:r>
           <w:rPr>
             <w:rStyle w:val="Hyperlink"/>
@@ -2855,7 +2855,7 @@
         </w:rPr>
         <w:t xml:space="preserve">TCU – pauta do Plenário com o TC 024.312/2024-0 (agosto/2026): </w:t>
       </w:r>
-      <w:hyperlink w:history="1" r:id="rIdczwpbaqnf1x3jd3fknzmv">
+      <w:hyperlink w:history="1" r:id="rIdi5qs2wytdlr4marp2hy_s">
         <w:r>
           <w:rPr>
             <w:rStyle w:val="Hyperlink"/>
@@ -2882,7 +2882,7 @@
         </w:rPr>
         <w:t xml:space="preserve">Poder360 – Ministros do TCU questionam “desorçamentação” (25/08/2026): </w:t>
       </w:r>
-      <w:hyperlink w:history="1" r:id="rIdlqcjjzh3q-yg01zwcs7yz">
+      <w:hyperlink w:history="1" r:id="rId1oax2bv9wh0ane6xm3mf6">
         <w:r>
           <w:rPr>
             <w:rStyle w:val="Hyperlink"/>
@@ -2909,7 +2909,7 @@
         </w:rPr>
         <w:t xml:space="preserve">Distrito News – TCU critica gasto fora do Orçamento (25/08/2026): </w:t>
       </w:r>
-      <w:hyperlink w:history="1" r:id="rIdev9unjgfdv5gfvrtopkes">
+      <w:hyperlink w:history="1" r:id="rIddwuup02w8wp8iqk-oo-us">
         <w:r>
           <w:rPr>
             <w:rStyle w:val="Hyperlink"/>
@@ -2936,7 +2936,7 @@
         </w:rPr>
         <w:t xml:space="preserve">TCU – auditoria de gastos fora do Orçamento (TC 025.632/2024-8): </w:t>
       </w:r>
-      <w:hyperlink w:history="1" r:id="rIdyva032zlmpygagwncstgd">
+      <w:hyperlink w:history="1" r:id="rIdwcda8b0f314bynsjyblk2">
         <w:r>
           <w:rPr>
             <w:rStyle w:val="Hyperlink"/>
@@ -2963,7 +2963,7 @@
         </w:rPr>
         <w:t xml:space="preserve">Planalto – Mensagem nº 778/2025 (envio do PLN 5/2025): </w:t>
       </w:r>
-      <w:hyperlink w:history="1" r:id="rIdthfmbbcwkiud_9fu-opgo">
+      <w:hyperlink w:history="1" r:id="rIdl_3qbhqsvftb_w2uiakh6">
         <w:r>
           <w:rPr>
             <w:rStyle w:val="Hyperlink"/>
@@ -2990,7 +2990,7 @@
         </w:rPr>
         <w:t xml:space="preserve">Planalto – Mensagem nº 1.712/2025 (retirada do PLN 5/2025): </w:t>
       </w:r>
-      <w:hyperlink w:history="1" r:id="rIddest6yhpwzg6xexgxhpzh">
+      <w:hyperlink w:history="1" r:id="rIdxun2kvug7pzo2xj8myzen">
         <w:r>
           <w:rPr>
             <w:rStyle w:val="Hyperlink"/>
@@ -3017,7 +3017,7 @@
         </w:rPr>
         <w:t xml:space="preserve">Agência Câmara – Orçamento 2026 sancionado (Pé-de-Meia: R$ 11,47 bi): </w:t>
       </w:r>
-      <w:hyperlink w:history="1" r:id="rIdwiyegxxtzmsduvyuufv7m">
+      <w:hyperlink w:history="1" r:id="rIdzrqj0pioizqspvcjpiqsw">
         <w:r>
           <w:rPr>
             <w:rStyle w:val="Hyperlink"/>
@@ -3044,7 +3044,7 @@
         </w:rPr>
         <w:t xml:space="preserve">Congresso Nacional – Contas da Presidência (Aviso 468-GP/TCU/2024): </w:t>
       </w:r>
-      <w:hyperlink w:history="1" r:id="rIdq2gqzpfwapzr9satq1sld">
+      <w:hyperlink w:history="1" r:id="rIdhqmfjaufhggt9atz-ksod">
         <w:r>
           <w:rPr>
             <w:rStyle w:val="Hyperlink"/>
@@ -3071,7 +3071,7 @@
         </w:rPr>
         <w:t xml:space="preserve">Exame – nove leis com benefícios sem requisitos (contas 2024): </w:t>
       </w:r>
-      <w:hyperlink w:history="1" r:id="rIdtuj_ohv6mfajouhyt3s0b">
+      <w:hyperlink w:history="1" r:id="rIdfkpwrgtntjqwa8d3osxv8">
         <w:r>
           <w:rPr>
             <w:rStyle w:val="Hyperlink"/>
@@ -3098,7 +3098,7 @@
         </w:rPr>
         <w:t xml:space="preserve">Contábeis – 23 desonerações por 19 atos (contas 2024): </w:t>
       </w:r>
-      <w:hyperlink w:history="1" r:id="rIdztozhxzjlpgevfuhyrojg">
+      <w:hyperlink w:history="1" r:id="rIdt0ttinb7ka6opoh2g0uhy">
         <w:r>
           <w:rPr>
             <w:rStyle w:val="Hyperlink"/>
@@ -3123,9 +3123,90 @@
           <w:sz w:val="20"/>
           <w:szCs w:val="20"/>
         </w:rPr>
+        <w:t xml:space="preserve">Planalto – Mensagem de veto nº 1.060/2024 (Lei 14.968/2024): </w:t>
+      </w:r>
+      <w:hyperlink w:history="1" r:id="rIdj61ay8svl6__i1htm-qv1">
+        <w:r>
+          <w:rPr>
+            <w:rStyle w:val="Hyperlink"/>
+            <w:sz w:val="18"/>
+            <w:szCs w:val="18"/>
+          </w:rPr>
+          <w:t xml:space="preserve">https://www.planalto.gov.br/ccivil_03/_ato2023-2026/2024/msg/vep/vep-1060-24.htm</w:t>
+        </w:r>
+      </w:hyperlink>
+    </w:p>
+    <w:p>
+      <w:pPr>
+        <w:pStyle w:val="ListParagraph"/>
+        <w:numPr>
+          <w:ilvl w:val="0"/>
+          <w:numId w:val="5"/>
+        </w:numPr>
+        <w:spacing w:after="60"/>
+      </w:pPr>
+      <w:r>
+        <w:rPr>
+          <w:sz w:val="20"/>
+          <w:szCs w:val="20"/>
+        </w:rPr>
+        <w:t xml:space="preserve">Agência Senado – Lei 14.859/2024 (Perse, teto de R$ 15 bi): </w:t>
+      </w:r>
+      <w:hyperlink w:history="1" r:id="rIdhbpv0evknjfhncmm-9m39">
+        <w:r>
+          <w:rPr>
+            <w:rStyle w:val="Hyperlink"/>
+            <w:sz w:val="18"/>
+            <w:szCs w:val="18"/>
+          </w:rPr>
+          <w:t xml:space="preserve">https://www12.senado.leg.br/noticias/materias/2024/05/23/lula-sanciona-lei-que-mantem-o-perse-com-limite-de-r-15-bi-ate-2026</w:t>
+        </w:r>
+      </w:hyperlink>
+    </w:p>
+    <w:p>
+      <w:pPr>
+        <w:pStyle w:val="ListParagraph"/>
+        <w:numPr>
+          <w:ilvl w:val="0"/>
+          <w:numId w:val="5"/>
+        </w:numPr>
+        <w:spacing w:after="60"/>
+      </w:pPr>
+      <w:r>
+        <w:rPr>
+          <w:sz w:val="20"/>
+          <w:szCs w:val="20"/>
+        </w:rPr>
+        <w:t xml:space="preserve">Agência Câmara – Lei 14.968/2024 (semicondutores): </w:t>
+      </w:r>
+      <w:hyperlink w:history="1" r:id="rIdnisgobyyzp-phfqtpz3mr">
+        <w:r>
+          <w:rPr>
+            <w:rStyle w:val="Hyperlink"/>
+            <w:sz w:val="18"/>
+            <w:szCs w:val="18"/>
+          </w:rPr>
+          <w:t xml:space="preserve">https://www.camara.leg.br/noticias/1096388-sancionada-lei-que-amplia-incentivos-para-industria-de-semicondutores/</w:t>
+        </w:r>
+      </w:hyperlink>
+    </w:p>
+    <w:p>
+      <w:pPr>
+        <w:pStyle w:val="ListParagraph"/>
+        <w:numPr>
+          <w:ilvl w:val="0"/>
+          <w:numId w:val="5"/>
+        </w:numPr>
+        <w:spacing w:after="60"/>
+      </w:pPr>
+      <w:r>
+        <w:rPr>
+          <w:sz w:val="20"/>
+          <w:szCs w:val="20"/>
+        </w:rPr>
         <w:t xml:space="preserve">Orçamento de 2026 e Pé-de-Meia – DGABC: </w:t>
       </w:r>
-      <w:hyperlink w:history="1" r:id="rIdezonckt5g8owuenofgvba">
+      <w:hyperlink w:history="1" r:id="rIdlfx-rsub7eyb7pf9qa6ng">
         <w:r>
           <w:rPr>
             <w:rStyle w:val="Hyperlink"/>
@@ -3152,7 +3233,7 @@
         </w:rPr>
         <w:t xml:space="preserve">Orçamento de 2026 após o Congresso – Correio Braziliense (25/12/2025): </w:t>
       </w:r>
-      <w:hyperlink w:history="1" r:id="rIdowtnj_ohppcqdolfoznta">
+      <w:hyperlink w:history="1" r:id="rIduspyzf0xn8pm4hyaywmvi">
         <w:r>
           <w:rPr>
             <w:rStyle w:val="Hyperlink"/>
@@ -3179,7 +3260,7 @@
         </w:rPr>
         <w:t xml:space="preserve">TCU – Acórdão 1.326/2025 (Contas 2024): </w:t>
       </w:r>
-      <w:hyperlink w:history="1" r:id="rIdzm2swjl6smow_aeflzjms">
+      <w:hyperlink w:history="1" r:id="rIdq79q7meddckzm-raduin_">
         <w:r>
           <w:rPr>
             <w:rStyle w:val="Hyperlink"/>
@@ -3206,7 +3287,7 @@
         </w:rPr>
         <w:t xml:space="preserve">TCU – Voto do relator, Contas 2023 (TC 010.005/2024-2): </w:t>
       </w:r>
-      <w:hyperlink w:history="1" r:id="rIdqssiykp1cbakpcqt-iqgl">
+      <w:hyperlink w:history="1" r:id="rIdrzndcx_ryirpnf-mo0x4x">
         <w:r>
           <w:rPr>
             <w:rStyle w:val="Hyperlink"/>
@@ -3233,7 +3314,7 @@
         </w:rPr>
         <w:t xml:space="preserve">TCU – Contas do Presidente 2024: </w:t>
       </w:r>
-      <w:hyperlink w:history="1" r:id="rIdau1n3pxymks5budddzgg8">
+      <w:hyperlink w:history="1" r:id="rIdc-txwmxsgrd4rckri2g4u">
         <w:r>
           <w:rPr>
             <w:rStyle w:val="Hyperlink"/>
@@ -3260,7 +3341,7 @@
         </w:rPr>
         <w:t xml:space="preserve">Contas 2024, renúncias – Exame: </w:t>
       </w:r>
-      <w:hyperlink w:history="1" r:id="rId8kh1lpbub-beg7y8icvb-">
+      <w:hyperlink w:history="1" r:id="rIduhy0cisx2xcwiuqstlz3m">
         <w:r>
           <w:rPr>
             <w:rStyle w:val="Hyperlink"/>
@@ -3287,7 +3368,7 @@
         </w:rPr>
         <w:t xml:space="preserve">Contas 2024, irregularidade – CNN Brasil: </w:t>
       </w:r>
-      <w:hyperlink w:history="1" r:id="rIdh8480fxpkkiq-bxu-bmrp">
+      <w:hyperlink w:history="1" r:id="rId3azjifjwnmpq9j3yna5rq">
         <w:r>
           <w:rPr>
             <w:rStyle w:val="Hyperlink"/>
@@ -3314,7 +3395,7 @@
         </w:rPr>
         <w:t xml:space="preserve">TCU – Contas do Presidente 2023: </w:t>
       </w:r>
-      <w:hyperlink w:history="1" r:id="rIdyduidnzwkqfu457sda0-s">
+      <w:hyperlink w:history="1" r:id="rId9gbeesujwxgsypa8lloys">
         <w:r>
           <w:rPr>
             <w:rStyle w:val="Hyperlink"/>
@@ -3341,7 +3422,7 @@
         </w:rPr>
         <w:t xml:space="preserve">TCU – Acórdão 1.442/2026 (Contas 2025): </w:t>
       </w:r>
-      <w:hyperlink w:history="1" r:id="rIdnxblvyukhmrzdcbnoi8sv">
+      <w:hyperlink w:history="1" r:id="rIdiihqagqyxrrq9yfgnkg6l">
         <w:r>
           <w:rPr>
             <w:rStyle w:val="Hyperlink"/>

</xml_diff>

<commit_message>
Retira dos documentos as informações não verificadas
Mantém apenas o que foi confirmado em fonte oficial ou em pelo menos duas
reportagens independentes.

Co-Authored-By: Claude Opus 5.5 <noreply@anthropic.com>
Claude-Session: https://claude.ai/code/session_014FdFMaMFv1EZmCvKyRdzXt
</commit_message>
<xml_diff>
--- a/denuncia-crime-responsabilidade-minuta.docx
+++ b/denuncia-crime-responsabilidade-minuta.docx
@@ -242,7 +242,7 @@
               <w:t xml:space="preserve">Fato excluído: </w:t>
             </w:r>
             <w:r>
-              <w:t xml:space="preserve">a garantia da União ao empréstimo de R$ 12 bilhões aos Correios (TCU, Acórdão 1.359/2026) ficou de fora. O próprio relator registrou que a decisão não tem caráter punitivo e não há ato pessoal do Presidente identificado.</w:t>
+              <w:t xml:space="preserve">a garantia da União ao empréstimo de R$ 12 bilhões aos Correios (TCU, Acórdão 1.359/2026) ficou de fora, porque não foi identificado ato pessoal do Presidente.</w:t>
             </w:r>
           </w:p>
           <w:p>
@@ -262,7 +262,7 @@
               <w:t xml:space="preserve">Acórdão 2.261/2026 (item 8-A): </w:t>
             </w:r>
             <w:r>
-              <w:t xml:space="preserve">a identificação foi confirmada em registros do TCU: sessão extraordinária de 25/08/2026, Ata nº 32/2026, código AC-2261-32/26-P. O inteiro teor não pôde ser lido. A descrição do conteúdo vem de trechos da pesquisa do TCU e de reportagens do Poder360 e do Distrito News de 25/08/2026. Leia o dispositivo completo antes de protocolar e ajuste os itens 8-A e 15 se ele disser algo diferente.</w:t>
+              <w:t xml:space="preserve">a existência, a data (25/08/2026) e o código (AC-2261-32/26-P) foram confirmados em registros do TCU. O conteúdo não pôde ser verificado e por isso não é descrito. Leia o inteiro teor antes de protocolar.</w:t>
             </w:r>
           </w:p>
           <w:p>
@@ -282,7 +282,7 @@
               <w:t xml:space="preserve">Contas de 2023: </w:t>
             </w:r>
             <w:r>
-              <w:t xml:space="preserve">o processo é o TC 010.005/2024-2, e o parecer foi enviado ao Congresso pelo Aviso nº 468-GP/TCU/2024. O número do acórdão não foi localizado. Há indício, não confirmado, de que seja o Acórdão nº 1.106/2024-TCU-Plenário.</w:t>
+              <w:t xml:space="preserve">o processo é o TC 010.005/2024-2, e o parecer foi enviado ao Congresso pelo Aviso nº 468-GP/TCU/2024. O número do acórdão não foi localizado.</w:t>
             </w:r>
           </w:p>
         </w:tc>
@@ -453,7 +453,7 @@
         <w:jc w:val="both"/>
       </w:pPr>
       <w:r>
-        <w:t xml:space="preserve">7. Em 20 de janeiro de 2025, o Ministro Augusto Nardes concedeu medida cautelar no processo TC 024.312/2024-0. Em 22 de janeiro de 2025, o Plenário do Tribunal de Contas da União a referendou por unanimidade (Acórdão nº 61/2025-TCU-Plenário, Doc. 2). A medida suspendeu o uso, no Programa, de cerca de R$ 6 bilhões oriundos do FGO e do Fgeduc que capitalizaram o Fipem sem trânsito pelo Orçamento Geral da União. Segundo o relator, a lei permite que a União transfira recursos ao fundo, mas não permite que o pagamento dos incentivos aos estudantes se dê à margem do orçamento. Ficaram excepcionalmente preservados, em 2024 e 2025, os R$ 6,1 bilhões provenientes do Fundo Social.</w:t>
+        <w:t xml:space="preserve">7. Em 22 de janeiro de 2025, o Plenário do Tribunal de Contas da União referendou, por unanimidade, medida cautelar do Ministro Augusto Nardes no processo TC 024.312/2024-0 (Acórdão nº 61/2025-TCU-Plenário, Doc. 2). A medida suspendeu cerca de R$ 6 bilhões destinados ao Programa, oriundos do FGO e do Fgeduc, porque os pagamentos aos estudantes com recursos do Fipem não estavam previstos na Lei Orçamentária Anual. Segundo o relator, a lei permite à União transferir recursos ao fundo, mas não permite que o pagamento dos incentivos se dê à margem do orçamento.</w:t>
       </w:r>
     </w:p>
     <w:p>
@@ -463,7 +463,7 @@
         <w:jc w:val="both"/>
       </w:pPr>
       <w:r>
-        <w:t xml:space="preserve">8. Em 12 de fevereiro de 2025, o Plenário deu provimento parcial ao agravo da Advocacia-Geral da União e revogou a cautelar (Acórdão nº 297/2025-TCU-Plenário, Doc. 3). Fundamentou-se no perigo da demora reverso e nos impactos sociais da interrupção do programa, e reservou para momento posterior a análise de mérito. O Tribunal autorizou, de forma provisória e excepcional, a continuidade dos pagamentos com recursos do Fipem e fixou prazo de 120 dias para que o Poder Executivo adequasse o financiamento às normas orçamentárias e de responsabilidade fiscal. Segundo o relatório desse acórdão, o custo anual estimado do programa é de R$ 12,5 bilhões, enquanto o Projeto de Lei Orçamentária de 2025 previa apenas R$ 1 bilhão. O Executivo enviou ao Congresso o PLN nº 5/2025 (Mensagem nº 778, de 24/06/2025), com crédito suplementar de R$ 685,9 milhões ao Ministério da Educação para o programa, e depois solicitou a sua retirada de tramitação (Mensagem nº 1.712/2025) (Doc. 8).</w:t>
+        <w:t xml:space="preserve">8. Em 12 de fevereiro de 2025, o Plenário revogou a cautelar após recurso da Advocacia-Geral da União (Acórdão nº 297/2025-TCU-Plenário, Doc. 3), sem julgar o mérito. Autorizou a continuidade provisória dos pagamentos e fixou prazo de 120 dias para que o Poder Executivo adequasse o financiamento do programa às normas orçamentárias e de responsabilidade fiscal. Segundo documento da Câmara dos Deputados que transcreve o relatório desse acórdão, o custo anual estimado do programa é de R$ 12,5 bilhões, e o Projeto de Lei Orçamentária de 2025 previa R$ 1 bilhão. O Executivo enviou ao Congresso o PLN nº 5/2025 (Mensagem nº 778, de 24/06/2025), com crédito suplementar de R$ 685,9 milhões ao Ministério da Educação para o programa, e depois solicitou a sua retirada de tramitação (Mensagem nº 1.712/2025) (Doc. 8).</w:t>
       </w:r>
     </w:p>
     <w:p>
@@ -473,13 +473,7 @@
         <w:jc w:val="both"/>
       </w:pPr>
       <w:r>
-        <w:t xml:space="preserve">8-A. Em 25 de agosto de 2026, em sessão extraordinária, o Plenário do TCU proferiu por unanimidade, no mesmo processo, o Acórdão nº 2.261/2026-TCU-Plenário (Doc. 3-A). O processo é uma representação do Ministério Público junto ao TCU, com relatoria do Ministro Augusto Nardes e revisão do Ministro Odair Cunha. Segundo os registros de pesquisa do TCU, o sumário da decisão aponta indícios de descumprimento de princípios e normas constitucionais e legais de finanças públicas no arranjo orçamentário e financeiro do Programa. O Tribunal, ainda assim, autorizou excepcionalmente a execução temporária do programa. Segundo a imprensa, na mesma sessão o relator acolheu proposta do revisor para juntar o processo ao TC 025.632/2024-8, auditoria operacional sobre gastos fora do Orçamento (relator Min. Bruno Dantas), e não houve decisão definitiva de mérito. Nessa auditoria, o Acórdão nº 1.372/2026-TCU-Plenário (27/05/2026) já havia determinado medidas de transparência aos gestores de fundos e a apresentação de relatório em 180 dias. </w:t>
-      </w:r>
-      <w:r>
-        <w:rPr>
-          <w:shd w:fill="FFF2A8" w:color="auto" w:val="clear"/>
-        </w:rPr>
-        <w:t xml:space="preserve">[Conferir o inteiro teor, em especial o dispositivo, antes do protocolo.]</w:t>
+        <w:t xml:space="preserve">8-A. Em 25 de agosto de 2026, o Plenário do TCU proferiu, no mesmo processo, o Acórdão nº 2.261/2026-TCU-Plenário (Doc. 3-A), cujo inteiro teor não pôde ser verificado e deverá ser requisitado (item V).</w:t>
       </w:r>
     </w:p>
     <w:p>
@@ -497,23 +491,13 @@
         <w:jc w:val="both"/>
       </w:pPr>
       <w:r>
-        <w:t xml:space="preserve">9. No parecer prévio sobre as Contas do Presidente da República do exercício de 2024, aprovado em 11 de junho de 2025 (Acórdão nº 1.326/2025-TCU-Plenário, TC 008.437/2025-4, relator: Ministro Jhonatan de Jesus, Doc. 6 e 7), o TCU apontou como </w:t>
-      </w:r>
-      <w:r>
-        <w:rPr>
-          <w:i/>
-          <w:iCs/>
-        </w:rPr>
-        <w:t xml:space="preserve">irregularidade</w:t>
-      </w:r>
-      <w:r>
-        <w:t xml:space="preserve"> a concessão ou ampliação de benefícios tributários, por meio de renúncia de receita, sem observância das exigências legais. Segundo o Tribunal, o Poder Executivo deixou de atender dispositivos da Lei de Diretrizes Orçamentárias, entre eles a apresentação de memórias de cálculo detalhadas das estimativas de renúncia. Conforme noticiado, foram instituídas 23 desonerações por 19 atos normativos em 2024, e parte delas não atendeu aos requisitos da Lei de Responsabilidade Fiscal (art. 14), da LDO e da Constituição. Segundo a imprensa, o TCU identificou nove leis nessa situação, entre elas as relativas ao Perse e ao setor de semicondutores. Segundo o TCU, parte dessas leis teve origem no Poder Legislativo. Duas foram identificadas pela imprensa: a Lei nº 14.859/2024 (Perse), oriunda do PL 1.026/2024 e sancionada sem vetos em 22/05/2024, que fixou teto de R$ 15 bilhões para o custo fiscal do benefício após acordo com o Ministério da Fazenda; e a Lei nº 14.968/2024 (semicondutores), oriunda do PL 13/2020, que prorrogou incentivos até 2029 e foi sancionada com veto à prorrogação automática até 2073 (Mensagem nº 1.060/2024). </w:t>
+        <w:t xml:space="preserve">9. No parecer prévio sobre as Contas do Presidente da República do exercício de 2024, aprovado em 11 de junho de 2025 (Acórdão nº 1.326/2025-TCU-Plenário, TC 008.437/2025-4, relator: Ministro Jhonatan de Jesus, Doc. 6 e 7), o TCU apontou como irregularidade a concessão ou ampliação de benefícios tributários, com renúncia de receita, sem atendimento às prescrições legais. Segundo o Tribunal, o Poder Executivo deixou de atender dispositivos da Lei de Diretrizes Orçamentárias, entre eles a apresentação de memórias de cálculo detalhadas das estimativas de renúncia, e sancionou projetos de lei originados no Poder Legislativo que criaram novos benefícios tributários. </w:t>
       </w:r>
       <w:r>
         <w:rPr>
           <w:shd w:fill="FFF2A8" w:color="auto" w:val="clear"/>
         </w:rPr>
-        <w:t xml:space="preserve">[Identificar no relatório do TCU, capítulo sobre renúncias, quais leis foram apontadas e qual dispositivo constitucional foi citado, provavelmente o art. 113 do ADCT.]</w:t>
+        <w:t xml:space="preserve">[As leis apontadas não foram identificadas em fonte oficial; a lista deve ser requisitada ao TCU.]</w:t>
       </w:r>
     </w:p>
     <w:p>
@@ -585,7 +569,7 @@
         <w:jc w:val="both"/>
       </w:pPr>
       <w:r>
-        <w:t xml:space="preserve">13. A Lei de Diretrizes Orçamentárias integra o sistema constitucional das leis orçamentárias (CF, art. 165, II). Concessão ou ampliação de benefício tributário que resulte em renúncia de receita exige estimativa de impacto orçamentário-financeiro e medidas de compensação (LRF, art. 14). Proposição legislativa que crie renúncia de receita deve vir acompanhada da estimativa de impacto (ADCT, art. 113). Sancionar leis que, segundo o TCU, descumpriram esses requisitos pode configurar, em tese, a conduta do art. 10, item 4, da Lei nº 1.079/1950.</w:t>
+        <w:t xml:space="preserve">13. A Lei de Diretrizes Orçamentárias integra o sistema constitucional das leis orçamentárias (CF, art. 165, II). Concessão ou ampliação de benefício tributário que resulte em renúncia de receita exige estimativa de impacto orçamentário-financeiro e medidas de compensação (LRF, art. 14). Proposição legislativa que crie renúncia de receita deve vir acompanhada da estimativa de impacto (ADCT, art. 113). Sancionar leis que, segundo o TCU, descumpriram requisitos da LDO e da LRF pode configurar, em tese, a conduta do art. 10, item 4, da Lei nº 1.079/1950.</w:t>
       </w:r>
     </w:p>
     <w:p>
@@ -649,7 +633,7 @@
         <w:jc w:val="both"/>
       </w:pPr>
       <w:r>
-        <w:t xml:space="preserve">No Fato 1, as transferências ao Fipem tiveram amparo em leis aprovadas pelo Congresso Nacional. A decisão do TCU foi cautelar, sem julgamento de mérito, e foi revogada pelo Acórdão nº 297/2025-TCU-Plenário. O Executivo chegou a apresentar proposta de regularização (PLN nº 5/2025), depois retirada, e a Advocacia-Geral da União sustenta a legalidade das transferências e o cumprimento da determinação de iniciar o processo legislativo. Para 2026, a Lei Orçamentária sancionada reservou R$ 11,47 bilhões ao programa, segundo a Agência Câmara. No Acórdão nº 2.261/2026, o TCU manteve a autorização para a execução do programa e, segundo a imprensa, não proferiu decisão definitiva de mérito.</w:t>
+        <w:t xml:space="preserve">No Fato 1, as transferências ao Fipem tiveram amparo em leis aprovadas pelo Congresso Nacional (Leis nº 14.995/2024 e nº 15.076/2024). A decisão de janeiro de 2025 foi cautelar, sem julgamento de mérito, e foi revogada pelo Acórdão nº 297/2025, que autorizou a continuidade do programa. A Advocacia-Geral da União sustenta a legalidade das transferências. Para 2026, a Lei Orçamentária sancionada reservou R$ 11,47 bilhões ao programa, segundo a Agência Câmara.</w:t>
       </w:r>
     </w:p>
     <w:p>
@@ -663,7 +647,7 @@
         <w:jc w:val="both"/>
       </w:pPr>
       <w:r>
-        <w:t xml:space="preserve">No Fato 2, o próprio TCU registrou que todas as renúncias de receita que entraram em vigor em 2024 foram acompanhadas de medidas compensatórias, e que parte das leis teve origem no Poder Legislativo. Nas duas leis identificadas, não há indício de recomendação técnica de veto ignorada. Na Lei nº 14.968/2024, o Ministério da Fazenda, o Ministério do Planejamento e a AGU recomendaram o veto de um dispositivo por contrariar a LDO, e o Presidente o vetou (Mensagem nº 1.060/2024). A Lei nº 14.859/2024 (Perse) resultou de acordo com a Fazenda e fixou teto de R$ 15 bilhões.</w:t>
+        <w:t xml:space="preserve">No Fato 2, o próprio TCU registrou que todas as renúncias de receita que entraram em vigor em 2024 foram acompanhadas de medidas compensatórias, e que parte das leis teve origem no Poder Legislativo.</w:t>
       </w:r>
     </w:p>
     <w:p>
@@ -709,7 +693,7 @@
         <w:jc w:val="both"/>
       </w:pPr>
       <w:r>
-        <w:t xml:space="preserve">a requisição ao Tribunal de Contas da União de cópia integral do processo TC 024.312/2024-0 (Pé-de-Meia), inclusive dos Acórdãos nº 61/2025, nº 297/2025 e nº 2.261/2026-TCU-Plenário e do acompanhamento do cumprimento do prazo de 120 dias, e do processo TC 008.437/2025-4 (Contas do Presidente da República, exercício de 2024), em especial o capítulo sobre renúncias de receita;</w:t>
+        <w:t xml:space="preserve">a requisição ao Tribunal de Contas da União de cópia integral do processo TC 024.312/2024-0 (Pé-de-Meia), inclusive dos Acórdãos nº 61/2025, nº 297/2025 e nº 2.261/2026-TCU-Plenário e do acompanhamento do prazo de 120 dias, e do processo TC 008.437/2025-4 (Contas do Presidente da República de 2024), com a relação das leis apontadas no capítulo sobre renúncias de receita;</w:t>
       </w:r>
     </w:p>
     <w:p>
@@ -751,7 +735,7 @@
         <w:jc w:val="both"/>
       </w:pPr>
       <w:r>
-        <w:t xml:space="preserve">a informação, pelo Congresso Nacional, sobre a tramitação e o resultado do PLN nº 5/2025 e o julgamento das contas presidenciais de 2023 a 2025;</w:t>
+        <w:t xml:space="preserve">a informação, pelo Congresso Nacional, sobre os motivos da retirada do PLN nº 5/2025 e o julgamento das contas presidenciais de 2023 a 2025;</w:t>
       </w:r>
     </w:p>
     <w:p>
@@ -907,21 +891,7 @@
         <w:jc w:val="both"/>
       </w:pPr>
       <w:r>
-        <w:t xml:space="preserve">Doc. 3-A: Acórdão nº 2.261/2026-TCU-Plenário (TC 024.312/2024-0), de 25/08/2026, Ata nº 32/2026, código AC-2261-32/26-P.</w:t>
-      </w:r>
-    </w:p>
-    <w:p>
-      <w:pPr>
-        <w:pStyle w:val="ListParagraph"/>
-        <w:numPr>
-          <w:ilvl w:val="0"/>
-          <w:numId w:val="4"/>
-        </w:numPr>
-        <w:spacing w:after="100" w:line="340"/>
-        <w:jc w:val="both"/>
-      </w:pPr>
-      <w:r>
-        <w:t xml:space="preserve">Doc. 3-B: Acórdão nº 1.372/2026-TCU-Plenário (TC 025.632/2024-8), de 27/05/2026, auditoria sobre gastos fora do Orçamento.</w:t>
+        <w:t xml:space="preserve">Doc. 3-A: Acórdão nº 2.261/2026-TCU-Plenário (TC 024.312/2024-0), de 25/08/2026, código AC-2261-32/26-P (inteiro teor a obter).</w:t>
       </w:r>
     </w:p>
     <w:p>
@@ -1496,7 +1466,7 @@
                 <w:sz w:val="18"/>
                 <w:szCs w:val="18"/>
               </w:rPr>
-              <w:t xml:space="preserve">Fonte oficial localizada; conferir o texto</w:t>
+              <w:t xml:space="preserve">Fonte oficial (Câmara, Legislação)</w:t>
             </w:r>
           </w:p>
         </w:tc>
@@ -1702,7 +1672,7 @@
                 <w:sz w:val="18"/>
                 <w:szCs w:val="18"/>
               </w:rPr>
-              <w:t xml:space="preserve">TCU suspendeu cerca de R$ 6 bi por pagamentos à margem do OGU</w:t>
+              <w:t xml:space="preserve">TCU suspendeu cerca de R$ 6 bi por pagamentos fora da LOA</w:t>
             </w:r>
           </w:p>
         </w:tc>
@@ -1781,7 +1751,7 @@
                 <w:sz w:val="18"/>
                 <w:szCs w:val="18"/>
               </w:rPr>
-              <w:t xml:space="preserve">Texto do TCU localizado; número confirmado</w:t>
+              <w:t xml:space="preserve">Texto do TCU localizado</w:t>
             </w:r>
           </w:p>
         </w:tc>
@@ -1813,7 +1783,7 @@
                 <w:sz w:val="18"/>
                 <w:szCs w:val="18"/>
               </w:rPr>
-              <w:t xml:space="preserve">Decisão cautelar, sem mérito; Fundo Social preservado</w:t>
+              <w:t xml:space="preserve">Decisão cautelar, sem julgamento de mérito</w:t>
             </w:r>
           </w:p>
         </w:tc>
@@ -1950,7 +1920,7 @@
                 <w:sz w:val="18"/>
                 <w:szCs w:val="18"/>
               </w:rPr>
-              <w:t xml:space="preserve">Agravo da AGU parcialmente provido; mérito reservado</w:t>
+              <w:t xml:space="preserve">Cautelar revogada; programa autorizado</w:t>
             </w:r>
           </w:p>
         </w:tc>
@@ -1987,7 +1957,7 @@
                 <w:sz w:val="18"/>
                 <w:szCs w:val="18"/>
               </w:rPr>
-              <w:t xml:space="preserve">TCU (25/08/2026): indícios de descumprimento de normas de finanças públicas; execução temporária autorizada</w:t>
+              <w:t xml:space="preserve">Acórdão 2.261/2026 proferido no mesmo processo</w:t>
             </w:r>
           </w:p>
         </w:tc>
@@ -2019,22 +1989,22 @@
                 <w:sz w:val="18"/>
                 <w:szCs w:val="18"/>
               </w:rPr>
-              <w:t xml:space="preserve">Acórdão 2.261/2026-Plenário</w:t>
-            </w:r>
-          </w:p>
-          <w:p>
-            <w:pPr>
-              <w:spacing w:after="40"/>
-            </w:pPr>
-            <w:r>
-              <w:rPr>
-                <w:rFonts w:ascii="Calibri" w:cs="Calibri" w:eastAsia="Calibri" w:hAnsi="Calibri"/>
-                <w:b w:val="false"/>
-                <w:bCs w:val="false"/>
-                <w:sz w:val="18"/>
-                <w:szCs w:val="18"/>
-              </w:rPr>
-              <w:t xml:space="preserve">Ata 32/2026 · AC-2261-32/26-P</w:t>
+              <w:t xml:space="preserve">Acórdão 2.261/2026-Plenário (25/08/2026)</w:t>
+            </w:r>
+          </w:p>
+          <w:p>
+            <w:pPr>
+              <w:spacing w:after="40"/>
+            </w:pPr>
+            <w:r>
+              <w:rPr>
+                <w:rFonts w:ascii="Calibri" w:cs="Calibri" w:eastAsia="Calibri" w:hAnsi="Calibri"/>
+                <w:b w:val="false"/>
+                <w:bCs w:val="false"/>
+                <w:sz w:val="18"/>
+                <w:szCs w:val="18"/>
+              </w:rPr>
+              <w:t xml:space="preserve">AC-2261-32/26-P</w:t>
             </w:r>
           </w:p>
         </w:tc>
@@ -2066,7 +2036,7 @@
                 <w:sz w:val="18"/>
                 <w:szCs w:val="18"/>
               </w:rPr>
-              <w:t xml:space="preserve">Identificação confirmada; conteúdo por trechos do TCU e imprensa (25/08/2026); sem decisão definitiva de mérito</w:t>
+              <w:t xml:space="preserve">Existência e data confirmadas; conteúdo não verificado</w:t>
             </w:r>
           </w:p>
         </w:tc>
@@ -2098,7 +2068,7 @@
                 <w:sz w:val="18"/>
                 <w:szCs w:val="18"/>
               </w:rPr>
-              <w:t xml:space="preserve">Programa autorizado; processo juntado à auditoria TC 025.632/2024-8; LOA 2026 com R$ 11,47 bi</w:t>
+              <w:t xml:space="preserve">—</w:t>
             </w:r>
           </w:p>
         </w:tc>
@@ -2136,7 +2106,7 @@
                 <w:sz w:val="18"/>
                 <w:szCs w:val="18"/>
               </w:rPr>
-              <w:t xml:space="preserve">Executivo propôs crédito de R$ 686 mi (PLN 5/2025)</w:t>
+              <w:t xml:space="preserve">PLN 5/2025 (R$ 685,9 mi) enviado e depois retirado pelo Executivo</w:t>
             </w:r>
           </w:p>
         </w:tc>
@@ -2169,7 +2139,7 @@
                 <w:sz w:val="18"/>
                 <w:szCs w:val="18"/>
               </w:rPr>
-              <w:t xml:space="preserve">Agência Câmara</w:t>
+              <w:t xml:space="preserve">Mensagens nº 778/2025 e nº 1.712/2025</w:t>
             </w:r>
           </w:p>
         </w:tc>
@@ -2202,7 +2172,7 @@
                 <w:sz w:val="18"/>
                 <w:szCs w:val="18"/>
               </w:rPr>
-              <w:t xml:space="preserve">Fonte oficial (Câmara)</w:t>
+              <w:t xml:space="preserve">Fonte oficial (Planalto)</w:t>
             </w:r>
           </w:p>
         </w:tc>
@@ -2235,7 +2205,7 @@
                 <w:sz w:val="18"/>
                 <w:szCs w:val="18"/>
               </w:rPr>
-              <w:t xml:space="preserve">Iniciativa de regularização</w:t>
+              <w:t xml:space="preserve">LOA 2026 com R$ 11,47 bi para o programa</w:t>
             </w:r>
           </w:p>
         </w:tc>
@@ -2272,7 +2242,7 @@
                 <w:sz w:val="18"/>
                 <w:szCs w:val="18"/>
               </w:rPr>
-              <w:t xml:space="preserve">2024: 23 desonerações por 19 atos; parte sem requisitos da LRF, LDO e CF</w:t>
+              <w:t xml:space="preserve">2024: benefícios tributários sem atendimento às prescrições legais</w:t>
             </w:r>
           </w:p>
         </w:tc>
@@ -2351,7 +2321,7 @@
                 <w:sz w:val="18"/>
                 <w:szCs w:val="18"/>
               </w:rPr>
-              <w:t xml:space="preserve">Acórdão confirmado (TCU); números 23 e 19 apenas na imprensa; conferir no relatório</w:t>
+              <w:t xml:space="preserve">Constatado pelo TCU (acórdão e notícia oficial)</w:t>
             </w:r>
           </w:p>
         </w:tc>
@@ -2383,7 +2353,7 @@
                 <w:sz w:val="18"/>
                 <w:szCs w:val="18"/>
               </w:rPr>
-              <w:t xml:space="preserve">Todas com medidas compensatórias; contas aprovadas</w:t>
+              <w:t xml:space="preserve">Todas com medidas compensatórias; leis de origem parlamentar; contas aprovadas</w:t>
             </w:r>
           </w:p>
         </w:tc>
@@ -2585,7 +2555,7 @@
         </w:rPr>
         <w:t xml:space="preserve">TCU – Pé-de-Meia (notícia oficial): </w:t>
       </w:r>
-      <w:hyperlink w:history="1" r:id="rId78xaq6nii18wf5nafyx_y">
+      <w:hyperlink w:history="1" r:id="rId0msnuhkb3lxukd5ibwbyy">
         <w:r>
           <w:rPr>
             <w:rStyle w:val="Hyperlink"/>
@@ -2612,7 +2582,7 @@
         </w:rPr>
         <w:t xml:space="preserve">TCU – Acórdão 61/2025 (cópia publicada pelo Poder360): </w:t>
       </w:r>
-      <w:hyperlink w:history="1" r:id="rIdkgtq3fojk3v6mkk2wb-0_">
+      <w:hyperlink w:history="1" r:id="rIdzkxexnh8q9gaeo3sf764d">
         <w:r>
           <w:rPr>
             <w:rStyle w:val="Hyperlink"/>
@@ -2639,7 +2609,7 @@
         </w:rPr>
         <w:t xml:space="preserve">AGU – recurso contra a cautelar (cópia publicada pelo Poder360): </w:t>
       </w:r>
-      <w:hyperlink w:history="1" r:id="rIdnbk1lk5zhfcmcmboplcd2">
+      <w:hyperlink w:history="1" r:id="rIdctht32jfylzsbsml3rlrp">
         <w:r>
           <w:rPr>
             <w:rStyle w:val="Hyperlink"/>
@@ -2666,7 +2636,7 @@
         </w:rPr>
         <w:t xml:space="preserve">Lei 14.818/2024 – Câmara dos Deputados: </w:t>
       </w:r>
-      <w:hyperlink w:history="1" r:id="rIdgyxb7nvz0okn4wqkebcm3">
+      <w:hyperlink w:history="1" r:id="rIdjrmqfffpz77etruia2nl8">
         <w:r>
           <w:rPr>
             <w:rStyle w:val="Hyperlink"/>
@@ -2693,7 +2663,7 @@
         </w:rPr>
         <w:t xml:space="preserve">TCU dá 120 dias – InfoMoney: </w:t>
       </w:r>
-      <w:hyperlink w:history="1" r:id="rIdz92rxm1evhippc2yvz1q2">
+      <w:hyperlink w:history="1" r:id="rId6d4ndge1hj9-iopen5e-g">
         <w:r>
           <w:rPr>
             <w:rStyle w:val="Hyperlink"/>
@@ -2720,7 +2690,7 @@
         </w:rPr>
         <w:t xml:space="preserve">PLN 5/2025 – Agência Câmara: </w:t>
       </w:r>
-      <w:hyperlink w:history="1" r:id="rIdg1se55nm7fu4w5xhmbjmo">
+      <w:hyperlink w:history="1" r:id="rIdtnjiw0tqk8qvhvb5d1nzw">
         <w:r>
           <w:rPr>
             <w:rStyle w:val="Hyperlink"/>
@@ -2747,7 +2717,7 @@
         </w:rPr>
         <w:t xml:space="preserve">Lei 14.995/2024 – Planalto: </w:t>
       </w:r>
-      <w:hyperlink w:history="1" r:id="rIdkdcv2a7_f0_t6twc3hlw4">
+      <w:hyperlink w:history="1" r:id="rIdmbohu4n4rqsi2uinljp51">
         <w:r>
           <w:rPr>
             <w:rStyle w:val="Hyperlink"/>
@@ -2774,7 +2744,7 @@
         </w:rPr>
         <w:t xml:space="preserve">Lei 15.076/2024 – Planalto: </w:t>
       </w:r>
-      <w:hyperlink w:history="1" r:id="rIdmimqd8yckkhavhklb-fjg">
+      <w:hyperlink w:history="1" r:id="rId1wfthzcq3w3_jyj37oxex">
         <w:r>
           <w:rPr>
             <w:rStyle w:val="Hyperlink"/>
@@ -2801,7 +2771,7 @@
         </w:rPr>
         <w:t xml:space="preserve">TCU – notícia oficial do Acórdão 297/2025 (prazo de 120 dias): </w:t>
       </w:r>
-      <w:hyperlink w:history="1" r:id="rIdi9fw-cp4wdgn2kma0mbkg">
+      <w:hyperlink w:history="1" r:id="rIdt5rsiviwrk9wktf_m31uw">
         <w:r>
           <w:rPr>
             <w:rStyle w:val="Hyperlink"/>
@@ -2828,7 +2798,7 @@
         </w:rPr>
         <w:t xml:space="preserve">TCU – Aviso 902/2025 à Câmara (cita o Acórdão 297/2025): </w:t>
       </w:r>
-      <w:hyperlink w:history="1" r:id="rIdw9t9uzumkdzqa9dpvnwwn">
+      <w:hyperlink w:history="1" r:id="rIdk-9hwzfr8t2-hg-sn8n9w">
         <w:r>
           <w:rPr>
             <w:rStyle w:val="Hyperlink"/>
@@ -2855,7 +2825,7 @@
         </w:rPr>
         <w:t xml:space="preserve">TCU – pauta do Plenário com o TC 024.312/2024-0 (agosto/2026): </w:t>
       </w:r>
-      <w:hyperlink w:history="1" r:id="rIdi5qs2wytdlr4marp2hy_s">
+      <w:hyperlink w:history="1" r:id="rIdicrsrxbu_znmm55px9isr">
         <w:r>
           <w:rPr>
             <w:rStyle w:val="Hyperlink"/>
@@ -2880,90 +2850,9 @@
           <w:sz w:val="20"/>
           <w:szCs w:val="20"/>
         </w:rPr>
-        <w:t xml:space="preserve">Poder360 – Ministros do TCU questionam “desorçamentação” (25/08/2026): </w:t>
-      </w:r>
-      <w:hyperlink w:history="1" r:id="rId1oax2bv9wh0ane6xm3mf6">
-        <w:r>
-          <w:rPr>
-            <w:rStyle w:val="Hyperlink"/>
-            <w:sz w:val="18"/>
-            <w:szCs w:val="18"/>
-          </w:rPr>
-          <w:t xml:space="preserve">https://www.poder360.com.br/poder-governo/ministros-do-tcu-questionam-desorcamentacao-em-pe-de-meia-e-desenrola/</w:t>
-        </w:r>
-      </w:hyperlink>
-    </w:p>
-    <w:p>
-      <w:pPr>
-        <w:pStyle w:val="ListParagraph"/>
-        <w:numPr>
-          <w:ilvl w:val="0"/>
-          <w:numId w:val="5"/>
-        </w:numPr>
-        <w:spacing w:after="60"/>
-      </w:pPr>
-      <w:r>
-        <w:rPr>
-          <w:sz w:val="20"/>
-          <w:szCs w:val="20"/>
-        </w:rPr>
-        <w:t xml:space="preserve">Distrito News – TCU critica gasto fora do Orçamento (25/08/2026): </w:t>
-      </w:r>
-      <w:hyperlink w:history="1" r:id="rIddwuup02w8wp8iqk-oo-us">
-        <w:r>
-          <w:rPr>
-            <w:rStyle w:val="Hyperlink"/>
-            <w:sz w:val="18"/>
-            <w:szCs w:val="18"/>
-          </w:rPr>
-          <w:t xml:space="preserve">https://distritonews.com/economia/tcu-desorcamentacao-pe-de-meia-desenrola-fipem-fgo-25-agosto-2026</w:t>
-        </w:r>
-      </w:hyperlink>
-    </w:p>
-    <w:p>
-      <w:pPr>
-        <w:pStyle w:val="ListParagraph"/>
-        <w:numPr>
-          <w:ilvl w:val="0"/>
-          <w:numId w:val="5"/>
-        </w:numPr>
-        <w:spacing w:after="60"/>
-      </w:pPr>
-      <w:r>
-        <w:rPr>
-          <w:sz w:val="20"/>
-          <w:szCs w:val="20"/>
-        </w:rPr>
-        <w:t xml:space="preserve">TCU – auditoria de gastos fora do Orçamento (TC 025.632/2024-8): </w:t>
-      </w:r>
-      <w:hyperlink w:history="1" r:id="rIdwcda8b0f314bynsjyblk2">
-        <w:r>
-          <w:rPr>
-            <w:rStyle w:val="Hyperlink"/>
-            <w:sz w:val="18"/>
-            <w:szCs w:val="18"/>
-          </w:rPr>
-          <w:t xml:space="preserve">https://portal.tcu.gov.br/imprensa/noticias/tribunal-examina-mecanismos-de-gastos-de-fundos-fora-do-orcamento-geral-da-uniao</w:t>
-        </w:r>
-      </w:hyperlink>
-    </w:p>
-    <w:p>
-      <w:pPr>
-        <w:pStyle w:val="ListParagraph"/>
-        <w:numPr>
-          <w:ilvl w:val="0"/>
-          <w:numId w:val="5"/>
-        </w:numPr>
-        <w:spacing w:after="60"/>
-      </w:pPr>
-      <w:r>
-        <w:rPr>
-          <w:sz w:val="20"/>
-          <w:szCs w:val="20"/>
-        </w:rPr>
         <w:t xml:space="preserve">Planalto – Mensagem nº 778/2025 (envio do PLN 5/2025): </w:t>
       </w:r>
-      <w:hyperlink w:history="1" r:id="rIdl_3qbhqsvftb_w2uiakh6">
+      <w:hyperlink w:history="1" r:id="rIdpsoyqxyzzc890gofqc18l">
         <w:r>
           <w:rPr>
             <w:rStyle w:val="Hyperlink"/>
@@ -2990,7 +2879,7 @@
         </w:rPr>
         <w:t xml:space="preserve">Planalto – Mensagem nº 1.712/2025 (retirada do PLN 5/2025): </w:t>
       </w:r>
-      <w:hyperlink w:history="1" r:id="rIdxun2kvug7pzo2xj8myzen">
+      <w:hyperlink w:history="1" r:id="rIdcswqwwkxif9ikihuem4ck">
         <w:r>
           <w:rPr>
             <w:rStyle w:val="Hyperlink"/>
@@ -3017,7 +2906,7 @@
         </w:rPr>
         <w:t xml:space="preserve">Agência Câmara – Orçamento 2026 sancionado (Pé-de-Meia: R$ 11,47 bi): </w:t>
       </w:r>
-      <w:hyperlink w:history="1" r:id="rIdzrqj0pioizqspvcjpiqsw">
+      <w:hyperlink w:history="1" r:id="rIdp-hifqlozlr_ouavbqygv">
         <w:r>
           <w:rPr>
             <w:rStyle w:val="Hyperlink"/>
@@ -3044,7 +2933,7 @@
         </w:rPr>
         <w:t xml:space="preserve">Congresso Nacional – Contas da Presidência (Aviso 468-GP/TCU/2024): </w:t>
       </w:r>
-      <w:hyperlink w:history="1" r:id="rIdhqmfjaufhggt9atz-ksod">
+      <w:hyperlink w:history="1" r:id="rIdynu3ee7c3tl5avw53mwyk">
         <w:r>
           <w:rPr>
             <w:rStyle w:val="Hyperlink"/>
@@ -3069,198 +2958,9 @@
           <w:sz w:val="20"/>
           <w:szCs w:val="20"/>
         </w:rPr>
-        <w:t xml:space="preserve">Exame – nove leis com benefícios sem requisitos (contas 2024): </w:t>
-      </w:r>
-      <w:hyperlink w:history="1" r:id="rIdfkpwrgtntjqwa8d3osxv8">
-        <w:r>
-          <w:rPr>
-            <w:rStyle w:val="Hyperlink"/>
-            <w:sz w:val="18"/>
-            <w:szCs w:val="18"/>
-          </w:rPr>
-          <w:t xml:space="preserve">https://exame.com/economia/tcu-aprova-com-ressalvas-contas-de-2024-do-governo-lula-e-alerta-para-renuncias-fiscais/</w:t>
-        </w:r>
-      </w:hyperlink>
-    </w:p>
-    <w:p>
-      <w:pPr>
-        <w:pStyle w:val="ListParagraph"/>
-        <w:numPr>
-          <w:ilvl w:val="0"/>
-          <w:numId w:val="5"/>
-        </w:numPr>
-        <w:spacing w:after="60"/>
-      </w:pPr>
-      <w:r>
-        <w:rPr>
-          <w:sz w:val="20"/>
-          <w:szCs w:val="20"/>
-        </w:rPr>
-        <w:t xml:space="preserve">Contábeis – 23 desonerações por 19 atos (contas 2024): </w:t>
-      </w:r>
-      <w:hyperlink w:history="1" r:id="rIdt0ttinb7ka6opoh2g0uhy">
-        <w:r>
-          <w:rPr>
-            <w:rStyle w:val="Hyperlink"/>
-            <w:sz w:val="18"/>
-            <w:szCs w:val="18"/>
-          </w:rPr>
-          <w:t xml:space="preserve">https://www.contabeis.com.br/noticias/71308/tcu-aprova-contas-de-2024-com-ressalvas-e-alerta-fiscal/</w:t>
-        </w:r>
-      </w:hyperlink>
-    </w:p>
-    <w:p>
-      <w:pPr>
-        <w:pStyle w:val="ListParagraph"/>
-        <w:numPr>
-          <w:ilvl w:val="0"/>
-          <w:numId w:val="5"/>
-        </w:numPr>
-        <w:spacing w:after="60"/>
-      </w:pPr>
-      <w:r>
-        <w:rPr>
-          <w:sz w:val="20"/>
-          <w:szCs w:val="20"/>
-        </w:rPr>
-        <w:t xml:space="preserve">Planalto – Mensagem de veto nº 1.060/2024 (Lei 14.968/2024): </w:t>
-      </w:r>
-      <w:hyperlink w:history="1" r:id="rIdj61ay8svl6__i1htm-qv1">
-        <w:r>
-          <w:rPr>
-            <w:rStyle w:val="Hyperlink"/>
-            <w:sz w:val="18"/>
-            <w:szCs w:val="18"/>
-          </w:rPr>
-          <w:t xml:space="preserve">https://www.planalto.gov.br/ccivil_03/_ato2023-2026/2024/msg/vep/vep-1060-24.htm</w:t>
-        </w:r>
-      </w:hyperlink>
-    </w:p>
-    <w:p>
-      <w:pPr>
-        <w:pStyle w:val="ListParagraph"/>
-        <w:numPr>
-          <w:ilvl w:val="0"/>
-          <w:numId w:val="5"/>
-        </w:numPr>
-        <w:spacing w:after="60"/>
-      </w:pPr>
-      <w:r>
-        <w:rPr>
-          <w:sz w:val="20"/>
-          <w:szCs w:val="20"/>
-        </w:rPr>
-        <w:t xml:space="preserve">Agência Senado – Lei 14.859/2024 (Perse, teto de R$ 15 bi): </w:t>
-      </w:r>
-      <w:hyperlink w:history="1" r:id="rIdhbpv0evknjfhncmm-9m39">
-        <w:r>
-          <w:rPr>
-            <w:rStyle w:val="Hyperlink"/>
-            <w:sz w:val="18"/>
-            <w:szCs w:val="18"/>
-          </w:rPr>
-          <w:t xml:space="preserve">https://www12.senado.leg.br/noticias/materias/2024/05/23/lula-sanciona-lei-que-mantem-o-perse-com-limite-de-r-15-bi-ate-2026</w:t>
-        </w:r>
-      </w:hyperlink>
-    </w:p>
-    <w:p>
-      <w:pPr>
-        <w:pStyle w:val="ListParagraph"/>
-        <w:numPr>
-          <w:ilvl w:val="0"/>
-          <w:numId w:val="5"/>
-        </w:numPr>
-        <w:spacing w:after="60"/>
-      </w:pPr>
-      <w:r>
-        <w:rPr>
-          <w:sz w:val="20"/>
-          <w:szCs w:val="20"/>
-        </w:rPr>
-        <w:t xml:space="preserve">Agência Câmara – Lei 14.968/2024 (semicondutores): </w:t>
-      </w:r>
-      <w:hyperlink w:history="1" r:id="rIdnisgobyyzp-phfqtpz3mr">
-        <w:r>
-          <w:rPr>
-            <w:rStyle w:val="Hyperlink"/>
-            <w:sz w:val="18"/>
-            <w:szCs w:val="18"/>
-          </w:rPr>
-          <w:t xml:space="preserve">https://www.camara.leg.br/noticias/1096388-sancionada-lei-que-amplia-incentivos-para-industria-de-semicondutores/</w:t>
-        </w:r>
-      </w:hyperlink>
-    </w:p>
-    <w:p>
-      <w:pPr>
-        <w:pStyle w:val="ListParagraph"/>
-        <w:numPr>
-          <w:ilvl w:val="0"/>
-          <w:numId w:val="5"/>
-        </w:numPr>
-        <w:spacing w:after="60"/>
-      </w:pPr>
-      <w:r>
-        <w:rPr>
-          <w:sz w:val="20"/>
-          <w:szCs w:val="20"/>
-        </w:rPr>
-        <w:t xml:space="preserve">Orçamento de 2026 e Pé-de-Meia – DGABC: </w:t>
-      </w:r>
-      <w:hyperlink w:history="1" r:id="rIdlfx-rsub7eyb7pf9qa6ng">
-        <w:r>
-          <w:rPr>
-            <w:rStyle w:val="Hyperlink"/>
-            <w:sz w:val="18"/>
-            <w:szCs w:val="18"/>
-          </w:rPr>
-          <w:t xml:space="preserve">https://www.dgabc.com.br/Noticia/4254407/veja-o-que-se-sabe-ate-agora-sobre-o-orcamento-de-2026-enviado-pelo-governo-lula-ao-congresso</w:t>
-        </w:r>
-      </w:hyperlink>
-    </w:p>
-    <w:p>
-      <w:pPr>
-        <w:pStyle w:val="ListParagraph"/>
-        <w:numPr>
-          <w:ilvl w:val="0"/>
-          <w:numId w:val="5"/>
-        </w:numPr>
-        <w:spacing w:after="60"/>
-      </w:pPr>
-      <w:r>
-        <w:rPr>
-          <w:sz w:val="20"/>
-          <w:szCs w:val="20"/>
-        </w:rPr>
-        <w:t xml:space="preserve">Orçamento de 2026 após o Congresso – Correio Braziliense (25/12/2025): </w:t>
-      </w:r>
-      <w:hyperlink w:history="1" r:id="rIduspyzf0xn8pm4hyaywmvi">
-        <w:r>
-          <w:rPr>
-            <w:rStyle w:val="Hyperlink"/>
-            <w:sz w:val="18"/>
-            <w:szCs w:val="18"/>
-          </w:rPr>
-          <w:t xml:space="preserve">https://edicao.correiobraziliense.com.br/correiobraziliense/2025/12/25/1254c0/pdf/A02-POL-2512-DIG.pdf</w:t>
-        </w:r>
-      </w:hyperlink>
-    </w:p>
-    <w:p>
-      <w:pPr>
-        <w:pStyle w:val="ListParagraph"/>
-        <w:numPr>
-          <w:ilvl w:val="0"/>
-          <w:numId w:val="5"/>
-        </w:numPr>
-        <w:spacing w:after="60"/>
-      </w:pPr>
-      <w:r>
-        <w:rPr>
-          <w:sz w:val="20"/>
-          <w:szCs w:val="20"/>
-        </w:rPr>
         <w:t xml:space="preserve">TCU – Acórdão 1.326/2025 (Contas 2024): </w:t>
       </w:r>
-      <w:hyperlink w:history="1" r:id="rIdq79q7meddckzm-raduin_">
+      <w:hyperlink w:history="1" r:id="rIdunv4p_cia-hpsasltqtjl">
         <w:r>
           <w:rPr>
             <w:rStyle w:val="Hyperlink"/>
@@ -3287,7 +2987,7 @@
         </w:rPr>
         <w:t xml:space="preserve">TCU – Voto do relator, Contas 2023 (TC 010.005/2024-2): </w:t>
       </w:r>
-      <w:hyperlink w:history="1" r:id="rIdrzndcx_ryirpnf-mo0x4x">
+      <w:hyperlink w:history="1" r:id="rIdoafyqdjjlszl4gfeqtn4p">
         <w:r>
           <w:rPr>
             <w:rStyle w:val="Hyperlink"/>
@@ -3314,7 +3014,7 @@
         </w:rPr>
         <w:t xml:space="preserve">TCU – Contas do Presidente 2024: </w:t>
       </w:r>
-      <w:hyperlink w:history="1" r:id="rIdc-txwmxsgrd4rckri2g4u">
+      <w:hyperlink w:history="1" r:id="rIdxlhukqyxhsiakq5egxcof">
         <w:r>
           <w:rPr>
             <w:rStyle w:val="Hyperlink"/>
@@ -3339,16 +3039,16 @@
           <w:sz w:val="20"/>
           <w:szCs w:val="20"/>
         </w:rPr>
-        <w:t xml:space="preserve">Contas 2024, renúncias – Exame: </w:t>
-      </w:r>
-      <w:hyperlink w:history="1" r:id="rIduhy0cisx2xcwiuqstlz3m">
+        <w:t xml:space="preserve">Agência Brasil – Contas de 2024: </w:t>
+      </w:r>
+      <w:hyperlink w:history="1" r:id="rIdkkgzkl2xjrd44p-mavkpm">
         <w:r>
           <w:rPr>
             <w:rStyle w:val="Hyperlink"/>
             <w:sz w:val="18"/>
             <w:szCs w:val="18"/>
           </w:rPr>
-          <w:t xml:space="preserve">https://exame.com/economia/tcu-aprova-com-ressalvas-contas-de-2024-do-governo-lula-e-alerta-para-renuncias-fiscais/</w:t>
+          <w:t xml:space="preserve">https://agenciabrasil.ebc.com.br/politica/noticia/2025-06/tcu-aprova-com-ressalvas-contas-do-governo-lula-de-2024</w:t>
         </w:r>
       </w:hyperlink>
     </w:p>
@@ -3368,7 +3068,7 @@
         </w:rPr>
         <w:t xml:space="preserve">Contas 2024, irregularidade – CNN Brasil: </w:t>
       </w:r>
-      <w:hyperlink w:history="1" r:id="rId3azjifjwnmpq9j3yna5rq">
+      <w:hyperlink w:history="1" r:id="rId6ho8svbneunfib-muoh0j">
         <w:r>
           <w:rPr>
             <w:rStyle w:val="Hyperlink"/>
@@ -3395,7 +3095,7 @@
         </w:rPr>
         <w:t xml:space="preserve">TCU – Contas do Presidente 2023: </w:t>
       </w:r>
-      <w:hyperlink w:history="1" r:id="rId9gbeesujwxgsypa8lloys">
+      <w:hyperlink w:history="1" r:id="rIdrhvgp9xtpiiesuq2nxqae">
         <w:r>
           <w:rPr>
             <w:rStyle w:val="Hyperlink"/>
@@ -3422,7 +3122,7 @@
         </w:rPr>
         <w:t xml:space="preserve">TCU – Acórdão 1.442/2026 (Contas 2025): </w:t>
       </w:r>
-      <w:hyperlink w:history="1" r:id="rIdiihqagqyxrrq9yfgnkg6l">
+      <w:hyperlink w:history="1" r:id="rIdgza6wctyc-nywd9ets58k">
         <w:r>
           <w:rPr>
             <w:rStyle w:val="Hyperlink"/>

</xml_diff>